<commit_message>
Refresh Oddform Unlimited GDD
Updated the Project Necrosis GDD with the Level design, removed sections that will be readded or merged with other sections
</commit_message>
<xml_diff>
--- a/Project Necrosis GDD - Oddform Unlimited.docx
+++ b/Project Necrosis GDD - Oddform Unlimited.docx
@@ -1704,15 +1704,7 @@
     </w:p>
     <w:p>
       <w:r>
-        <w:t xml:space="preserve">Set in the late 70s, the players will be investigating a allegedly Soviet owned </w:t>
-      </w:r>
-      <w:proofErr w:type="spellStart"/>
-      <w:r>
-        <w:t>Biopreparat</w:t>
-      </w:r>
-      <w:proofErr w:type="spellEnd"/>
-      <w:r>
-        <w:t xml:space="preserve"> (Biological warfare) facility in South East Asia allegedly testing the titular Project </w:t>
+        <w:t xml:space="preserve">Set in the late 70s, the players will be investigating a allegedly Soviet owned Biopreparat (Biological warfare) facility in South East Asia allegedly testing the titular Project </w:t>
       </w:r>
       <w:r>
         <w:t>Necrosis, a</w:t>
@@ -1943,15 +1935,7 @@
     <w:p/>
     <w:p>
       <w:r>
-        <w:t xml:space="preserve">The player can fire their gun with the right click of the mouse, either being able to hold down for continuous fire with a full auto weapon or needing to click again for a semi auto and can reload the firearm at any point when it misses 1 bullet in </w:t>
-      </w:r>
-      <w:proofErr w:type="spellStart"/>
-      <w:r>
-        <w:t>it’s</w:t>
-      </w:r>
-      <w:proofErr w:type="spellEnd"/>
-      <w:r>
-        <w:t xml:space="preserve"> starting mag by pressing </w:t>
+        <w:t xml:space="preserve">The player can fire their gun with the right click of the mouse, either being able to hold down for continuous fire with a full auto weapon or needing to click again for a semi auto and can reload the firearm at any point when it misses 1 bullet in it’s starting mag by pressing </w:t>
       </w:r>
       <w:r>
         <w:t>R or</w:t>
@@ -1994,13 +1978,8 @@
     </w:p>
     <w:p/>
     <w:p>
-      <w:proofErr w:type="spellStart"/>
-      <w:r>
-        <w:t>Tough’N’Up</w:t>
-      </w:r>
-      <w:proofErr w:type="spellEnd"/>
-      <w:r>
-        <w:t xml:space="preserve"> </w:t>
+      <w:r>
+        <w:t xml:space="preserve">Tough’N’Up </w:t>
       </w:r>
       <w:r>
         <w:t xml:space="preserve">Soda </w:t>
@@ -2011,13 +1990,8 @@
     </w:p>
     <w:p/>
     <w:p>
-      <w:proofErr w:type="spellStart"/>
-      <w:r>
-        <w:t>Quick’N’Up</w:t>
-      </w:r>
-      <w:proofErr w:type="spellEnd"/>
-      <w:r>
-        <w:t xml:space="preserve"> </w:t>
+      <w:r>
+        <w:t xml:space="preserve">Quick’N’Up </w:t>
       </w:r>
       <w:r>
         <w:t xml:space="preserve">Brandy </w:t>
@@ -2028,13 +2002,8 @@
     </w:p>
     <w:p/>
     <w:p>
-      <w:proofErr w:type="spellStart"/>
-      <w:r>
-        <w:t>Spray’N’Pray</w:t>
-      </w:r>
-      <w:proofErr w:type="spellEnd"/>
-      <w:r>
-        <w:t xml:space="preserve"> </w:t>
+      <w:r>
+        <w:t xml:space="preserve">Spray’N’Pray </w:t>
       </w:r>
       <w:r>
         <w:t xml:space="preserve">Root beer </w:t>
@@ -2098,14 +2067,7 @@
     <w:p>
       <w:r>
         <w:br/>
-      </w:r>
-      <w:proofErr w:type="spellStart"/>
-      <w:r>
-        <w:t>Biopreparat</w:t>
-      </w:r>
-      <w:proofErr w:type="spellEnd"/>
-      <w:r>
-        <w:t xml:space="preserve"> Grupp soldier: Special enemy that only appears every 5 rounds, they are humans with gas masks who enter the facility in an attempt to stop the player cast, they are the only enemies who use ranged combat which makes them a greater threat at range then the zombies are, but they are much squishier than the zombies and die quicker to compensate.</w:t>
+        <w:t>Biopreparat Grupp soldier: Special enemy that only appears every 5 rounds, they are humans with gas masks who enter the facility in an attempt to stop the player cast, they are the only enemies who use ranged combat which makes them a greater threat at range then the zombies are, but they are much squishier than the zombies and die quicker to compensate.</w:t>
       </w:r>
     </w:p>
     <w:p/>
@@ -2215,7 +2177,11 @@
       </w:pPr>
       <w:bookmarkStart w:id="14" w:name="_Toc241485013"/>
       <w:r>
-        <w:t>Level</w:t>
+        <w:lastRenderedPageBreak/>
+        <w:t>Le</w:t>
+      </w:r>
+      <w:r>
+        <w:t>vel design – LYALL McClue</w:t>
       </w:r>
       <w:r>
         <w:t>:</w:t>
@@ -2224,57 +2190,17 @@
     </w:p>
     <w:p>
       <w:r>
-        <w:t>There is a singular main level in the game, being</w:t>
-      </w:r>
-      <w:r>
-        <w:t xml:space="preserve"> Operation Necrosis</w:t>
-      </w:r>
-      <w:r>
-        <w:t xml:space="preserve"> which will</w:t>
-      </w:r>
-      <w:r>
-        <w:t xml:space="preserve"> feature the full map with all of </w:t>
-      </w:r>
-      <w:r>
-        <w:t>its</w:t>
-      </w:r>
-      <w:r>
-        <w:t xml:space="preserve"> narrative mechanics included within, with 2 main areas of note to be explored in the map being the village at spawn and the facility, with a jungle connecting the two player spaces to one another to reflect the Southeast Asian setting of the game </w:t>
-      </w:r>
-    </w:p>
-    <w:p/>
-    <w:p>
-      <w:pPr>
-        <w:pStyle w:val="Heading2"/>
-      </w:pPr>
-      <w:bookmarkStart w:id="15" w:name="_Toc241485014"/>
-      <w:r>
-        <w:lastRenderedPageBreak/>
-        <w:t>Level</w:t>
-      </w:r>
-      <w:r>
-        <w:t xml:space="preserve"> </w:t>
-      </w:r>
-      <w:r>
-        <w:t>Layout</w:t>
-      </w:r>
-      <w:r>
-        <w:t>:</w:t>
-      </w:r>
-      <w:bookmarkEnd w:id="15"/>
-    </w:p>
-    <w:p>
-      <w:pPr>
         <w:rPr>
           <w:noProof/>
         </w:rPr>
-      </w:pPr>
+        <w:t xml:space="preserve"> </w:t>
+      </w:r>
       <w:r>
         <w:rPr>
           <w:noProof/>
         </w:rPr>
         <w:drawing>
-          <wp:inline distT="0" distB="0" distL="0" distR="0" wp14:anchorId="6052065B" wp14:editId="48C72645">
+          <wp:inline distT="0" distB="0" distL="0" distR="0" wp14:anchorId="74EAF1CB" wp14:editId="744AE025">
             <wp:extent cx="2266428" cy="3429000"/>
             <wp:effectExtent l="0" t="0" r="635" b="0"/>
             <wp:docPr id="231126313" name="Picture 1"/>
@@ -2328,184 +2254,74 @@
         </w:drawing>
       </w:r>
     </w:p>
-    <w:p/>
-    <w:p/>
+    <w:p>
+      <w:r>
+        <w:t xml:space="preserve">This concept design for the level shows four playable areas that consists of The Lab, Village, Facility, and The Forest. Each area will offer a different experience via the environment some will be close and compact and other areas will be open and free for the player to use to the advantage </w:t>
+      </w:r>
+      <w:r>
+        <w:t>to suit</w:t>
+      </w:r>
+      <w:r>
+        <w:t xml:space="preserve"> their playstyle. Each area will offer their own unique perk granting their own buff to the player upon purchase, but they only become purchasable after the power has been activated. </w:t>
+      </w:r>
+    </w:p>
+    <w:p/>
+    <w:p>
+      <w:r>
+        <w:t>The Lab;</w:t>
+      </w:r>
+    </w:p>
+    <w:p>
+      <w:r>
+        <w:t xml:space="preserve">The Lab is the starting place for the outbreak so it will function as starting point for the game it will hold [perk &amp; description of the perk]. The appearance of the lab will appear broken and in ruin to make the player feel emersed upon loading in the level </w:t>
+      </w:r>
+    </w:p>
+    <w:p/>
+    <w:p>
+      <w:r>
+        <w:t>Village;</w:t>
+      </w:r>
+    </w:p>
+    <w:p>
+      <w:r>
+        <w:t xml:space="preserve">The village is the second area that the player will have to explore to fix the power as it will hold one of two fuses as it will be required to turn back on. The village will have the perk [perk &amp; description]. The appearance of the village will appear untouched by the outbreak at first glance upon entry but as the player moves through the environment which will get increasingly more destroyed and in ruin </w:t>
+      </w:r>
+    </w:p>
+    <w:p/>
+    <w:p>
+      <w:r>
+        <w:lastRenderedPageBreak/>
+        <w:t>Facility;</w:t>
+      </w:r>
+    </w:p>
+    <w:p>
+      <w:r>
+        <w:t xml:space="preserve">The Facility is the third area of the game and is mostly untouched and deserted as most of the staff and soldiers retreated to the village to either face and fight the undead until they succumb to their demise or to retreat to safety. The facility holds the power in the level which the player has to obtain all fuses from there dedicated areas and once both fuses are obtained the player will have to go up to the second floor of the facility where the power switch can be repaired restoring power to the level. This area has the perk [perk &amp; description]. The facility will also hold [name for the weapon machine] which will upgrade the players weapon giving it increased damage and ammo size, [name for the weapon machine] can be located in the same room as power on the second floor. </w:t>
+      </w:r>
+    </w:p>
+    <w:p/>
+    <w:p>
+      <w:r>
+        <w:t>Forest;</w:t>
+      </w:r>
+    </w:p>
+    <w:p>
+      <w:r>
+        <w:t>The forest is the fourth and final area of the game that is designed to be the opposite/contrast of the death and destruction that you'll see throughout the level by being full of life and creation. This area is going to have the perk [perk &amp;description]. It will also hold one of the locations of the fuses which is required for power and progression</w:t>
+      </w:r>
+    </w:p>
     <w:p>
       <w:pPr>
         <w:pStyle w:val="Heading2"/>
       </w:pPr>
-      <w:bookmarkStart w:id="16" w:name="_Toc241485015"/>
-      <w:r>
-        <w:t>Game</w:t>
-      </w:r>
-      <w:r>
-        <w:t xml:space="preserve"> Mode:</w:t>
-      </w:r>
-      <w:bookmarkEnd w:id="16"/>
-    </w:p>
-    <w:p>
-      <w:r>
-        <w:t>Quest mode is exactly what it says on the tin, a narrative focused experience where a set story will be explored following a cast of 4 characters who must survive against all odds on their own against the dead featuring the full map to explore.</w:t>
-      </w:r>
-    </w:p>
-    <w:p/>
-    <w:p>
-      <w:pPr>
-        <w:pStyle w:val="Heading2"/>
-      </w:pPr>
-      <w:bookmarkStart w:id="17" w:name="_Toc241485016"/>
-      <w:r>
-        <w:t>Visual Aesthetics</w:t>
+      <w:bookmarkStart w:id="15" w:name="_Toc241485017"/>
+      <w:r>
+        <w:t>HUD</w:t>
       </w:r>
       <w:r>
         <w:t>:</w:t>
       </w:r>
-      <w:bookmarkEnd w:id="17"/>
-    </w:p>
-    <w:p>
-      <w:r>
-        <w:t>The game has an overall realistic approach to its appearance reflecting it taking place in our world in a historical setting, with both the environment and the characters within being made to feel like they could have believably existed in this time and place.</w:t>
-      </w:r>
-    </w:p>
-    <w:p/>
-    <w:p>
-      <w:r>
-        <w:t>Due to being set in the rural jungles of Southeast Asia, the game will reflect the setting in the village and the jungle that connects it to the main base with local architecture and vegetation.</w:t>
-      </w:r>
-    </w:p>
-    <w:p>
-      <w:r>
-        <w:rPr>
-          <w:noProof/>
-        </w:rPr>
-        <w:lastRenderedPageBreak/>
-        <w:drawing>
-          <wp:inline distT="0" distB="0" distL="0" distR="0" wp14:anchorId="2F558B39" wp14:editId="5D78CFBD">
-            <wp:extent cx="5731510" cy="2407285"/>
-            <wp:effectExtent l="0" t="0" r="2540" b="0"/>
-            <wp:docPr id="1558112978" name="Picture 2" descr="Call of Duty: Black Ops Cold War: 10 Things You Missed in the Firebase ..."/>
-            <wp:cNvGraphicFramePr>
-              <a:graphicFrameLocks xmlns:a="http://schemas.openxmlformats.org/drawingml/2006/main" noChangeAspect="1"/>
-            </wp:cNvGraphicFramePr>
-            <a:graphic xmlns:a="http://schemas.openxmlformats.org/drawingml/2006/main">
-              <a:graphicData uri="http://schemas.openxmlformats.org/drawingml/2006/picture">
-                <pic:pic xmlns:pic="http://schemas.openxmlformats.org/drawingml/2006/picture">
-                  <pic:nvPicPr>
-                    <pic:cNvPr id="0" name="Picture 3" descr="Call of Duty: Black Ops Cold War: 10 Things You Missed in the Firebase ..."/>
-                    <pic:cNvPicPr>
-                      <a:picLocks noChangeAspect="1" noChangeArrowheads="1"/>
-                    </pic:cNvPicPr>
-                  </pic:nvPicPr>
-                  <pic:blipFill>
-                    <a:blip r:embed="rId10">
-                      <a:extLst>
-                        <a:ext uri="{28A0092B-C50C-407E-A947-70E740481C1C}">
-                          <a14:useLocalDpi xmlns:a14="http://schemas.microsoft.com/office/drawing/2010/main" val="0"/>
-                        </a:ext>
-                      </a:extLst>
-                    </a:blip>
-                    <a:srcRect/>
-                    <a:stretch>
-                      <a:fillRect/>
-                    </a:stretch>
-                  </pic:blipFill>
-                  <pic:spPr bwMode="auto">
-                    <a:xfrm>
-                      <a:off x="0" y="0"/>
-                      <a:ext cx="5731510" cy="2407285"/>
-                    </a:xfrm>
-                    <a:prstGeom prst="rect">
-                      <a:avLst/>
-                    </a:prstGeom>
-                    <a:noFill/>
-                    <a:ln>
-                      <a:noFill/>
-                    </a:ln>
-                  </pic:spPr>
-                </pic:pic>
-              </a:graphicData>
-            </a:graphic>
-          </wp:inline>
-        </w:drawing>
-      </w:r>
-    </w:p>
-    <w:p/>
-    <w:p/>
-    <w:p>
-      <w:r>
-        <w:t>Meanwhile the facility will be much more cold and general purpose to reflect its artificial and recent nature having only been created 2-3 years before by Grupp Stelle, with various bloodied medical tools and furniture littering the facility alongside bureaucratic papers and research labs, making for a vastly different vibe to the previous two areas which is punctuated by the Russian words littering the walls of the facility, the Gruppe Stelle logo as well as propaganda.</w:t>
-      </w:r>
-      <w:r>
-        <w:t xml:space="preserve"> </w:t>
-      </w:r>
-      <w:r>
-        <w:rPr>
-          <w:noProof/>
-        </w:rPr>
-        <w:drawing>
-          <wp:inline distT="0" distB="0" distL="0" distR="0" wp14:anchorId="0DFFC2CD" wp14:editId="6D80ADA2">
-            <wp:extent cx="5731510" cy="3221355"/>
-            <wp:effectExtent l="0" t="0" r="2540" b="0"/>
-            <wp:docPr id="1882400237" name="Picture 3" descr="Call Of Duty World At War Zombies Verruckt"/>
-            <wp:cNvGraphicFramePr>
-              <a:graphicFrameLocks xmlns:a="http://schemas.openxmlformats.org/drawingml/2006/main" noChangeAspect="1"/>
-            </wp:cNvGraphicFramePr>
-            <a:graphic xmlns:a="http://schemas.openxmlformats.org/drawingml/2006/main">
-              <a:graphicData uri="http://schemas.openxmlformats.org/drawingml/2006/picture">
-                <pic:pic xmlns:pic="http://schemas.openxmlformats.org/drawingml/2006/picture">
-                  <pic:nvPicPr>
-                    <pic:cNvPr id="0" name="Picture 5" descr="Call Of Duty World At War Zombies Verruckt"/>
-                    <pic:cNvPicPr>
-                      <a:picLocks noChangeAspect="1" noChangeArrowheads="1"/>
-                    </pic:cNvPicPr>
-                  </pic:nvPicPr>
-                  <pic:blipFill>
-                    <a:blip r:embed="rId11">
-                      <a:extLst>
-                        <a:ext uri="{28A0092B-C50C-407E-A947-70E740481C1C}">
-                          <a14:useLocalDpi xmlns:a14="http://schemas.microsoft.com/office/drawing/2010/main" val="0"/>
-                        </a:ext>
-                      </a:extLst>
-                    </a:blip>
-                    <a:srcRect/>
-                    <a:stretch>
-                      <a:fillRect/>
-                    </a:stretch>
-                  </pic:blipFill>
-                  <pic:spPr bwMode="auto">
-                    <a:xfrm>
-                      <a:off x="0" y="0"/>
-                      <a:ext cx="5731510" cy="3221355"/>
-                    </a:xfrm>
-                    <a:prstGeom prst="rect">
-                      <a:avLst/>
-                    </a:prstGeom>
-                    <a:noFill/>
-                    <a:ln>
-                      <a:noFill/>
-                    </a:ln>
-                  </pic:spPr>
-                </pic:pic>
-              </a:graphicData>
-            </a:graphic>
-          </wp:inline>
-        </w:drawing>
-      </w:r>
-    </w:p>
-    <w:p/>
-    <w:p>
-      <w:pPr>
-        <w:pStyle w:val="Heading2"/>
-      </w:pPr>
-      <w:bookmarkStart w:id="18" w:name="_Toc241485017"/>
-      <w:r>
-        <w:lastRenderedPageBreak/>
-        <w:t>HUD</w:t>
-      </w:r>
-      <w:r>
-        <w:t>:</w:t>
-      </w:r>
-      <w:bookmarkEnd w:id="18"/>
+      <w:bookmarkEnd w:id="15"/>
     </w:p>
     <w:p>
       <w:r>
@@ -2541,7 +2357,7 @@
                     </pic:cNvPicPr>
                   </pic:nvPicPr>
                   <pic:blipFill>
-                    <a:blip r:embed="rId12">
+                    <a:blip r:embed="rId10">
                       <a:extLst>
                         <a:ext uri="{28A0092B-C50C-407E-A947-70E740481C1C}">
                           <a14:useLocalDpi xmlns:a14="http://schemas.microsoft.com/office/drawing/2010/main" val="0"/>
@@ -2574,12 +2390,12 @@
       </w:r>
     </w:p>
     <w:sectPr>
-      <w:headerReference w:type="even" r:id="rId13"/>
-      <w:headerReference w:type="default" r:id="rId14"/>
-      <w:footerReference w:type="even" r:id="rId15"/>
-      <w:footerReference w:type="default" r:id="rId16"/>
-      <w:headerReference w:type="first" r:id="rId17"/>
-      <w:footerReference w:type="first" r:id="rId18"/>
+      <w:headerReference w:type="even" r:id="rId11"/>
+      <w:headerReference w:type="default" r:id="rId12"/>
+      <w:footerReference w:type="even" r:id="rId13"/>
+      <w:footerReference w:type="default" r:id="rId14"/>
+      <w:headerReference w:type="first" r:id="rId15"/>
+      <w:footerReference w:type="first" r:id="rId16"/>
       <w:pgSz w:w="11906" w:h="16838"/>
       <w:pgMar w:top="1440" w:right="1440" w:bottom="1440" w:left="1440" w:header="708" w:footer="708" w:gutter="0"/>
       <w:pgBorders w:offsetFrom="page">

</xml_diff>

<commit_message>
Update Oddform Unlimited GDD
</commit_message>
<xml_diff>
--- a/Project Necrosis GDD - Oddform Unlimited.docx
+++ b/Project Necrosis GDD - Oddform Unlimited.docx
@@ -1704,7 +1704,15 @@
     </w:p>
     <w:p>
       <w:r>
-        <w:t xml:space="preserve">Set in the late 70s, the players will be investigating a allegedly Soviet owned Biopreparat (Biological warfare) facility in South East Asia allegedly testing the titular Project </w:t>
+        <w:t xml:space="preserve">Set in the late 70s, the players will be investigating a allegedly Soviet owned </w:t>
+      </w:r>
+      <w:proofErr w:type="spellStart"/>
+      <w:r>
+        <w:t>Biopreparat</w:t>
+      </w:r>
+      <w:proofErr w:type="spellEnd"/>
+      <w:r>
+        <w:t xml:space="preserve"> (Biological warfare) facility in South East Asia allegedly testing the titular Project </w:t>
       </w:r>
       <w:r>
         <w:t>Necrosis, a</w:t>
@@ -1782,6 +1790,7 @@
         <w:rPr>
           <w:noProof/>
         </w:rPr>
+        <w:lastRenderedPageBreak/>
         <w:drawing>
           <wp:anchor distT="0" distB="0" distL="114300" distR="114300" simplePos="0" relativeHeight="251659264" behindDoc="0" locked="0" layoutInCell="1" allowOverlap="1" wp14:anchorId="06B7AE38" wp14:editId="78C112BA">
             <wp:simplePos x="0" y="0"/>
@@ -1853,7 +1862,6 @@
     <w:p/>
     <w:p>
       <w:r>
-        <w:lastRenderedPageBreak/>
         <w:t xml:space="preserve">Arthur </w:t>
       </w:r>
       <w:r>
@@ -1935,7 +1943,16 @@
     <w:p/>
     <w:p>
       <w:r>
-        <w:t xml:space="preserve">The player can fire their gun with the right click of the mouse, either being able to hold down for continuous fire with a full auto weapon or needing to click again for a semi auto and can reload the firearm at any point when it misses 1 bullet in it’s starting mag by pressing </w:t>
+        <w:lastRenderedPageBreak/>
+        <w:t xml:space="preserve">The player can fire their gun with the right click of the mouse, either being able to hold down for continuous fire with a full auto weapon or needing to click again for a semi auto and can reload the firearm at any point when it misses 1 bullet in </w:t>
+      </w:r>
+      <w:proofErr w:type="spellStart"/>
+      <w:r>
+        <w:t>it’s</w:t>
+      </w:r>
+      <w:proofErr w:type="spellEnd"/>
+      <w:r>
+        <w:t xml:space="preserve"> starting mag by pressing </w:t>
       </w:r>
       <w:r>
         <w:t>R or</w:t>
@@ -1969,17 +1986,18 @@
         <w:t>Death’s Door Tonic</w:t>
       </w:r>
       <w:r>
-        <w:t xml:space="preserve"> – For 500 points in solo, or 1500 in MP, the player is granted increased healing speeds, quicker revives for multiplayer and a self-revive in solo, </w:t>
-      </w:r>
-      <w:r>
-        <w:lastRenderedPageBreak/>
-        <w:t>which is capped at 3, as once this cap is hit the machine will become unusable to the player.</w:t>
-      </w:r>
-    </w:p>
-    <w:p/>
-    <w:p>
-      <w:r>
-        <w:t xml:space="preserve">Tough’N’Up </w:t>
+        <w:t xml:space="preserve"> – For 500 points in solo, or 1500 in MP, the player is granted increased healing speeds, quicker revives for multiplayer and a self-revive in solo, which is capped at 3, as once this cap is hit the machine will become unusable to the player.</w:t>
+      </w:r>
+    </w:p>
+    <w:p/>
+    <w:p>
+      <w:proofErr w:type="spellStart"/>
+      <w:r>
+        <w:t>Tough’N’Up</w:t>
+      </w:r>
+      <w:proofErr w:type="spellEnd"/>
+      <w:r>
+        <w:t xml:space="preserve"> </w:t>
       </w:r>
       <w:r>
         <w:t xml:space="preserve">Soda </w:t>
@@ -1990,8 +2008,13 @@
     </w:p>
     <w:p/>
     <w:p>
-      <w:r>
-        <w:t xml:space="preserve">Quick’N’Up </w:t>
+      <w:proofErr w:type="spellStart"/>
+      <w:r>
+        <w:t>Quick’N’Up</w:t>
+      </w:r>
+      <w:proofErr w:type="spellEnd"/>
+      <w:r>
+        <w:t xml:space="preserve"> </w:t>
       </w:r>
       <w:r>
         <w:t xml:space="preserve">Brandy </w:t>
@@ -2002,8 +2025,13 @@
     </w:p>
     <w:p/>
     <w:p>
-      <w:r>
-        <w:t xml:space="preserve">Spray’N’Pray </w:t>
+      <w:proofErr w:type="spellStart"/>
+      <w:r>
+        <w:t>Spray’N’Pray</w:t>
+      </w:r>
+      <w:proofErr w:type="spellEnd"/>
+      <w:r>
+        <w:t xml:space="preserve"> </w:t>
       </w:r>
       <w:r>
         <w:t xml:space="preserve">Root beer </w:t>
@@ -2067,7 +2095,14 @@
     <w:p>
       <w:r>
         <w:br/>
-        <w:t>Biopreparat Grupp soldier: Special enemy that only appears every 5 rounds, they are humans with gas masks who enter the facility in an attempt to stop the player cast, they are the only enemies who use ranged combat which makes them a greater threat at range then the zombies are, but they are much squishier than the zombies and die quicker to compensate.</w:t>
+      </w:r>
+      <w:proofErr w:type="spellStart"/>
+      <w:r>
+        <w:t>Biopreparat</w:t>
+      </w:r>
+      <w:proofErr w:type="spellEnd"/>
+      <w:r>
+        <w:t xml:space="preserve"> Grupp soldier: Special enemy that only appears every 5 rounds, they are humans with gas masks who enter the facility in an attempt to stop the player cast, they are the only enemies who use ranged combat which makes them a greater threat at range then the zombies are, but they are much squishier than the zombies and die quicker to compensate.</w:t>
       </w:r>
     </w:p>
     <w:p/>
@@ -2077,80 +2112,83 @@
       </w:pPr>
       <w:bookmarkStart w:id="13" w:name="_Toc241485012"/>
       <w:r>
+        <w:t>Firearms</w:t>
+      </w:r>
+      <w:r>
+        <w:t>:</w:t>
+      </w:r>
+      <w:bookmarkEnd w:id="13"/>
+    </w:p>
+    <w:p>
+      <w:r>
+        <w:t>Two distinct sets of weapons focusing on Western and Eastern weapons include in the firearms pool, with one side being mainly Western and the other Eastern, with the players all spawning with a M1911 at game spawn but quickly getting options to upgrade their gun from wall guns or from the interdimensional crate (box) and able to use upgrade kits in the upgrade facility to upgrade their firearms (pack a punch)</w:t>
+      </w:r>
+    </w:p>
+    <w:p/>
+    <w:p>
+      <w:r>
+        <w:t>Example firearms include:</w:t>
+      </w:r>
+    </w:p>
+    <w:p>
+      <w:r>
+        <w:t>Pistols – M1911 and Makarov</w:t>
+      </w:r>
+    </w:p>
+    <w:p>
+      <w:r>
+        <w:t>Revolver – Python and Nagant M1895</w:t>
+      </w:r>
+    </w:p>
+    <w:p>
+      <w:r>
+        <w:t>AR – M16A1 and AKM</w:t>
+      </w:r>
+    </w:p>
+    <w:p>
+      <w:r>
+        <w:t>SMG – MP5 and PPSH-41</w:t>
+      </w:r>
+    </w:p>
+    <w:p>
+      <w:r>
+        <w:t>Shotgun – M37 and KS-23</w:t>
+      </w:r>
+    </w:p>
+    <w:p>
+      <w:r>
+        <w:t>Semi auto rifle – M14 and SKS</w:t>
+      </w:r>
+    </w:p>
+    <w:p>
+      <w:r>
+        <w:t>Sniper – M40 and Mosin-Nagant</w:t>
+      </w:r>
+    </w:p>
+    <w:p>
+      <w:r>
+        <w:t>Semi auto sniper – PSG1 and Dragunov</w:t>
+      </w:r>
+    </w:p>
+    <w:p>
+      <w:r>
+        <w:t>Launcher – M72 LAW and RPG-7</w:t>
+      </w:r>
+    </w:p>
+    <w:p/>
+    <w:p>
+      <w:r>
+        <w:t xml:space="preserve">Each weapon will also get a unique name when it’s put into the upgrade machine and depending on the firearm will gain a new unique property for shooting, as </w:t>
+      </w:r>
+      <w:r>
+        <w:t>an</w:t>
+      </w:r>
+      <w:r>
+        <w:t xml:space="preserve"> example when the M1911 is upgraded it becomes Duty and Honour, changing to a </w:t>
+      </w:r>
+      <w:r>
         <w:lastRenderedPageBreak/>
-        <w:t>Firearms</w:t>
-      </w:r>
-      <w:r>
-        <w:t>:</w:t>
-      </w:r>
-      <w:bookmarkEnd w:id="13"/>
-    </w:p>
-    <w:p>
-      <w:r>
-        <w:t>Two distinct sets of weapons focusing on Western and Eastern weapons include in the firearms pool, with one side being mainly Western and the other Eastern, with the players all spawning with a M1911 at game spawn but quickly getting options to upgrade their gun from wall guns or from the interdimensional crate (box) and able to use upgrade kits in the upgrade facility to upgrade their firearms (pack a punch)</w:t>
-      </w:r>
-    </w:p>
-    <w:p/>
-    <w:p>
-      <w:r>
-        <w:t>Example firearms include:</w:t>
-      </w:r>
-    </w:p>
-    <w:p>
-      <w:r>
-        <w:t>Pistols – M1911 and Makarov</w:t>
-      </w:r>
-    </w:p>
-    <w:p>
-      <w:r>
-        <w:t>Revolver – Python and Nagant M1895</w:t>
-      </w:r>
-    </w:p>
-    <w:p>
-      <w:r>
-        <w:t>AR – M16A1 and AKM</w:t>
-      </w:r>
-    </w:p>
-    <w:p>
-      <w:r>
-        <w:t>SMG – MP5 and PPSH-41</w:t>
-      </w:r>
-    </w:p>
-    <w:p>
-      <w:r>
-        <w:t>Shotgun – M37 and KS-23</w:t>
-      </w:r>
-    </w:p>
-    <w:p>
-      <w:r>
-        <w:t>Semi auto rifle – M14 and SKS</w:t>
-      </w:r>
-    </w:p>
-    <w:p>
-      <w:r>
-        <w:t>Sniper – M40 and Mosin-Nagant</w:t>
-      </w:r>
-    </w:p>
-    <w:p>
-      <w:r>
-        <w:t>Semi auto sniper – PSG1 and Dragunov</w:t>
-      </w:r>
-    </w:p>
-    <w:p>
-      <w:r>
-        <w:t>Launcher – M72 LAW and RPG-7</w:t>
-      </w:r>
-    </w:p>
-    <w:p/>
-    <w:p>
-      <w:r>
-        <w:t xml:space="preserve">Each weapon will also get a unique name when it’s put into the upgrade machine and depending on the firearm will gain a new unique property for shooting, as </w:t>
-      </w:r>
-      <w:r>
-        <w:t>an</w:t>
-      </w:r>
-      <w:r>
-        <w:t xml:space="preserve"> example when the M1911 is upgraded it becomes Duty and Honour, changing to a akimbo firearm that shoots grenades instead of the normal bullets it started with, meanwhile the PPSH-41 will become the Stalingrad Sweeper and have its fire rate upped even further </w:t>
+        <w:t xml:space="preserve">akimbo firearm that shoots grenades instead of the normal bullets it started with, meanwhile the PPSH-41 will become the Stalingrad Sweeper and have its fire rate upped even further </w:t>
       </w:r>
       <w:r>
         <w:t>than</w:t>
@@ -2177,11 +2215,16 @@
       </w:pPr>
       <w:bookmarkStart w:id="14" w:name="_Toc241485013"/>
       <w:r>
-        <w:lastRenderedPageBreak/>
         <w:t>Le</w:t>
       </w:r>
       <w:r>
-        <w:t>vel design – LYALL McClue</w:t>
+        <w:t>vel design – L</w:t>
+      </w:r>
+      <w:r>
+        <w:t>yall</w:t>
+      </w:r>
+      <w:r>
+        <w:t xml:space="preserve"> McClue</w:t>
       </w:r>
       <w:r>
         <w:t>:</w:t>
@@ -2284,13 +2327,16 @@
     </w:p>
     <w:p>
       <w:r>
-        <w:t xml:space="preserve">The village is the second area that the player will have to explore to fix the power as it will hold one of two fuses as it will be required to turn back on. The village will have the perk [perk &amp; description]. The appearance of the village will appear untouched by the outbreak at first glance upon entry but as the player moves through the environment which will get increasingly more destroyed and in ruin </w:t>
-      </w:r>
-    </w:p>
-    <w:p/>
-    <w:p>
+        <w:t xml:space="preserve">The village is the second area that the player will have to explore to fix the power as it will hold one of two fuses as it will be required to turn back on. The village will have the perk [perk &amp; description]. The appearance of the village will appear </w:t>
+      </w:r>
       <w:r>
         <w:lastRenderedPageBreak/>
+        <w:t xml:space="preserve">untouched by the outbreak at first glance upon entry but as the player moves through the environment which will get increasingly more destroyed and in ruin </w:t>
+      </w:r>
+    </w:p>
+    <w:p/>
+    <w:p>
+      <w:r>
         <w:t>Facility;</w:t>
       </w:r>
     </w:p>
@@ -2339,6 +2385,7 @@
         <w:rPr>
           <w:noProof/>
         </w:rPr>
+        <w:lastRenderedPageBreak/>
         <w:drawing>
           <wp:inline distT="0" distB="0" distL="0" distR="0" wp14:anchorId="61413C31" wp14:editId="2CFCDEB3">
             <wp:extent cx="5731510" cy="3223895"/>
@@ -2957,7 +3004,7 @@
     <w:uiPriority w:val="9"/>
     <w:unhideWhenUsed/>
     <w:qFormat/>
-    <w:rsid w:val="00C96839"/>
+    <w:rsid w:val="009B2DA6"/>
     <w:pPr>
       <w:keepNext/>
       <w:keepLines/>
@@ -2965,7 +3012,7 @@
       <w:outlineLvl w:val="1"/>
     </w:pPr>
     <w:rPr>
-      <w:rFonts w:ascii="Felix Titling" w:eastAsiaTheme="majorEastAsia" w:hAnsi="Felix Titling" w:cstheme="majorBidi"/>
+      <w:rFonts w:ascii="Impact" w:eastAsiaTheme="majorEastAsia" w:hAnsi="Impact" w:cstheme="majorBidi"/>
       <w:color w:val="04F24E"/>
       <w:sz w:val="32"/>
       <w:szCs w:val="32"/>
@@ -3171,9 +3218,9 @@
     <w:basedOn w:val="DefaultParagraphFont"/>
     <w:link w:val="Heading2"/>
     <w:uiPriority w:val="9"/>
-    <w:rsid w:val="00C96839"/>
+    <w:rsid w:val="009B2DA6"/>
     <w:rPr>
-      <w:rFonts w:ascii="Felix Titling" w:eastAsiaTheme="majorEastAsia" w:hAnsi="Felix Titling" w:cstheme="majorBidi"/>
+      <w:rFonts w:ascii="Impact" w:eastAsiaTheme="majorEastAsia" w:hAnsi="Impact" w:cstheme="majorBidi"/>
       <w:color w:val="04F24E"/>
       <w:sz w:val="32"/>
       <w:szCs w:val="32"/>

</xml_diff>

<commit_message>
Updated Level design section
added a updated the level design to digital.
</commit_message>
<xml_diff>
--- a/Project Necrosis GDD - Oddform Unlimited.docx
+++ b/Project Necrosis GDD - Oddform Unlimited.docx
@@ -2221,6 +2221,11 @@
       <w:bookmarkEnd w:id="14"/>
     </w:p>
     <w:p>
+      <w:pPr>
+        <w:rPr>
+          <w:noProof/>
+        </w:rPr>
+      </w:pPr>
       <w:r>
         <w:rPr>
           <w:noProof/>
@@ -2231,11 +2236,17 @@
         <w:rPr>
           <w:noProof/>
         </w:rPr>
+        <w:t xml:space="preserve"> </w:t>
+      </w:r>
+      <w:r>
+        <w:rPr>
+          <w:noProof/>
+        </w:rPr>
         <w:drawing>
-          <wp:inline distT="0" distB="0" distL="0" distR="0" wp14:anchorId="74EAF1CB" wp14:editId="744AE025">
-            <wp:extent cx="2266428" cy="3429000"/>
-            <wp:effectExtent l="0" t="0" r="635" b="0"/>
-            <wp:docPr id="231126313" name="Picture 1"/>
+          <wp:inline distT="0" distB="0" distL="0" distR="0" wp14:anchorId="19581FD9" wp14:editId="64CA87D2">
+            <wp:extent cx="3038475" cy="2371725"/>
+            <wp:effectExtent l="152400" t="114300" r="123825" b="161925"/>
+            <wp:docPr id="102740059" name="Picture 1"/>
             <wp:cNvGraphicFramePr>
               <a:graphicFrameLocks xmlns:a="http://schemas.openxmlformats.org/drawingml/2006/main" noChangeAspect="1"/>
             </wp:cNvGraphicFramePr>
@@ -2243,20 +2254,30 @@
               <a:graphicData uri="http://schemas.openxmlformats.org/drawingml/2006/picture">
                 <pic:pic xmlns:pic="http://schemas.openxmlformats.org/drawingml/2006/picture">
                   <pic:nvPicPr>
-                    <pic:cNvPr id="0" name="Picture 1"/>
-                    <pic:cNvPicPr>
-                      <a:picLocks noChangeAspect="1" noChangeArrowheads="1"/>
-                    </pic:cNvPicPr>
+                    <pic:cNvPr id="102740059" name="Picture 102740059"/>
+                    <pic:cNvPicPr/>
                   </pic:nvPicPr>
                   <pic:blipFill rotWithShape="1">
                     <a:blip r:embed="rId9">
                       <a:extLst>
+                        <a:ext uri="{BEBA8EAE-BF5A-486C-A8C5-ECC9F3942E4B}">
+                          <a14:imgProps xmlns:a14="http://schemas.microsoft.com/office/drawing/2010/main">
+                            <a14:imgLayer r:embed="rId10">
+                              <a14:imgEffect>
+                                <a14:sharpenSoften amount="15000"/>
+                              </a14:imgEffect>
+                              <a14:imgEffect>
+                                <a14:brightnessContrast bright="-10000" contrast="17000"/>
+                              </a14:imgEffect>
+                            </a14:imgLayer>
+                          </a14:imgProps>
+                        </a:ext>
                         <a:ext uri="{28A0092B-C50C-407E-A947-70E740481C1C}">
                           <a14:useLocalDpi xmlns:a14="http://schemas.microsoft.com/office/drawing/2010/main" val="0"/>
                         </a:ext>
                       </a:extLst>
                     </a:blip>
-                    <a:srcRect l="3415" t="1876" r="2439" b="6875"/>
+                    <a:srcRect l="12658" t="14331" r="29656" b="17049"/>
                     <a:stretch>
                       <a:fillRect/>
                     </a:stretch>
@@ -2264,15 +2285,59 @@
                   <pic:spPr bwMode="auto">
                     <a:xfrm>
                       <a:off x="0" y="0"/>
-                      <a:ext cx="2270373" cy="3434969"/>
+                      <a:ext cx="3045112" cy="2376905"/>
                     </a:xfrm>
                     <a:prstGeom prst="rect">
                       <a:avLst/>
                     </a:prstGeom>
-                    <a:noFill/>
-                    <a:ln>
-                      <a:noFill/>
+                    <a:solidFill>
+                      <a:srgbClr val="FFFFFF">
+                        <a:shade val="85000"/>
+                      </a:srgbClr>
+                    </a:solidFill>
+                    <a:ln w="88900" cap="sq" cmpd="sng" algn="ctr">
+                      <a:solidFill>
+                        <a:srgbClr val="FFFFFF"/>
+                      </a:solidFill>
+                      <a:prstDash val="solid"/>
+                      <a:miter lim="800000"/>
+                      <a:headEnd type="none" w="med" len="med"/>
+                      <a:tailEnd type="none" w="med" len="med"/>
+                      <a:extLst>
+                        <a:ext uri="{C807C97D-BFC1-408E-A445-0C87EB9F89A2}">
+                          <ask:lineSketchStyleProps xmlns:ask="http://schemas.microsoft.com/office/drawing/2018/sketchyshapes" sd="0">
+                            <a:custGeom>
+                              <a:avLst/>
+                              <a:gdLst/>
+                              <a:ahLst/>
+                              <a:cxnLst/>
+                              <a:rect l="0" t="0" r="0" b="0"/>
+                              <a:pathLst/>
+                            </a:custGeom>
+                            <ask:type/>
+                          </ask:lineSketchStyleProps>
+                        </a:ext>
+                      </a:extLst>
                     </a:ln>
+                    <a:effectLst>
+                      <a:outerShdw blurRad="55000" dist="18000" dir="5400000" algn="tl" rotWithShape="0">
+                        <a:srgbClr val="000000">
+                          <a:alpha val="40000"/>
+                        </a:srgbClr>
+                      </a:outerShdw>
+                    </a:effectLst>
+                    <a:scene3d>
+                      <a:camera prst="orthographicFront"/>
+                      <a:lightRig rig="twoPt" dir="t">
+                        <a:rot lat="0" lon="0" rev="7200000"/>
+                      </a:lightRig>
+                    </a:scene3d>
+                    <a:sp3d>
+                      <a:bevelT w="25400" h="19050"/>
+                      <a:contourClr>
+                        <a:srgbClr val="FFFFFF"/>
+                      </a:contourClr>
+                    </a:sp3d>
                     <a:extLst>
                       <a:ext uri="{53640926-AAD7-44D8-BBD7-CCE9431645EC}">
                         <a14:shadowObscured xmlns:a14="http://schemas.microsoft.com/office/drawing/2010/main"/>
@@ -2287,6 +2352,155 @@
       </w:r>
     </w:p>
     <w:p>
+      <w:pPr>
+        <w:rPr>
+          <w:noProof/>
+          <w:color w:val="A02B93" w:themeColor="accent5"/>
+        </w:rPr>
+      </w:pPr>
+      <w:r>
+        <w:rPr>
+          <w:noProof/>
+          <w:color w:val="A02B93" w:themeColor="accent5"/>
+        </w:rPr>
+        <w:t>P</w:t>
+      </w:r>
+      <w:r>
+        <w:rPr>
+          <w:noProof/>
+          <w:color w:val="A02B93" w:themeColor="accent5"/>
+        </w:rPr>
+        <w:t xml:space="preserve"> – Perk</w:t>
+      </w:r>
+    </w:p>
+    <w:p>
+      <w:pPr>
+        <w:rPr>
+          <w:noProof/>
+          <w:color w:val="FFC000"/>
+        </w:rPr>
+      </w:pPr>
+      <w:r>
+        <w:rPr>
+          <w:noProof/>
+          <w:color w:val="FFC000"/>
+        </w:rPr>
+        <w:t>F – Fuse Location</w:t>
+      </w:r>
+    </w:p>
+    <w:p>
+      <w:pPr>
+        <w:rPr>
+          <w:noProof/>
+          <w:color w:val="FFC000"/>
+        </w:rPr>
+      </w:pPr>
+      <w:r>
+        <w:rPr>
+          <w:noProof/>
+          <w:color w:val="FFC000"/>
+        </w:rPr>
+        <w:t>P – Power Switch</w:t>
+      </w:r>
+    </w:p>
+    <w:p>
+      <w:pPr>
+        <w:rPr>
+          <w:noProof/>
+          <w:color w:val="EE0000"/>
+        </w:rPr>
+      </w:pPr>
+      <w:r>
+        <w:rPr>
+          <w:noProof/>
+          <w:color w:val="EE0000"/>
+        </w:rPr>
+        <w:t>1/2 – Floor Number</w:t>
+      </w:r>
+    </w:p>
+    <w:p>
+      <w:pPr>
+        <w:rPr>
+          <w:noProof/>
+          <w:color w:val="EE0000"/>
+        </w:rPr>
+      </w:pPr>
+      <w:r>
+        <w:rPr>
+          <w:noProof/>
+          <w:color w:val="EE0000"/>
+        </w:rPr>
+        <w:t>Red Lines - Stairs</w:t>
+      </w:r>
+    </w:p>
+    <w:p>
+      <w:pPr>
+        <w:rPr>
+          <w:noProof/>
+          <w:color w:val="C00000"/>
+        </w:rPr>
+      </w:pPr>
+      <w:r>
+        <w:rPr>
+          <w:noProof/>
+          <w:color w:val="C00000"/>
+        </w:rPr>
+        <w:t>Red Cross – Dead End</w:t>
+      </w:r>
+      <w:r>
+        <w:rPr>
+          <w:noProof/>
+          <w:color w:val="C00000"/>
+        </w:rPr>
+        <w:t>/Fall Point</w:t>
+      </w:r>
+    </w:p>
+    <w:p>
+      <w:pPr>
+        <w:rPr>
+          <w:noProof/>
+          <w:color w:val="BF4E14" w:themeColor="accent2" w:themeShade="BF"/>
+        </w:rPr>
+      </w:pPr>
+      <w:r>
+        <w:rPr>
+          <w:noProof/>
+          <w:color w:val="BF4E14" w:themeColor="accent2" w:themeShade="BF"/>
+        </w:rPr>
+        <w:t xml:space="preserve">U </w:t>
+      </w:r>
+      <w:r>
+        <w:rPr>
+          <w:noProof/>
+          <w:color w:val="BF4E14" w:themeColor="accent2" w:themeShade="BF"/>
+        </w:rPr>
+        <w:t>–</w:t>
+      </w:r>
+      <w:r>
+        <w:rPr>
+          <w:noProof/>
+          <w:color w:val="BF4E14" w:themeColor="accent2" w:themeShade="BF"/>
+        </w:rPr>
+        <w:t xml:space="preserve"> Upgrade</w:t>
+      </w:r>
+    </w:p>
+    <w:p>
+      <w:pPr>
+        <w:rPr>
+          <w:noProof/>
+          <w:color w:val="45B0E1" w:themeColor="accent1" w:themeTint="99"/>
+        </w:rPr>
+      </w:pPr>
+      <w:r>
+        <w:rPr>
+          <w:noProof/>
+          <w:color w:val="45B0E1" w:themeColor="accent1" w:themeTint="99"/>
+        </w:rPr>
+        <w:t>Arrows – Direction the Player can go</w:t>
+      </w:r>
+    </w:p>
+    <w:p/>
+    <w:p>
       <w:r>
         <w:t xml:space="preserve">This concept design for the level shows four playable areas that consists of The Lab, Village, Facility, and The Forest. Each area will offer a different experience via the environment some will be close and compact and other areas will be open and free for the player to use to the advantage to suit their playstyle. Each area will offer their own unique perk granting their own buff to the player upon purchase, but they only become purchasable after the power has been activated. </w:t>
       </w:r>
@@ -2305,6 +2519,7 @@
     <w:p/>
     <w:p>
       <w:r>
+        <w:lastRenderedPageBreak/>
         <w:t>Village;</w:t>
       </w:r>
     </w:p>
@@ -2316,7 +2531,6 @@
     <w:p/>
     <w:p>
       <w:r>
-        <w:lastRenderedPageBreak/>
         <w:t>Facility;</w:t>
       </w:r>
     </w:p>
@@ -2365,6 +2579,7 @@
         <w:rPr>
           <w:noProof/>
         </w:rPr>
+        <w:lastRenderedPageBreak/>
         <w:drawing>
           <wp:inline distT="0" distB="0" distL="0" distR="0" wp14:anchorId="61413C31" wp14:editId="2CFCDEB3">
             <wp:extent cx="5731510" cy="3223895"/>
@@ -2383,7 +2598,7 @@
                     </pic:cNvPicPr>
                   </pic:nvPicPr>
                   <pic:blipFill>
-                    <a:blip r:embed="rId10">
+                    <a:blip r:embed="rId11">
                       <a:extLst>
                         <a:ext uri="{28A0092B-C50C-407E-A947-70E740481C1C}">
                           <a14:useLocalDpi xmlns:a14="http://schemas.microsoft.com/office/drawing/2010/main" val="0"/>
@@ -2416,12 +2631,12 @@
       </w:r>
     </w:p>
     <w:sectPr>
-      <w:headerReference w:type="even" r:id="rId11"/>
-      <w:headerReference w:type="default" r:id="rId12"/>
-      <w:footerReference w:type="even" r:id="rId13"/>
-      <w:footerReference w:type="default" r:id="rId14"/>
-      <w:headerReference w:type="first" r:id="rId15"/>
-      <w:footerReference w:type="first" r:id="rId16"/>
+      <w:headerReference w:type="even" r:id="rId12"/>
+      <w:headerReference w:type="default" r:id="rId13"/>
+      <w:footerReference w:type="even" r:id="rId14"/>
+      <w:footerReference w:type="default" r:id="rId15"/>
+      <w:headerReference w:type="first" r:id="rId16"/>
+      <w:footerReference w:type="first" r:id="rId17"/>
       <w:pgSz w:w="11906" w:h="16838"/>
       <w:pgMar w:top="1440" w:right="1440" w:bottom="1440" w:left="1440" w:header="708" w:footer="708" w:gutter="0"/>
       <w:pgBorders w:offsetFrom="page">

</xml_diff>

<commit_message>
Update Project Necrosis GDD
Refresh the Project Necrosis GDD for Oddform Unlimited with the latest documentation revisions. The HUD section and the Perks section have been redone completely, with cleanup happening a bit everywhere else.
</commit_message>
<xml_diff>
--- a/Project Necrosis GDD - Oddform Unlimited.docx
+++ b/Project Necrosis GDD - Oddform Unlimited.docx
@@ -86,7 +86,7 @@
           <w:sz w:val="40"/>
           <w:szCs w:val="40"/>
         </w:rPr>
-        <w:t>BSc (Hons) Computer Games Development</w:t>
+        <w:t>BSC (HONS) COMPUTER GAMES DEVELOPMENT</w:t>
       </w:r>
       <w:r>
         <w:rPr>
@@ -96,7 +96,7 @@
           <w:szCs w:val="40"/>
         </w:rPr>
         <w:br/>
-        <w:t>Game Design Document</w:t>
+        <w:t>GAME DESIGN DOCUMENT</w:t>
       </w:r>
     </w:p>
     <w:p>
@@ -153,7 +153,6 @@
       <w:sdtPr>
         <w:rPr>
           <w:rFonts w:ascii="Bahnschrift" w:eastAsiaTheme="minorHAnsi" w:hAnsi="Bahnschrift" w:cstheme="minorBidi"/>
-          <w:b w:val="0"/>
           <w:color w:val="auto"/>
           <w:kern w:val="2"/>
           <w:sz w:val="24"/>
@@ -178,7 +177,7 @@
             <w:pStyle w:val="TOCHeading"/>
           </w:pPr>
           <w:r>
-            <w:t>Contents</w:t>
+            <w:t>CONTENTS</w:t>
           </w:r>
         </w:p>
         <w:p>
@@ -188,12 +187,11 @@
               <w:tab w:val="right" w:leader="dot" w:pos="9016"/>
             </w:tabs>
             <w:rPr>
+              <w:rFonts w:asciiTheme="minorHAnsi" w:eastAsiaTheme="minorEastAsia" w:hAnsiTheme="minorHAnsi"/>
               <w:noProof/>
+              <w:lang w:eastAsia="en-GB"/>
             </w:rPr>
           </w:pPr>
-          <w:r>
-            <w:br/>
-          </w:r>
           <w:r>
             <w:fldChar w:fldCharType="begin"/>
           </w:r>
@@ -203,13 +201,13 @@
           <w:r>
             <w:fldChar w:fldCharType="separate"/>
           </w:r>
-          <w:hyperlink w:anchor="_Toc241484999" w:history="1">
+          <w:hyperlink w:anchor="_Toc242725337" w:history="1">
             <w:r>
               <w:rPr>
                 <w:rStyle w:val="Hyperlink"/>
                 <w:noProof/>
               </w:rPr>
-              <w:t>Project Plan:</w:t>
+              <w:t>PROJECT PLAN</w:t>
             </w:r>
             <w:r>
               <w:rPr>
@@ -230,7 +228,7 @@
                 <w:noProof/>
                 <w:webHidden/>
               </w:rPr>
-              <w:instrText xml:space="preserve"> PAGEREF _Toc241484999 \h </w:instrText>
+              <w:instrText xml:space="preserve"> PAGEREF _Toc242725337 \h </w:instrText>
             </w:r>
             <w:r>
               <w:rPr>
@@ -268,16 +266,18 @@
               <w:tab w:val="right" w:leader="dot" w:pos="9016"/>
             </w:tabs>
             <w:rPr>
+              <w:rFonts w:asciiTheme="minorHAnsi" w:eastAsiaTheme="minorEastAsia" w:hAnsiTheme="minorHAnsi"/>
               <w:noProof/>
+              <w:lang w:eastAsia="en-GB"/>
             </w:rPr>
           </w:pPr>
-          <w:hyperlink w:anchor="_Toc241485000" w:history="1">
+          <w:hyperlink w:anchor="_Toc242725338" w:history="1">
             <w:r>
               <w:rPr>
                 <w:rStyle w:val="Hyperlink"/>
                 <w:noProof/>
               </w:rPr>
-              <w:t>Team List + Roles:</w:t>
+              <w:t>Team List + Roles</w:t>
             </w:r>
             <w:r>
               <w:rPr>
@@ -298,7 +298,7 @@
                 <w:noProof/>
                 <w:webHidden/>
               </w:rPr>
-              <w:instrText xml:space="preserve"> PAGEREF _Toc241485000 \h </w:instrText>
+              <w:instrText xml:space="preserve"> PAGEREF _Toc242725338 \h </w:instrText>
             </w:r>
             <w:r>
               <w:rPr>
@@ -336,16 +336,18 @@
               <w:tab w:val="right" w:leader="dot" w:pos="9016"/>
             </w:tabs>
             <w:rPr>
+              <w:rFonts w:asciiTheme="minorHAnsi" w:eastAsiaTheme="minorEastAsia" w:hAnsiTheme="minorHAnsi"/>
               <w:noProof/>
+              <w:lang w:eastAsia="en-GB"/>
             </w:rPr>
           </w:pPr>
-          <w:hyperlink w:anchor="_Toc241485001" w:history="1">
+          <w:hyperlink w:anchor="_Toc242725339" w:history="1">
             <w:r>
               <w:rPr>
                 <w:rStyle w:val="Hyperlink"/>
                 <w:noProof/>
               </w:rPr>
-              <w:t>Project Details:</w:t>
+              <w:t>Project Details</w:t>
             </w:r>
             <w:r>
               <w:rPr>
@@ -366,7 +368,7 @@
                 <w:noProof/>
                 <w:webHidden/>
               </w:rPr>
-              <w:instrText xml:space="preserve"> PAGEREF _Toc241485001 \h </w:instrText>
+              <w:instrText xml:space="preserve"> PAGEREF _Toc242725339 \h </w:instrText>
             </w:r>
             <w:r>
               <w:rPr>
@@ -404,16 +406,18 @@
               <w:tab w:val="right" w:leader="dot" w:pos="9016"/>
             </w:tabs>
             <w:rPr>
+              <w:rFonts w:asciiTheme="minorHAnsi" w:eastAsiaTheme="minorEastAsia" w:hAnsiTheme="minorHAnsi"/>
               <w:noProof/>
+              <w:lang w:eastAsia="en-GB"/>
             </w:rPr>
           </w:pPr>
-          <w:hyperlink w:anchor="_Toc241485002" w:history="1">
+          <w:hyperlink w:anchor="_Toc242725340" w:history="1">
             <w:r>
               <w:rPr>
                 <w:rStyle w:val="Hyperlink"/>
                 <w:noProof/>
               </w:rPr>
-              <w:t>Game Genre Research:</w:t>
+              <w:t>Development Details</w:t>
             </w:r>
             <w:r>
               <w:rPr>
@@ -434,7 +438,7 @@
                 <w:noProof/>
                 <w:webHidden/>
               </w:rPr>
-              <w:instrText xml:space="preserve"> PAGEREF _Toc241485002 \h </w:instrText>
+              <w:instrText xml:space="preserve"> PAGEREF _Toc242725340 \h </w:instrText>
             </w:r>
             <w:r>
               <w:rPr>
@@ -455,6 +459,76 @@
                 <w:webHidden/>
               </w:rPr>
               <w:t>3</w:t>
+            </w:r>
+            <w:r>
+              <w:rPr>
+                <w:noProof/>
+                <w:webHidden/>
+              </w:rPr>
+              <w:fldChar w:fldCharType="end"/>
+            </w:r>
+          </w:hyperlink>
+        </w:p>
+        <w:p>
+          <w:pPr>
+            <w:pStyle w:val="TOC1"/>
+            <w:tabs>
+              <w:tab w:val="right" w:leader="dot" w:pos="9016"/>
+            </w:tabs>
+            <w:rPr>
+              <w:rFonts w:asciiTheme="minorHAnsi" w:eastAsiaTheme="minorEastAsia" w:hAnsiTheme="minorHAnsi"/>
+              <w:noProof/>
+              <w:lang w:eastAsia="en-GB"/>
+            </w:rPr>
+          </w:pPr>
+          <w:hyperlink w:anchor="_Toc242725341" w:history="1">
+            <w:r>
+              <w:rPr>
+                <w:rStyle w:val="Hyperlink"/>
+                <w:noProof/>
+              </w:rPr>
+              <w:t>GAME OVERVIEW</w:t>
+            </w:r>
+            <w:r>
+              <w:rPr>
+                <w:noProof/>
+                <w:webHidden/>
+              </w:rPr>
+              <w:tab/>
+            </w:r>
+            <w:r>
+              <w:rPr>
+                <w:noProof/>
+                <w:webHidden/>
+              </w:rPr>
+              <w:fldChar w:fldCharType="begin"/>
+            </w:r>
+            <w:r>
+              <w:rPr>
+                <w:noProof/>
+                <w:webHidden/>
+              </w:rPr>
+              <w:instrText xml:space="preserve"> PAGEREF _Toc242725341 \h </w:instrText>
+            </w:r>
+            <w:r>
+              <w:rPr>
+                <w:noProof/>
+                <w:webHidden/>
+              </w:rPr>
+            </w:r>
+            <w:r>
+              <w:rPr>
+                <w:noProof/>
+                <w:webHidden/>
+              </w:rPr>
+              <w:fldChar w:fldCharType="separate"/>
+            </w:r>
+            <w:r>
+              <w:rPr>
+                <w:noProof/>
+                <w:webHidden/>
+              </w:rPr>
+              <w:t>4</w:t>
             </w:r>
             <w:r>
               <w:rPr>
@@ -472,16 +546,18 @@
               <w:tab w:val="right" w:leader="dot" w:pos="9016"/>
             </w:tabs>
             <w:rPr>
+              <w:rFonts w:asciiTheme="minorHAnsi" w:eastAsiaTheme="minorEastAsia" w:hAnsiTheme="minorHAnsi"/>
               <w:noProof/>
+              <w:lang w:eastAsia="en-GB"/>
             </w:rPr>
           </w:pPr>
-          <w:hyperlink w:anchor="_Toc241485003" w:history="1">
+          <w:hyperlink w:anchor="_Toc242725342" w:history="1">
             <w:r>
               <w:rPr>
                 <w:rStyle w:val="Hyperlink"/>
                 <w:noProof/>
               </w:rPr>
-              <w:t>Development Details:</w:t>
+              <w:t>Narrative</w:t>
             </w:r>
             <w:r>
               <w:rPr>
@@ -502,7 +578,7 @@
                 <w:noProof/>
                 <w:webHidden/>
               </w:rPr>
-              <w:instrText xml:space="preserve"> PAGEREF _Toc241485003 \h </w:instrText>
+              <w:instrText xml:space="preserve"> PAGEREF _Toc242725342 \h </w:instrText>
             </w:r>
             <w:r>
               <w:rPr>
@@ -522,7 +598,147 @@
                 <w:noProof/>
                 <w:webHidden/>
               </w:rPr>
-              <w:t>3</w:t>
+              <w:t>4</w:t>
+            </w:r>
+            <w:r>
+              <w:rPr>
+                <w:noProof/>
+                <w:webHidden/>
+              </w:rPr>
+              <w:fldChar w:fldCharType="end"/>
+            </w:r>
+          </w:hyperlink>
+        </w:p>
+        <w:p>
+          <w:pPr>
+            <w:pStyle w:val="TOC2"/>
+            <w:tabs>
+              <w:tab w:val="right" w:leader="dot" w:pos="9016"/>
+            </w:tabs>
+            <w:rPr>
+              <w:rFonts w:asciiTheme="minorHAnsi" w:eastAsiaTheme="minorEastAsia" w:hAnsiTheme="minorHAnsi"/>
+              <w:noProof/>
+              <w:lang w:eastAsia="en-GB"/>
+            </w:rPr>
+          </w:pPr>
+          <w:hyperlink w:anchor="_Toc242725343" w:history="1">
+            <w:r>
+              <w:rPr>
+                <w:rStyle w:val="Hyperlink"/>
+                <w:noProof/>
+              </w:rPr>
+              <w:t>Objective</w:t>
+            </w:r>
+            <w:r>
+              <w:rPr>
+                <w:noProof/>
+                <w:webHidden/>
+              </w:rPr>
+              <w:tab/>
+            </w:r>
+            <w:r>
+              <w:rPr>
+                <w:noProof/>
+                <w:webHidden/>
+              </w:rPr>
+              <w:fldChar w:fldCharType="begin"/>
+            </w:r>
+            <w:r>
+              <w:rPr>
+                <w:noProof/>
+                <w:webHidden/>
+              </w:rPr>
+              <w:instrText xml:space="preserve"> PAGEREF _Toc242725343 \h </w:instrText>
+            </w:r>
+            <w:r>
+              <w:rPr>
+                <w:noProof/>
+                <w:webHidden/>
+              </w:rPr>
+            </w:r>
+            <w:r>
+              <w:rPr>
+                <w:noProof/>
+                <w:webHidden/>
+              </w:rPr>
+              <w:fldChar w:fldCharType="separate"/>
+            </w:r>
+            <w:r>
+              <w:rPr>
+                <w:noProof/>
+                <w:webHidden/>
+              </w:rPr>
+              <w:t>4</w:t>
+            </w:r>
+            <w:r>
+              <w:rPr>
+                <w:noProof/>
+                <w:webHidden/>
+              </w:rPr>
+              <w:fldChar w:fldCharType="end"/>
+            </w:r>
+          </w:hyperlink>
+        </w:p>
+        <w:p>
+          <w:pPr>
+            <w:pStyle w:val="TOC2"/>
+            <w:tabs>
+              <w:tab w:val="right" w:leader="dot" w:pos="9016"/>
+            </w:tabs>
+            <w:rPr>
+              <w:rFonts w:asciiTheme="minorHAnsi" w:eastAsiaTheme="minorEastAsia" w:hAnsiTheme="minorHAnsi"/>
+              <w:noProof/>
+              <w:lang w:eastAsia="en-GB"/>
+            </w:rPr>
+          </w:pPr>
+          <w:hyperlink w:anchor="_Toc242725344" w:history="1">
+            <w:r>
+              <w:rPr>
+                <w:rStyle w:val="Hyperlink"/>
+                <w:noProof/>
+              </w:rPr>
+              <w:t>Playable Characters</w:t>
+            </w:r>
+            <w:r>
+              <w:rPr>
+                <w:noProof/>
+                <w:webHidden/>
+              </w:rPr>
+              <w:tab/>
+            </w:r>
+            <w:r>
+              <w:rPr>
+                <w:noProof/>
+                <w:webHidden/>
+              </w:rPr>
+              <w:fldChar w:fldCharType="begin"/>
+            </w:r>
+            <w:r>
+              <w:rPr>
+                <w:noProof/>
+                <w:webHidden/>
+              </w:rPr>
+              <w:instrText xml:space="preserve"> PAGEREF _Toc242725344 \h </w:instrText>
+            </w:r>
+            <w:r>
+              <w:rPr>
+                <w:noProof/>
+                <w:webHidden/>
+              </w:rPr>
+            </w:r>
+            <w:r>
+              <w:rPr>
+                <w:noProof/>
+                <w:webHidden/>
+              </w:rPr>
+              <w:fldChar w:fldCharType="separate"/>
+            </w:r>
+            <w:r>
+              <w:rPr>
+                <w:noProof/>
+                <w:webHidden/>
+              </w:rPr>
+              <w:t>4</w:t>
             </w:r>
             <w:r>
               <w:rPr>
@@ -540,16 +756,18 @@
               <w:tab w:val="right" w:leader="dot" w:pos="9016"/>
             </w:tabs>
             <w:rPr>
+              <w:rFonts w:asciiTheme="minorHAnsi" w:eastAsiaTheme="minorEastAsia" w:hAnsiTheme="minorHAnsi"/>
               <w:noProof/>
+              <w:lang w:eastAsia="en-GB"/>
             </w:rPr>
           </w:pPr>
-          <w:hyperlink w:anchor="_Toc241485004" w:history="1">
+          <w:hyperlink w:anchor="_Toc242725345" w:history="1">
             <w:r>
               <w:rPr>
                 <w:rStyle w:val="Hyperlink"/>
                 <w:noProof/>
               </w:rPr>
-              <w:t>Game Overview:</w:t>
+              <w:t>GAME MECHANICS</w:t>
             </w:r>
             <w:r>
               <w:rPr>
@@ -570,7 +788,7 @@
                 <w:noProof/>
                 <w:webHidden/>
               </w:rPr>
-              <w:instrText xml:space="preserve"> PAGEREF _Toc241485004 \h </w:instrText>
+              <w:instrText xml:space="preserve"> PAGEREF _Toc242725345 \h </w:instrText>
             </w:r>
             <w:r>
               <w:rPr>
@@ -590,7 +808,7 @@
                 <w:noProof/>
                 <w:webHidden/>
               </w:rPr>
-              <w:t>4</w:t>
+              <w:t>5</w:t>
             </w:r>
             <w:r>
               <w:rPr>
@@ -608,16 +826,18 @@
               <w:tab w:val="right" w:leader="dot" w:pos="9016"/>
             </w:tabs>
             <w:rPr>
+              <w:rFonts w:asciiTheme="minorHAnsi" w:eastAsiaTheme="minorEastAsia" w:hAnsiTheme="minorHAnsi"/>
               <w:noProof/>
+              <w:lang w:eastAsia="en-GB"/>
             </w:rPr>
           </w:pPr>
-          <w:hyperlink w:anchor="_Toc241485005" w:history="1">
+          <w:hyperlink w:anchor="_Toc242725346" w:history="1">
             <w:r>
               <w:rPr>
                 <w:rStyle w:val="Hyperlink"/>
                 <w:noProof/>
               </w:rPr>
-              <w:t>Narrative:</w:t>
+              <w:t>Controls</w:t>
             </w:r>
             <w:r>
               <w:rPr>
@@ -638,7 +858,7 @@
                 <w:noProof/>
                 <w:webHidden/>
               </w:rPr>
-              <w:instrText xml:space="preserve"> PAGEREF _Toc241485005 \h </w:instrText>
+              <w:instrText xml:space="preserve"> PAGEREF _Toc242725346 \h </w:instrText>
             </w:r>
             <w:r>
               <w:rPr>
@@ -658,7 +878,7 @@
                 <w:noProof/>
                 <w:webHidden/>
               </w:rPr>
-              <w:t>4</w:t>
+              <w:t>5</w:t>
             </w:r>
             <w:r>
               <w:rPr>
@@ -676,16 +896,18 @@
               <w:tab w:val="right" w:leader="dot" w:pos="9016"/>
             </w:tabs>
             <w:rPr>
+              <w:rFonts w:asciiTheme="minorHAnsi" w:eastAsiaTheme="minorEastAsia" w:hAnsiTheme="minorHAnsi"/>
               <w:noProof/>
+              <w:lang w:eastAsia="en-GB"/>
             </w:rPr>
           </w:pPr>
-          <w:hyperlink w:anchor="_Toc241485006" w:history="1">
+          <w:hyperlink w:anchor="_Toc242725347" w:history="1">
             <w:r>
               <w:rPr>
                 <w:rStyle w:val="Hyperlink"/>
                 <w:noProof/>
               </w:rPr>
-              <w:t>Objective(s):</w:t>
+              <w:t>Perks</w:t>
             </w:r>
             <w:r>
               <w:rPr>
@@ -706,7 +928,7 @@
                 <w:noProof/>
                 <w:webHidden/>
               </w:rPr>
-              <w:instrText xml:space="preserve"> PAGEREF _Toc241485006 \h </w:instrText>
+              <w:instrText xml:space="preserve"> PAGEREF _Toc242725347 \h </w:instrText>
             </w:r>
             <w:r>
               <w:rPr>
@@ -726,7 +948,7 @@
                 <w:noProof/>
                 <w:webHidden/>
               </w:rPr>
-              <w:t>4</w:t>
+              <w:t>6</w:t>
             </w:r>
             <w:r>
               <w:rPr>
@@ -744,16 +966,18 @@
               <w:tab w:val="right" w:leader="dot" w:pos="9016"/>
             </w:tabs>
             <w:rPr>
+              <w:rFonts w:asciiTheme="minorHAnsi" w:eastAsiaTheme="minorEastAsia" w:hAnsiTheme="minorHAnsi"/>
               <w:noProof/>
+              <w:lang w:eastAsia="en-GB"/>
             </w:rPr>
           </w:pPr>
-          <w:hyperlink w:anchor="_Toc241485007" w:history="1">
+          <w:hyperlink w:anchor="_Toc242725348" w:history="1">
             <w:r>
               <w:rPr>
                 <w:rStyle w:val="Hyperlink"/>
                 <w:noProof/>
               </w:rPr>
-              <w:t>Playable Characters:</w:t>
+              <w:t>Enemies</w:t>
             </w:r>
             <w:r>
               <w:rPr>
@@ -774,7 +998,7 @@
                 <w:noProof/>
                 <w:webHidden/>
               </w:rPr>
-              <w:instrText xml:space="preserve"> PAGEREF _Toc241485007 \h </w:instrText>
+              <w:instrText xml:space="preserve"> PAGEREF _Toc242725348 \h </w:instrText>
             </w:r>
             <w:r>
               <w:rPr>
@@ -794,7 +1018,77 @@
                 <w:noProof/>
                 <w:webHidden/>
               </w:rPr>
-              <w:t>4</w:t>
+              <w:t>6</w:t>
+            </w:r>
+            <w:r>
+              <w:rPr>
+                <w:noProof/>
+                <w:webHidden/>
+              </w:rPr>
+              <w:fldChar w:fldCharType="end"/>
+            </w:r>
+          </w:hyperlink>
+        </w:p>
+        <w:p>
+          <w:pPr>
+            <w:pStyle w:val="TOC2"/>
+            <w:tabs>
+              <w:tab w:val="right" w:leader="dot" w:pos="9016"/>
+            </w:tabs>
+            <w:rPr>
+              <w:rFonts w:asciiTheme="minorHAnsi" w:eastAsiaTheme="minorEastAsia" w:hAnsiTheme="minorHAnsi"/>
+              <w:noProof/>
+              <w:lang w:eastAsia="en-GB"/>
+            </w:rPr>
+          </w:pPr>
+          <w:hyperlink w:anchor="_Toc242725349" w:history="1">
+            <w:r>
+              <w:rPr>
+                <w:rStyle w:val="Hyperlink"/>
+                <w:noProof/>
+              </w:rPr>
+              <w:t>Firearms</w:t>
+            </w:r>
+            <w:r>
+              <w:rPr>
+                <w:noProof/>
+                <w:webHidden/>
+              </w:rPr>
+              <w:tab/>
+            </w:r>
+            <w:r>
+              <w:rPr>
+                <w:noProof/>
+                <w:webHidden/>
+              </w:rPr>
+              <w:fldChar w:fldCharType="begin"/>
+            </w:r>
+            <w:r>
+              <w:rPr>
+                <w:noProof/>
+                <w:webHidden/>
+              </w:rPr>
+              <w:instrText xml:space="preserve"> PAGEREF _Toc242725349 \h </w:instrText>
+            </w:r>
+            <w:r>
+              <w:rPr>
+                <w:noProof/>
+                <w:webHidden/>
+              </w:rPr>
+            </w:r>
+            <w:r>
+              <w:rPr>
+                <w:noProof/>
+                <w:webHidden/>
+              </w:rPr>
+              <w:fldChar w:fldCharType="separate"/>
+            </w:r>
+            <w:r>
+              <w:rPr>
+                <w:noProof/>
+                <w:webHidden/>
+              </w:rPr>
+              <w:t>7</w:t>
             </w:r>
             <w:r>
               <w:rPr>
@@ -812,16 +1106,18 @@
               <w:tab w:val="right" w:leader="dot" w:pos="9016"/>
             </w:tabs>
             <w:rPr>
+              <w:rFonts w:asciiTheme="minorHAnsi" w:eastAsiaTheme="minorEastAsia" w:hAnsiTheme="minorHAnsi"/>
               <w:noProof/>
+              <w:lang w:eastAsia="en-GB"/>
             </w:rPr>
           </w:pPr>
-          <w:hyperlink w:anchor="_Toc241485008" w:history="1">
+          <w:hyperlink w:anchor="_Toc242725350" w:history="1">
             <w:r>
               <w:rPr>
                 <w:rStyle w:val="Hyperlink"/>
                 <w:noProof/>
               </w:rPr>
-              <w:t>Game Mechanics:</w:t>
+              <w:t>LEVEL DESIGN</w:t>
             </w:r>
             <w:r>
               <w:rPr>
@@ -842,7 +1138,7 @@
                 <w:noProof/>
                 <w:webHidden/>
               </w:rPr>
-              <w:instrText xml:space="preserve"> PAGEREF _Toc241485008 \h </w:instrText>
+              <w:instrText xml:space="preserve"> PAGEREF _Toc242725350 \h </w:instrText>
             </w:r>
             <w:r>
               <w:rPr>
@@ -862,7 +1158,7 @@
                 <w:noProof/>
                 <w:webHidden/>
               </w:rPr>
-              <w:t>5</w:t>
+              <w:t>8</w:t>
             </w:r>
             <w:r>
               <w:rPr>
@@ -880,16 +1176,18 @@
               <w:tab w:val="right" w:leader="dot" w:pos="9016"/>
             </w:tabs>
             <w:rPr>
+              <w:rFonts w:asciiTheme="minorHAnsi" w:eastAsiaTheme="minorEastAsia" w:hAnsiTheme="minorHAnsi"/>
               <w:noProof/>
+              <w:lang w:eastAsia="en-GB"/>
             </w:rPr>
           </w:pPr>
-          <w:hyperlink w:anchor="_Toc241485009" w:history="1">
+          <w:hyperlink w:anchor="_Toc242725351" w:history="1">
             <w:r>
               <w:rPr>
                 <w:rStyle w:val="Hyperlink"/>
                 <w:noProof/>
               </w:rPr>
-              <w:t>Control’s:</w:t>
+              <w:t>The Lab</w:t>
             </w:r>
             <w:r>
               <w:rPr>
@@ -910,7 +1208,7 @@
                 <w:noProof/>
                 <w:webHidden/>
               </w:rPr>
-              <w:instrText xml:space="preserve"> PAGEREF _Toc241485009 \h </w:instrText>
+              <w:instrText xml:space="preserve"> PAGEREF _Toc242725351 \h </w:instrText>
             </w:r>
             <w:r>
               <w:rPr>
@@ -930,7 +1228,7 @@
                 <w:noProof/>
                 <w:webHidden/>
               </w:rPr>
-              <w:t>5</w:t>
+              <w:t>9</w:t>
             </w:r>
             <w:r>
               <w:rPr>
@@ -948,16 +1246,18 @@
               <w:tab w:val="right" w:leader="dot" w:pos="9016"/>
             </w:tabs>
             <w:rPr>
+              <w:rFonts w:asciiTheme="minorHAnsi" w:eastAsiaTheme="minorEastAsia" w:hAnsiTheme="minorHAnsi"/>
               <w:noProof/>
+              <w:lang w:eastAsia="en-GB"/>
             </w:rPr>
           </w:pPr>
-          <w:hyperlink w:anchor="_Toc241485010" w:history="1">
+          <w:hyperlink w:anchor="_Toc242725352" w:history="1">
             <w:r>
               <w:rPr>
                 <w:rStyle w:val="Hyperlink"/>
                 <w:noProof/>
               </w:rPr>
-              <w:t>Perks:</w:t>
+              <w:t>Village</w:t>
             </w:r>
             <w:r>
               <w:rPr>
@@ -978,7 +1278,7 @@
                 <w:noProof/>
                 <w:webHidden/>
               </w:rPr>
-              <w:instrText xml:space="preserve"> PAGEREF _Toc241485010 \h </w:instrText>
+              <w:instrText xml:space="preserve"> PAGEREF _Toc242725352 \h </w:instrText>
             </w:r>
             <w:r>
               <w:rPr>
@@ -998,7 +1298,7 @@
                 <w:noProof/>
                 <w:webHidden/>
               </w:rPr>
-              <w:t>6</w:t>
+              <w:t>9</w:t>
             </w:r>
             <w:r>
               <w:rPr>
@@ -1016,16 +1316,18 @@
               <w:tab w:val="right" w:leader="dot" w:pos="9016"/>
             </w:tabs>
             <w:rPr>
+              <w:rFonts w:asciiTheme="minorHAnsi" w:eastAsiaTheme="minorEastAsia" w:hAnsiTheme="minorHAnsi"/>
               <w:noProof/>
+              <w:lang w:eastAsia="en-GB"/>
             </w:rPr>
           </w:pPr>
-          <w:hyperlink w:anchor="_Toc241485011" w:history="1">
+          <w:hyperlink w:anchor="_Toc242725353" w:history="1">
             <w:r>
               <w:rPr>
                 <w:rStyle w:val="Hyperlink"/>
                 <w:noProof/>
               </w:rPr>
-              <w:t>Enemies:</w:t>
+              <w:t>Facility</w:t>
             </w:r>
             <w:r>
               <w:rPr>
@@ -1046,7 +1348,7 @@
                 <w:noProof/>
                 <w:webHidden/>
               </w:rPr>
-              <w:instrText xml:space="preserve"> PAGEREF _Toc241485011 \h </w:instrText>
+              <w:instrText xml:space="preserve"> PAGEREF _Toc242725353 \h </w:instrText>
             </w:r>
             <w:r>
               <w:rPr>
@@ -1066,7 +1368,7 @@
                 <w:noProof/>
                 <w:webHidden/>
               </w:rPr>
-              <w:t>6</w:t>
+              <w:t>9</w:t>
             </w:r>
             <w:r>
               <w:rPr>
@@ -1084,16 +1386,18 @@
               <w:tab w:val="right" w:leader="dot" w:pos="9016"/>
             </w:tabs>
             <w:rPr>
+              <w:rFonts w:asciiTheme="minorHAnsi" w:eastAsiaTheme="minorEastAsia" w:hAnsiTheme="minorHAnsi"/>
               <w:noProof/>
+              <w:lang w:eastAsia="en-GB"/>
             </w:rPr>
           </w:pPr>
-          <w:hyperlink w:anchor="_Toc241485012" w:history="1">
+          <w:hyperlink w:anchor="_Toc242725354" w:history="1">
             <w:r>
               <w:rPr>
                 <w:rStyle w:val="Hyperlink"/>
                 <w:noProof/>
               </w:rPr>
-              <w:t>Firearms:</w:t>
+              <w:t>Forest</w:t>
             </w:r>
             <w:r>
               <w:rPr>
@@ -1114,7 +1418,7 @@
                 <w:noProof/>
                 <w:webHidden/>
               </w:rPr>
-              <w:instrText xml:space="preserve"> PAGEREF _Toc241485012 \h </w:instrText>
+              <w:instrText xml:space="preserve"> PAGEREF _Toc242725354 \h </w:instrText>
             </w:r>
             <w:r>
               <w:rPr>
@@ -1134,7 +1438,77 @@
                 <w:noProof/>
                 <w:webHidden/>
               </w:rPr>
-              <w:t>7</w:t>
+              <w:t>9</w:t>
+            </w:r>
+            <w:r>
+              <w:rPr>
+                <w:noProof/>
+                <w:webHidden/>
+              </w:rPr>
+              <w:fldChar w:fldCharType="end"/>
+            </w:r>
+          </w:hyperlink>
+        </w:p>
+        <w:p>
+          <w:pPr>
+            <w:pStyle w:val="TOC1"/>
+            <w:tabs>
+              <w:tab w:val="right" w:leader="dot" w:pos="9016"/>
+            </w:tabs>
+            <w:rPr>
+              <w:rFonts w:asciiTheme="minorHAnsi" w:eastAsiaTheme="minorEastAsia" w:hAnsiTheme="minorHAnsi"/>
+              <w:noProof/>
+              <w:lang w:eastAsia="en-GB"/>
+            </w:rPr>
+          </w:pPr>
+          <w:hyperlink w:anchor="_Toc242725355" w:history="1">
+            <w:r>
+              <w:rPr>
+                <w:rStyle w:val="Hyperlink"/>
+                <w:noProof/>
+              </w:rPr>
+              <w:t>USER INTERFACE</w:t>
+            </w:r>
+            <w:r>
+              <w:rPr>
+                <w:noProof/>
+                <w:webHidden/>
+              </w:rPr>
+              <w:tab/>
+            </w:r>
+            <w:r>
+              <w:rPr>
+                <w:noProof/>
+                <w:webHidden/>
+              </w:rPr>
+              <w:fldChar w:fldCharType="begin"/>
+            </w:r>
+            <w:r>
+              <w:rPr>
+                <w:noProof/>
+                <w:webHidden/>
+              </w:rPr>
+              <w:instrText xml:space="preserve"> PAGEREF _Toc242725355 \h </w:instrText>
+            </w:r>
+            <w:r>
+              <w:rPr>
+                <w:noProof/>
+                <w:webHidden/>
+              </w:rPr>
+            </w:r>
+            <w:r>
+              <w:rPr>
+                <w:noProof/>
+                <w:webHidden/>
+              </w:rPr>
+              <w:fldChar w:fldCharType="separate"/>
+            </w:r>
+            <w:r>
+              <w:rPr>
+                <w:noProof/>
+                <w:webHidden/>
+              </w:rPr>
+              <w:t>10</w:t>
             </w:r>
             <w:r>
               <w:rPr>
@@ -1152,16 +1526,18 @@
               <w:tab w:val="right" w:leader="dot" w:pos="9016"/>
             </w:tabs>
             <w:rPr>
+              <w:rFonts w:asciiTheme="minorHAnsi" w:eastAsiaTheme="minorEastAsia" w:hAnsiTheme="minorHAnsi"/>
               <w:noProof/>
+              <w:lang w:eastAsia="en-GB"/>
             </w:rPr>
           </w:pPr>
-          <w:hyperlink w:anchor="_Toc241485013" w:history="1">
+          <w:hyperlink w:anchor="_Toc242725356" w:history="1">
             <w:r>
               <w:rPr>
                 <w:rStyle w:val="Hyperlink"/>
                 <w:noProof/>
               </w:rPr>
-              <w:t>Level:</w:t>
+              <w:t>Main Menu</w:t>
             </w:r>
             <w:r>
               <w:rPr>
@@ -1182,7 +1558,7 @@
                 <w:noProof/>
                 <w:webHidden/>
               </w:rPr>
-              <w:instrText xml:space="preserve"> PAGEREF _Toc241485013 \h </w:instrText>
+              <w:instrText xml:space="preserve"> PAGEREF _Toc242725356 \h </w:instrText>
             </w:r>
             <w:r>
               <w:rPr>
@@ -1202,7 +1578,7 @@
                 <w:noProof/>
                 <w:webHidden/>
               </w:rPr>
-              <w:t>8</w:t>
+              <w:t>10</w:t>
             </w:r>
             <w:r>
               <w:rPr>
@@ -1220,16 +1596,18 @@
               <w:tab w:val="right" w:leader="dot" w:pos="9016"/>
             </w:tabs>
             <w:rPr>
+              <w:rFonts w:asciiTheme="minorHAnsi" w:eastAsiaTheme="minorEastAsia" w:hAnsiTheme="minorHAnsi"/>
               <w:noProof/>
+              <w:lang w:eastAsia="en-GB"/>
             </w:rPr>
           </w:pPr>
-          <w:hyperlink w:anchor="_Toc241485014" w:history="1">
+          <w:hyperlink w:anchor="_Toc242725357" w:history="1">
             <w:r>
               <w:rPr>
                 <w:rStyle w:val="Hyperlink"/>
                 <w:noProof/>
               </w:rPr>
-              <w:t>Level Layout:</w:t>
+              <w:t>Multiplayer Configure</w:t>
             </w:r>
             <w:r>
               <w:rPr>
@@ -1250,7 +1628,7 @@
                 <w:noProof/>
                 <w:webHidden/>
               </w:rPr>
-              <w:instrText xml:space="preserve"> PAGEREF _Toc241485014 \h </w:instrText>
+              <w:instrText xml:space="preserve"> PAGEREF _Toc242725357 \h </w:instrText>
             </w:r>
             <w:r>
               <w:rPr>
@@ -1270,7 +1648,7 @@
                 <w:noProof/>
                 <w:webHidden/>
               </w:rPr>
-              <w:t>8</w:t>
+              <w:t>10</w:t>
             </w:r>
             <w:r>
               <w:rPr>
@@ -1288,16 +1666,18 @@
               <w:tab w:val="right" w:leader="dot" w:pos="9016"/>
             </w:tabs>
             <w:rPr>
+              <w:rFonts w:asciiTheme="minorHAnsi" w:eastAsiaTheme="minorEastAsia" w:hAnsiTheme="minorHAnsi"/>
               <w:noProof/>
+              <w:lang w:eastAsia="en-GB"/>
             </w:rPr>
           </w:pPr>
-          <w:hyperlink w:anchor="_Toc241485015" w:history="1">
+          <w:hyperlink w:anchor="_Toc242725358" w:history="1">
             <w:r>
               <w:rPr>
                 <w:rStyle w:val="Hyperlink"/>
                 <w:noProof/>
               </w:rPr>
-              <w:t>Game Mode:</w:t>
+              <w:t>Settings</w:t>
             </w:r>
             <w:r>
               <w:rPr>
@@ -1318,7 +1698,7 @@
                 <w:noProof/>
                 <w:webHidden/>
               </w:rPr>
-              <w:instrText xml:space="preserve"> PAGEREF _Toc241485015 \h </w:instrText>
+              <w:instrText xml:space="preserve"> PAGEREF _Toc242725358 \h </w:instrText>
             </w:r>
             <w:r>
               <w:rPr>
@@ -1338,7 +1718,7 @@
                 <w:noProof/>
                 <w:webHidden/>
               </w:rPr>
-              <w:t>8</w:t>
+              <w:t>11</w:t>
             </w:r>
             <w:r>
               <w:rPr>
@@ -1356,16 +1736,18 @@
               <w:tab w:val="right" w:leader="dot" w:pos="9016"/>
             </w:tabs>
             <w:rPr>
+              <w:rFonts w:asciiTheme="minorHAnsi" w:eastAsiaTheme="minorEastAsia" w:hAnsiTheme="minorHAnsi"/>
               <w:noProof/>
+              <w:lang w:eastAsia="en-GB"/>
             </w:rPr>
           </w:pPr>
-          <w:hyperlink w:anchor="_Toc241485016" w:history="1">
+          <w:hyperlink w:anchor="_Toc242725359" w:history="1">
             <w:r>
               <w:rPr>
                 <w:rStyle w:val="Hyperlink"/>
                 <w:noProof/>
               </w:rPr>
-              <w:t>Visual Aesthetics:</w:t>
+              <w:t>Credits</w:t>
             </w:r>
             <w:r>
               <w:rPr>
@@ -1386,7 +1768,7 @@
                 <w:noProof/>
                 <w:webHidden/>
               </w:rPr>
-              <w:instrText xml:space="preserve"> PAGEREF _Toc241485016 \h </w:instrText>
+              <w:instrText xml:space="preserve"> PAGEREF _Toc242725359 \h </w:instrText>
             </w:r>
             <w:r>
               <w:rPr>
@@ -1406,7 +1788,7 @@
                 <w:noProof/>
                 <w:webHidden/>
               </w:rPr>
-              <w:t>9</w:t>
+              <w:t>11</w:t>
             </w:r>
             <w:r>
               <w:rPr>
@@ -1424,16 +1806,18 @@
               <w:tab w:val="right" w:leader="dot" w:pos="9016"/>
             </w:tabs>
             <w:rPr>
+              <w:rFonts w:asciiTheme="minorHAnsi" w:eastAsiaTheme="minorEastAsia" w:hAnsiTheme="minorHAnsi"/>
               <w:noProof/>
+              <w:lang w:eastAsia="en-GB"/>
             </w:rPr>
           </w:pPr>
-          <w:hyperlink w:anchor="_Toc241485017" w:history="1">
+          <w:hyperlink w:anchor="_Toc242725360" w:history="1">
             <w:r>
               <w:rPr>
                 <w:rStyle w:val="Hyperlink"/>
                 <w:noProof/>
               </w:rPr>
-              <w:t>HUD:</w:t>
+              <w:t>In-game HUD</w:t>
             </w:r>
             <w:r>
               <w:rPr>
@@ -1454,7 +1838,7 @@
                 <w:noProof/>
                 <w:webHidden/>
               </w:rPr>
-              <w:instrText xml:space="preserve"> PAGEREF _Toc241485017 \h </w:instrText>
+              <w:instrText xml:space="preserve"> PAGEREF _Toc242725360 \h </w:instrText>
             </w:r>
             <w:r>
               <w:rPr>
@@ -1474,7 +1858,217 @@
                 <w:noProof/>
                 <w:webHidden/>
               </w:rPr>
-              <w:t>10</w:t>
+              <w:t>11</w:t>
+            </w:r>
+            <w:r>
+              <w:rPr>
+                <w:noProof/>
+                <w:webHidden/>
+              </w:rPr>
+              <w:fldChar w:fldCharType="end"/>
+            </w:r>
+          </w:hyperlink>
+        </w:p>
+        <w:p>
+          <w:pPr>
+            <w:pStyle w:val="TOC2"/>
+            <w:tabs>
+              <w:tab w:val="right" w:leader="dot" w:pos="9016"/>
+            </w:tabs>
+            <w:rPr>
+              <w:rFonts w:asciiTheme="minorHAnsi" w:eastAsiaTheme="minorEastAsia" w:hAnsiTheme="minorHAnsi"/>
+              <w:noProof/>
+              <w:lang w:eastAsia="en-GB"/>
+            </w:rPr>
+          </w:pPr>
+          <w:hyperlink w:anchor="_Toc242725361" w:history="1">
+            <w:r>
+              <w:rPr>
+                <w:rStyle w:val="Hyperlink"/>
+                <w:noProof/>
+              </w:rPr>
+              <w:t>Pause Screen</w:t>
+            </w:r>
+            <w:r>
+              <w:rPr>
+                <w:noProof/>
+                <w:webHidden/>
+              </w:rPr>
+              <w:tab/>
+            </w:r>
+            <w:r>
+              <w:rPr>
+                <w:noProof/>
+                <w:webHidden/>
+              </w:rPr>
+              <w:fldChar w:fldCharType="begin"/>
+            </w:r>
+            <w:r>
+              <w:rPr>
+                <w:noProof/>
+                <w:webHidden/>
+              </w:rPr>
+              <w:instrText xml:space="preserve"> PAGEREF _Toc242725361 \h </w:instrText>
+            </w:r>
+            <w:r>
+              <w:rPr>
+                <w:noProof/>
+                <w:webHidden/>
+              </w:rPr>
+            </w:r>
+            <w:r>
+              <w:rPr>
+                <w:noProof/>
+                <w:webHidden/>
+              </w:rPr>
+              <w:fldChar w:fldCharType="separate"/>
+            </w:r>
+            <w:r>
+              <w:rPr>
+                <w:noProof/>
+                <w:webHidden/>
+              </w:rPr>
+              <w:t>12</w:t>
+            </w:r>
+            <w:r>
+              <w:rPr>
+                <w:noProof/>
+                <w:webHidden/>
+              </w:rPr>
+              <w:fldChar w:fldCharType="end"/>
+            </w:r>
+          </w:hyperlink>
+        </w:p>
+        <w:p>
+          <w:pPr>
+            <w:pStyle w:val="TOC2"/>
+            <w:tabs>
+              <w:tab w:val="right" w:leader="dot" w:pos="9016"/>
+            </w:tabs>
+            <w:rPr>
+              <w:rFonts w:asciiTheme="minorHAnsi" w:eastAsiaTheme="minorEastAsia" w:hAnsiTheme="minorHAnsi"/>
+              <w:noProof/>
+              <w:lang w:eastAsia="en-GB"/>
+            </w:rPr>
+          </w:pPr>
+          <w:hyperlink w:anchor="_Toc242725362" w:history="1">
+            <w:r>
+              <w:rPr>
+                <w:rStyle w:val="Hyperlink"/>
+                <w:noProof/>
+              </w:rPr>
+              <w:t>Game Over</w:t>
+            </w:r>
+            <w:r>
+              <w:rPr>
+                <w:noProof/>
+                <w:webHidden/>
+              </w:rPr>
+              <w:tab/>
+            </w:r>
+            <w:r>
+              <w:rPr>
+                <w:noProof/>
+                <w:webHidden/>
+              </w:rPr>
+              <w:fldChar w:fldCharType="begin"/>
+            </w:r>
+            <w:r>
+              <w:rPr>
+                <w:noProof/>
+                <w:webHidden/>
+              </w:rPr>
+              <w:instrText xml:space="preserve"> PAGEREF _Toc242725362 \h </w:instrText>
+            </w:r>
+            <w:r>
+              <w:rPr>
+                <w:noProof/>
+                <w:webHidden/>
+              </w:rPr>
+            </w:r>
+            <w:r>
+              <w:rPr>
+                <w:noProof/>
+                <w:webHidden/>
+              </w:rPr>
+              <w:fldChar w:fldCharType="separate"/>
+            </w:r>
+            <w:r>
+              <w:rPr>
+                <w:noProof/>
+                <w:webHidden/>
+              </w:rPr>
+              <w:t>12</w:t>
+            </w:r>
+            <w:r>
+              <w:rPr>
+                <w:noProof/>
+                <w:webHidden/>
+              </w:rPr>
+              <w:fldChar w:fldCharType="end"/>
+            </w:r>
+          </w:hyperlink>
+        </w:p>
+        <w:p>
+          <w:pPr>
+            <w:pStyle w:val="TOC2"/>
+            <w:tabs>
+              <w:tab w:val="right" w:leader="dot" w:pos="9016"/>
+            </w:tabs>
+            <w:rPr>
+              <w:rFonts w:asciiTheme="minorHAnsi" w:eastAsiaTheme="minorEastAsia" w:hAnsiTheme="minorHAnsi"/>
+              <w:noProof/>
+              <w:lang w:eastAsia="en-GB"/>
+            </w:rPr>
+          </w:pPr>
+          <w:hyperlink w:anchor="_Toc242725363" w:history="1">
+            <w:r>
+              <w:rPr>
+                <w:rStyle w:val="Hyperlink"/>
+                <w:noProof/>
+              </w:rPr>
+              <w:t>Flow Chart</w:t>
+            </w:r>
+            <w:r>
+              <w:rPr>
+                <w:noProof/>
+                <w:webHidden/>
+              </w:rPr>
+              <w:tab/>
+            </w:r>
+            <w:r>
+              <w:rPr>
+                <w:noProof/>
+                <w:webHidden/>
+              </w:rPr>
+              <w:fldChar w:fldCharType="begin"/>
+            </w:r>
+            <w:r>
+              <w:rPr>
+                <w:noProof/>
+                <w:webHidden/>
+              </w:rPr>
+              <w:instrText xml:space="preserve"> PAGEREF _Toc242725363 \h </w:instrText>
+            </w:r>
+            <w:r>
+              <w:rPr>
+                <w:noProof/>
+                <w:webHidden/>
+              </w:rPr>
+            </w:r>
+            <w:r>
+              <w:rPr>
+                <w:noProof/>
+                <w:webHidden/>
+              </w:rPr>
+              <w:fldChar w:fldCharType="separate"/>
+            </w:r>
+            <w:r>
+              <w:rPr>
+                <w:noProof/>
+                <w:webHidden/>
+              </w:rPr>
+              <w:t>12</w:t>
             </w:r>
             <w:r>
               <w:rPr>
@@ -1499,21 +2093,17 @@
     <w:p/>
     <w:p/>
     <w:p/>
-    <w:p/>
-    <w:p/>
-    <w:p/>
-    <w:p/>
     <w:p>
       <w:pPr>
         <w:pStyle w:val="Heading1"/>
       </w:pPr>
-      <w:bookmarkStart w:id="0" w:name="_Toc241484999"/>
+      <w:bookmarkStart w:id="0" w:name="_Toc242725337"/>
       <w:r>
         <w:lastRenderedPageBreak/>
         <w:t xml:space="preserve">PROJECT </w:t>
       </w:r>
       <w:r>
-        <w:t>PLAN:</w:t>
+        <w:t>PLAN</w:t>
       </w:r>
       <w:bookmarkEnd w:id="0"/>
     </w:p>
@@ -1521,66 +2111,79 @@
       <w:pPr>
         <w:pStyle w:val="Heading2"/>
       </w:pPr>
-      <w:bookmarkStart w:id="1" w:name="_Toc241485000"/>
+      <w:bookmarkStart w:id="1" w:name="_Toc242725338"/>
       <w:r>
         <w:t>Team</w:t>
       </w:r>
       <w:r>
-        <w:t xml:space="preserve"> List + Roles:</w:t>
+        <w:t xml:space="preserve"> List + Roles</w:t>
       </w:r>
       <w:bookmarkEnd w:id="1"/>
     </w:p>
     <w:p>
-      <w:r>
-        <w:rPr>
-          <w:color w:val="BFBFBF" w:themeColor="background1" w:themeShade="BF"/>
-        </w:rPr>
-        <w:t xml:space="preserve">Evan Montgomery </w:t>
-      </w:r>
-      <w:r>
-        <w:t>– Lead Artist</w:t>
-      </w:r>
-    </w:p>
-    <w:p>
-      <w:r>
-        <w:rPr>
-          <w:color w:val="BFBFBF" w:themeColor="background1" w:themeShade="BF"/>
-        </w:rPr>
-        <w:t xml:space="preserve">Emilia Gibson </w:t>
-      </w:r>
-      <w:r>
-        <w:t>– Lead Writer (Documents/Game</w:t>
-      </w:r>
-      <w:r>
+      <w:pPr>
+        <w:rPr>
+          <w:color w:val="FFFFFF" w:themeColor="background1"/>
+        </w:rPr>
+      </w:pPr>
+      <w:r>
+        <w:rPr>
+          <w:color w:val="FFFFFF" w:themeColor="background1"/>
+        </w:rPr>
+        <w:t>Emilia Gibson – Lead Writer (Documents/Game</w:t>
+      </w:r>
+      <w:r>
+        <w:rPr>
+          <w:color w:val="FFFFFF" w:themeColor="background1"/>
+        </w:rPr>
         <w:t xml:space="preserve"> narrative</w:t>
       </w:r>
       <w:r>
+        <w:rPr>
+          <w:color w:val="FFFFFF" w:themeColor="background1"/>
+        </w:rPr>
         <w:t>)</w:t>
       </w:r>
     </w:p>
     <w:p>
-      <w:r>
-        <w:rPr>
-          <w:color w:val="BFBFBF" w:themeColor="background1" w:themeShade="BF"/>
-        </w:rPr>
-        <w:t xml:space="preserve">Lyall McClue </w:t>
-      </w:r>
-      <w:r>
-        <w:t>– Lead Level Designer</w:t>
-      </w:r>
-    </w:p>
-    <w:p>
-      <w:r>
-        <w:rPr>
-          <w:color w:val="BFBFBF" w:themeColor="background1" w:themeShade="BF"/>
-        </w:rPr>
-        <w:t xml:space="preserve">Andrew Forrest </w:t>
-      </w:r>
-      <w:r>
-        <w:t>– Lead Programmer</w:t>
-      </w:r>
-    </w:p>
-    <w:p/>
+      <w:pPr>
+        <w:rPr>
+          <w:color w:val="FFFFFF" w:themeColor="background1"/>
+        </w:rPr>
+      </w:pPr>
+      <w:r>
+        <w:rPr>
+          <w:color w:val="FFFFFF" w:themeColor="background1"/>
+        </w:rPr>
+        <w:t>Evan Montgomery – Lead Artist</w:t>
+      </w:r>
+    </w:p>
+    <w:p>
+      <w:pPr>
+        <w:rPr>
+          <w:color w:val="FFFFFF" w:themeColor="background1"/>
+        </w:rPr>
+      </w:pPr>
+      <w:r>
+        <w:rPr>
+          <w:color w:val="FFFFFF" w:themeColor="background1"/>
+        </w:rPr>
+        <w:t>Lyall McClue – Lead Level Designer</w:t>
+      </w:r>
+    </w:p>
+    <w:p>
+      <w:pPr>
+        <w:rPr>
+          <w:color w:val="FFFFFF" w:themeColor="background1"/>
+        </w:rPr>
+      </w:pPr>
+      <w:r>
+        <w:rPr>
+          <w:color w:val="FFFFFF" w:themeColor="background1"/>
+        </w:rPr>
+        <w:t>Andrew Forrest – Lead Programmer</w:t>
+      </w:r>
+    </w:p>
     <w:p>
       <w:r>
         <w:t xml:space="preserve">These roles are not strict guidelines. Everyone will play a part in every stage. But everyone has an area that they </w:t>
@@ -1597,33 +2200,38 @@
       <w:pPr>
         <w:pStyle w:val="Heading2"/>
       </w:pPr>
-      <w:bookmarkStart w:id="2" w:name="_Toc241485001"/>
+      <w:bookmarkStart w:id="2" w:name="_Toc242725339"/>
       <w:r>
         <w:t>Project</w:t>
       </w:r>
       <w:r>
-        <w:t xml:space="preserve"> Details:</w:t>
+        <w:t xml:space="preserve"> Details</w:t>
       </w:r>
       <w:bookmarkEnd w:id="2"/>
     </w:p>
     <w:p>
       <w:r>
         <w:rPr>
-          <w:color w:val="BFBFBF" w:themeColor="background1" w:themeShade="BF"/>
-        </w:rPr>
-        <w:t xml:space="preserve">Project Necrosis </w:t>
-      </w:r>
-      <w:r>
-        <w:t>is a 3</w:t>
-      </w:r>
-      <w:r>
+          <w:color w:val="FFFFFF" w:themeColor="background1"/>
+        </w:rPr>
+        <w:t>Project Necrosis is a 3</w:t>
+      </w:r>
+      <w:r>
+        <w:rPr>
+          <w:color w:val="FFFFFF" w:themeColor="background1"/>
+        </w:rPr>
         <w:t>D</w:t>
       </w:r>
       <w:r>
-        <w:t xml:space="preserve"> FPS zombie survival game that is to be developed in the unity engine by our 4 team members with the goal being to either escape the facility in the quest mode or simply survive in the survival mode, with the traditional mechanics of both an FPS game but also zombie survival games like Cod Zombie’s and Left 4 dead being incorporated into its gameplay loop.</w:t>
-      </w:r>
-    </w:p>
-    <w:p/>
+        <w:rPr>
+          <w:color w:val="FFFFFF" w:themeColor="background1"/>
+        </w:rPr>
+        <w:t xml:space="preserve"> FPS zombie survival game that is to be developed in the unity engine by our 4 team members with the goal being to either escape the facility in the quest mode or simply </w:t>
+      </w:r>
+      <w:r>
+        <w:t>survive in the survival mode, with the traditional mechanics of both an FPS game but also zombie survival games like Cod Zombie’s and Left 4 dead being incorporated into its gameplay loop.</w:t>
+      </w:r>
+    </w:p>
     <w:p>
       <w:r>
         <w:t>We aim to have a good variety of content in the game but also to keep our expectations in check for the time frame we must develop it while also working on other course work for the Uni.</w:t>
@@ -1634,88 +2242,85 @@
       <w:pPr>
         <w:pStyle w:val="Heading2"/>
       </w:pPr>
-      <w:bookmarkStart w:id="3" w:name="_Toc241485002"/>
-      <w:r>
-        <w:t xml:space="preserve">Game </w:t>
-      </w:r>
-      <w:r>
-        <w:t>Genre</w:t>
-      </w:r>
-      <w:r>
-        <w:t xml:space="preserve"> Research:</w:t>
+      <w:bookmarkStart w:id="3" w:name="_Toc242725340"/>
+      <w:r>
+        <w:t xml:space="preserve">Development </w:t>
+      </w:r>
+      <w:r>
+        <w:t>Details</w:t>
       </w:r>
       <w:bookmarkEnd w:id="3"/>
     </w:p>
+    <w:p>
+      <w:r>
+        <w:t>We aim to develop this game purely on the Unity engine using it’s 6.0 version, with development being singled down for a purely PC market removing the workload that would be needed for the game to work on consoles, other software we plan to use includes Adobe Illustrator for original graphics and Blender if we want to make any original 3d models.</w:t>
+      </w:r>
+    </w:p>
     <w:p/>
+    <w:p/>
+    <w:p>
+      <w:pPr>
+        <w:pStyle w:val="Heading1"/>
+      </w:pPr>
+      <w:bookmarkStart w:id="4" w:name="_Toc242725341"/>
+      <w:r>
+        <w:lastRenderedPageBreak/>
+        <w:t>GAME OVERVIEW</w:t>
+      </w:r>
+      <w:bookmarkEnd w:id="4"/>
+    </w:p>
     <w:p>
       <w:pPr>
         <w:pStyle w:val="Heading2"/>
       </w:pPr>
-      <w:bookmarkStart w:id="4" w:name="_Toc241485003"/>
-      <w:r>
-        <w:t xml:space="preserve">Development </w:t>
-      </w:r>
-      <w:r>
-        <w:t>Details</w:t>
-      </w:r>
-      <w:r>
-        <w:t>:</w:t>
-      </w:r>
-      <w:bookmarkEnd w:id="4"/>
-    </w:p>
-    <w:p>
-      <w:r>
-        <w:t>We aim to develop this game purely on the Unity engine using it’s 6.0 version, with development being singled down for a purely PC market removing the workload that would be needed for the game to work on consoles, other software we plan to use includes Adobe Illustrator for original graphics and Blender if we want to make any original 3d models.</w:t>
+      <w:bookmarkStart w:id="5" w:name="_Toc242725342"/>
+      <w:r>
+        <w:t>Narrative</w:t>
+      </w:r>
+      <w:bookmarkEnd w:id="5"/>
+    </w:p>
+    <w:p>
+      <w:r>
+        <w:t xml:space="preserve">Set in the late 70s, the players will be investigating a allegedly Soviet owned Biopreparat (Biological warfare) facility in South East Asia allegedly testing the titular Project </w:t>
+      </w:r>
+      <w:r>
+        <w:t>Necrosis, a</w:t>
+      </w:r>
+      <w:r>
+        <w:t xml:space="preserve"> bioweapon said to raise the dead, and after raiding and killing the guards and operatives in the facility it turns out this goes far deeper then command or the ops expected, leading to needing to hold out against both the dead and invading operatives of </w:t>
+      </w:r>
+      <w:r>
+        <w:t>Grupp</w:t>
+      </w:r>
+      <w:r>
+        <w:t xml:space="preserve"> stell (temp name), a Soviet backed research group working on the weapon.</w:t>
       </w:r>
     </w:p>
     <w:p/>
-    <w:p>
-      <w:pPr>
-        <w:pStyle w:val="Heading1"/>
-      </w:pPr>
-      <w:bookmarkStart w:id="5" w:name="_Toc241485004"/>
-      <w:r>
-        <w:lastRenderedPageBreak/>
-        <w:t>GAME OVERVIEW:</w:t>
-      </w:r>
-      <w:bookmarkEnd w:id="5"/>
-    </w:p>
     <w:p>
       <w:pPr>
         <w:pStyle w:val="Heading2"/>
       </w:pPr>
-      <w:bookmarkStart w:id="6" w:name="_Toc241485005"/>
-      <w:r>
-        <w:t>Narrative</w:t>
-      </w:r>
-      <w:r>
-        <w:t>:</w:t>
+      <w:bookmarkStart w:id="6" w:name="_Toc242725343"/>
+      <w:r>
+        <w:t>Objective</w:t>
       </w:r>
       <w:bookmarkEnd w:id="6"/>
     </w:p>
     <w:p>
       <w:r>
-        <w:t xml:space="preserve">Set in the late 70s, the players will be investigating a allegedly Soviet owned </w:t>
-      </w:r>
-      <w:proofErr w:type="spellStart"/>
-      <w:r>
-        <w:t>Biopreparat</w:t>
-      </w:r>
-      <w:proofErr w:type="spellEnd"/>
-      <w:r>
-        <w:t xml:space="preserve"> (Biological warfare) facility in South East Asia allegedly testing the titular Project </w:t>
-      </w:r>
-      <w:r>
-        <w:t>Necrosis, a</w:t>
-      </w:r>
-      <w:r>
-        <w:t xml:space="preserve"> bioweapon said to raise the dead, and after raiding and killing the guards and operatives in the facility it turns out this goes far deeper then command or the ops expected, leading to needing to hold out against both the dead and invading operatives of </w:t>
-      </w:r>
-      <w:r>
-        <w:t>Grupp</w:t>
-      </w:r>
-      <w:r>
-        <w:t xml:space="preserve"> stell (temp name), a Soviet backed research group working on the weapon.</w:t>
+        <w:t xml:space="preserve">The objective in Project: Necrosis to survive </w:t>
+      </w:r>
+      <w:r>
+        <w:t>HO</w:t>
+      </w:r>
+    </w:p>
+    <w:p>
+      <w:r>
+        <w:t>Survive to a select wave and call-in backup to evac in the quest mode with the potential you could be an optional way to get a good/bad ending by creating an antidote</w:t>
+      </w:r>
+      <w:r>
+        <w:t>.</w:t>
       </w:r>
     </w:p>
     <w:p/>
@@ -1723,44 +2328,14 @@
       <w:pPr>
         <w:pStyle w:val="Heading2"/>
       </w:pPr>
-      <w:bookmarkStart w:id="7" w:name="_Toc241485006"/>
-      <w:r>
-        <w:t>Objective</w:t>
-      </w:r>
-      <w:r>
-        <w:t>:</w:t>
+      <w:bookmarkStart w:id="7" w:name="_Toc242725344"/>
+      <w:r>
+        <w:t>Playable Characters</w:t>
       </w:r>
       <w:bookmarkEnd w:id="7"/>
     </w:p>
     <w:p>
       <w:r>
-        <w:t xml:space="preserve">The objective in Project: Necrosis to survive </w:t>
-      </w:r>
-      <w:r>
-        <w:t>HO</w:t>
-      </w:r>
-    </w:p>
-    <w:p>
-      <w:r>
-        <w:t>Survive to a select wave and call-in backup to evac in the quest mode with the potential you could be an optional way to get a good/bad ending by creating an antidote</w:t>
-      </w:r>
-      <w:r>
-        <w:t>.</w:t>
-      </w:r>
-    </w:p>
-    <w:p/>
-    <w:p>
-      <w:pPr>
-        <w:pStyle w:val="Heading2"/>
-      </w:pPr>
-      <w:bookmarkStart w:id="8" w:name="_Toc241485007"/>
-      <w:r>
-        <w:t>Playable Characters:</w:t>
-      </w:r>
-      <w:bookmarkEnd w:id="8"/>
-    </w:p>
-    <w:p>
-      <w:r>
         <w:t>Wolfgang Steiner:</w:t>
       </w:r>
       <w:r>
@@ -1781,24 +2356,22 @@
         <w:t xml:space="preserve"> the others and hiding his face behind it.</w:t>
       </w:r>
     </w:p>
-    <w:p/>
     <w:p>
       <w:r>
         <w:rPr>
           <w:noProof/>
         </w:rPr>
-        <w:lastRenderedPageBreak/>
         <w:drawing>
-          <wp:anchor distT="0" distB="0" distL="114300" distR="114300" simplePos="0" relativeHeight="251659264" behindDoc="0" locked="0" layoutInCell="1" allowOverlap="1" wp14:anchorId="06B7AE38" wp14:editId="39D6683F">
+          <wp:anchor distT="0" distB="0" distL="114300" distR="114300" simplePos="0" relativeHeight="251659264" behindDoc="0" locked="0" layoutInCell="1" allowOverlap="1" wp14:anchorId="06B7AE38" wp14:editId="442674E8">
             <wp:simplePos x="0" y="0"/>
             <wp:positionH relativeFrom="margin">
               <wp:align>center</wp:align>
             </wp:positionH>
             <wp:positionV relativeFrom="paragraph">
-              <wp:posOffset>-220345</wp:posOffset>
+              <wp:posOffset>80645</wp:posOffset>
             </wp:positionV>
-            <wp:extent cx="4267200" cy="2844642"/>
-            <wp:effectExtent l="0" t="0" r="0" b="0"/>
+            <wp:extent cx="3794970" cy="2529840"/>
+            <wp:effectExtent l="0" t="0" r="0" b="3810"/>
             <wp:wrapSquare wrapText="bothSides"/>
             <wp:docPr id="2067634873" name="Picture 4" descr="Usmc Sniper Ghillie Snipers Wearing Ghillie Suits Engage Mock Targets"/>
             <wp:cNvGraphicFramePr>
@@ -1829,7 +2402,7 @@
                   <pic:spPr bwMode="auto">
                     <a:xfrm>
                       <a:off x="0" y="0"/>
-                      <a:ext cx="4267200" cy="2844642"/>
+                      <a:ext cx="3794970" cy="2529840"/>
                     </a:xfrm>
                     <a:prstGeom prst="rect">
                       <a:avLst/>
@@ -1845,6 +2418,12 @@
                 </pic:pic>
               </a:graphicData>
             </a:graphic>
+            <wp14:sizeRelH relativeFrom="margin">
+              <wp14:pctWidth>0</wp14:pctWidth>
+            </wp14:sizeRelH>
+            <wp14:sizeRelV relativeFrom="margin">
+              <wp14:pctHeight>0</wp14:pctHeight>
+            </wp14:sizeRelV>
           </wp:anchor>
         </w:drawing>
       </w:r>
@@ -1856,6 +2435,7 @@
     <w:p/>
     <w:p/>
     <w:p/>
+    <w:p/>
     <w:p>
       <w:r>
         <w:t xml:space="preserve">Arthur </w:t>
@@ -1886,30 +2466,24 @@
       <w:pPr>
         <w:pStyle w:val="Heading1"/>
       </w:pPr>
-      <w:bookmarkStart w:id="9" w:name="_Toc241485008"/>
+      <w:bookmarkStart w:id="8" w:name="_Toc242725345"/>
       <w:r>
         <w:t xml:space="preserve">GAME </w:t>
       </w:r>
       <w:r>
         <w:t>MECHANICS</w:t>
       </w:r>
-      <w:r>
-        <w:t>:</w:t>
-      </w:r>
-      <w:bookmarkEnd w:id="9"/>
+      <w:bookmarkEnd w:id="8"/>
     </w:p>
     <w:p>
       <w:pPr>
         <w:pStyle w:val="Heading2"/>
       </w:pPr>
-      <w:bookmarkStart w:id="10" w:name="_Toc241485009"/>
+      <w:bookmarkStart w:id="9" w:name="_Toc242725346"/>
       <w:r>
         <w:t>Controls</w:t>
       </w:r>
-      <w:r>
-        <w:t>:</w:t>
-      </w:r>
-      <w:bookmarkEnd w:id="10"/>
+      <w:bookmarkEnd w:id="9"/>
     </w:p>
     <w:p>
       <w:r>
@@ -1936,19 +2510,7 @@
     <w:p/>
     <w:p>
       <w:r>
-        <w:t xml:space="preserve">The player can fire their gun with the right click of the mouse, either being able to hold down for continuous fire with a full auto weapon or needing to click again for a </w:t>
-      </w:r>
-      <w:r>
-        <w:lastRenderedPageBreak/>
-        <w:t xml:space="preserve">semi auto and can reload the firearm at any point when it misses 1 bullet in </w:t>
-      </w:r>
-      <w:proofErr w:type="spellStart"/>
-      <w:r>
-        <w:t>it’s</w:t>
-      </w:r>
-      <w:proofErr w:type="spellEnd"/>
-      <w:r>
-        <w:t xml:space="preserve"> starting mag by pressing </w:t>
+        <w:t xml:space="preserve">The player can fire their gun with the right click of the mouse, either being able to hold down for continuous fire with a full auto weapon or needing to click again for a semi auto and can reload the firearm at any point when it misses 1 bullet in it’s starting mag by pressing </w:t>
       </w:r>
       <w:r>
         <w:t>R or</w:t>
@@ -1957,83 +2519,152 @@
         <w:t xml:space="preserve"> automatically reloading when the mag runs empty.</w:t>
       </w:r>
     </w:p>
+    <w:p/>
+    <w:p/>
+    <w:p/>
+    <w:p/>
     <w:p/>
     <w:p>
       <w:pPr>
         <w:pStyle w:val="Heading2"/>
       </w:pPr>
-      <w:bookmarkStart w:id="11" w:name="_Toc241485010"/>
-      <w:r>
+      <w:bookmarkStart w:id="10" w:name="_Toc242725347"/>
+      <w:r>
+        <w:lastRenderedPageBreak/>
         <w:t>Perks</w:t>
       </w:r>
-      <w:r>
-        <w:t>:</w:t>
-      </w:r>
-      <w:bookmarkEnd w:id="11"/>
-    </w:p>
-    <w:p>
-      <w:r>
-        <w:t>In the game space the player will be able to find perk machines at set locations, with each perk offering a unique benefit to the player if bought, with each one’s cost reflecting what it does to help benefit the player in game.</w:t>
+      <w:bookmarkEnd w:id="10"/>
+    </w:p>
+    <w:p>
+      <w:r>
+        <w:t>Written by Evan Montgomery</w:t>
+      </w:r>
+    </w:p>
+    <w:p>
+      <w:r>
+        <w:t>During</w:t>
+      </w:r>
+      <w:r>
+        <w:t xml:space="preserve"> the game</w:t>
+      </w:r>
+      <w:r>
+        <w:t xml:space="preserve">play, </w:t>
+      </w:r>
+      <w:r>
+        <w:t>the player will be able to find perk</w:t>
+      </w:r>
+      <w:r>
+        <w:t>s</w:t>
+      </w:r>
+      <w:r>
+        <w:t xml:space="preserve"> at set locations</w:t>
+      </w:r>
+      <w:r>
+        <w:t xml:space="preserve"> in the form of abandoned cases</w:t>
+      </w:r>
+      <w:r>
+        <w:t>, with each perk offering a unique benefit to the player if bought</w:t>
+      </w:r>
+      <w:r>
+        <w:t>. You use points, and that opens up the case where you can equip the perk.</w:t>
       </w:r>
     </w:p>
     <w:p/>
     <w:p>
       <w:r>
-        <w:t>Death’s Door Tonic</w:t>
-      </w:r>
-      <w:r>
-        <w:t xml:space="preserve"> – For 500 points in solo, or 1500 in MP, the player is granted increased healing speeds, quicker revives for multiplayer and a self-revive in solo, which is capped at 3, as once this cap is hit the machine will become unusable to the player.</w:t>
+        <w:rPr>
+          <w:b/>
+          <w:bCs/>
+        </w:rPr>
+        <w:t>Revital-X</w:t>
+      </w:r>
+      <w:r>
+        <w:rPr>
+          <w:b/>
+          <w:bCs/>
+        </w:rPr>
+        <w:t xml:space="preserve"> (RX-01)</w:t>
+      </w:r>
+      <w:r>
+        <w:br/>
+      </w:r>
+      <w:r>
+        <w:t xml:space="preserve">For 500 points in solo, or 1500 in </w:t>
+      </w:r>
+      <w:r>
+        <w:t>multiplayer</w:t>
+      </w:r>
+      <w:r>
+        <w:t>, the player is granted increased healing speeds, quicker revives for multiplayer and a self-revive in solo, which is capped at 3, as once this cap is hit the machine will become unusable to the player.</w:t>
       </w:r>
     </w:p>
     <w:p/>
     <w:p>
-      <w:proofErr w:type="spellStart"/>
-      <w:r>
-        <w:t>Tough’N’Up</w:t>
-      </w:r>
-      <w:proofErr w:type="spellEnd"/>
-      <w:r>
-        <w:t xml:space="preserve"> </w:t>
-      </w:r>
-      <w:r>
-        <w:t xml:space="preserve">Soda </w:t>
-      </w:r>
-      <w:r>
-        <w:t>– For 2500 points, the player is granted additional HP that enhances their durability against enemies.</w:t>
+      <w:r>
+        <w:rPr>
+          <w:b/>
+          <w:bCs/>
+        </w:rPr>
+        <w:t>Fortigen</w:t>
+      </w:r>
+      <w:r>
+        <w:rPr>
+          <w:b/>
+          <w:bCs/>
+        </w:rPr>
+        <w:t xml:space="preserve"> (FG-02)</w:t>
+      </w:r>
+      <w:r>
+        <w:br/>
+      </w:r>
+      <w:r>
+        <w:t>For 2500 points, the player is granted additional HP that enhances their durability against enemies.</w:t>
       </w:r>
     </w:p>
     <w:p/>
     <w:p>
-      <w:proofErr w:type="spellStart"/>
-      <w:r>
-        <w:t>Quick’N’Up</w:t>
-      </w:r>
-      <w:proofErr w:type="spellEnd"/>
-      <w:r>
-        <w:t xml:space="preserve"> </w:t>
-      </w:r>
-      <w:r>
-        <w:t xml:space="preserve">Brandy </w:t>
-      </w:r>
-      <w:r>
-        <w:t>– For 3000 points, the player will gain the ability to reload faster, to move faster and to be able to sprint and shoot/reload with no draw backs</w:t>
+      <w:r>
+        <w:rPr>
+          <w:b/>
+          <w:bCs/>
+        </w:rPr>
+        <w:t>Reflexium</w:t>
+      </w:r>
+      <w:r>
+        <w:rPr>
+          <w:b/>
+          <w:bCs/>
+        </w:rPr>
+        <w:t xml:space="preserve"> (RF-03)</w:t>
+      </w:r>
+      <w:r>
+        <w:br/>
+      </w:r>
+      <w:r>
+        <w:t>For 3000 points, the player will gain the ability to reload faster, to move faster and to be able to sprint and shoot/reload with no draw backs</w:t>
       </w:r>
     </w:p>
     <w:p/>
     <w:p>
-      <w:proofErr w:type="spellStart"/>
-      <w:r>
-        <w:t>Spray’N’Pray</w:t>
-      </w:r>
-      <w:proofErr w:type="spellEnd"/>
-      <w:r>
-        <w:t xml:space="preserve"> </w:t>
-      </w:r>
-      <w:r>
-        <w:t xml:space="preserve">Root beer </w:t>
-      </w:r>
-      <w:r>
-        <w:t>– For 2000 points, the player will gain additional damage for their bullet-based firearms by around 5-10%, as well as the fire rate being slightly upped for all firearm</w:t>
+      <w:r>
+        <w:rPr>
+          <w:b/>
+          <w:bCs/>
+        </w:rPr>
+        <w:t>Ballistix</w:t>
+      </w:r>
+      <w:r>
+        <w:rPr>
+          <w:b/>
+          <w:bCs/>
+        </w:rPr>
+        <w:t xml:space="preserve"> (BX-04)</w:t>
+      </w:r>
+      <w:r>
+        <w:br/>
+      </w:r>
+      <w:r>
+        <w:t>For 2000 points, the player will gain additional damage for their bullet-based firearms by around 5-10%, as well as the fire rate being slightly upped for all firearm</w:t>
       </w:r>
       <w:r>
         <w:t>s.</w:t>
@@ -2048,7 +2679,10 @@
         <w:t>its</w:t>
       </w:r>
       <w:r>
-        <w:t xml:space="preserve"> own unique benefits to the player as observed above and the machines will be easily recognised by the name and logos used for the machine that tell the player instantly what it is.</w:t>
+        <w:t xml:space="preserve"> own unique benefits to the player as observed abov</w:t>
+      </w:r>
+      <w:r>
+        <w:t>e. All of these perks are available at the set locations. No perk can be equipped twice.</w:t>
       </w:r>
     </w:p>
     <w:p/>
@@ -2056,14 +2690,11 @@
       <w:pPr>
         <w:pStyle w:val="Heading2"/>
       </w:pPr>
-      <w:bookmarkStart w:id="12" w:name="_Toc241485011"/>
+      <w:bookmarkStart w:id="11" w:name="_Toc242725348"/>
       <w:r>
         <w:t>Enemies</w:t>
       </w:r>
-      <w:r>
-        <w:t>:</w:t>
-      </w:r>
-      <w:bookmarkEnd w:id="12"/>
+      <w:bookmarkEnd w:id="11"/>
     </w:p>
     <w:p>
       <w:r>
@@ -2092,14 +2723,7 @@
     <w:p>
       <w:r>
         <w:br/>
-      </w:r>
-      <w:proofErr w:type="spellStart"/>
-      <w:r>
-        <w:t>Biopreparat</w:t>
-      </w:r>
-      <w:proofErr w:type="spellEnd"/>
-      <w:r>
-        <w:t xml:space="preserve"> Grupp soldier: Special enemy that only appears every 5 rounds, they are humans with gas masks who enter the facility in an attempt to stop the player cast, they are the only enemies who use ranged combat which makes them a greater threat at range then the zombies are, but they are much squishier than the zombies and die quicker to compensate.</w:t>
+        <w:t>Biopreparat Grupp soldier: Special enemy that only appears every 5 rounds, they are humans with gas masks who enter the facility in an attempt to stop the player cast, they are the only enemies who use ranged combat which makes them a greater threat at range then the zombies are, but they are much squishier than the zombies and die quicker to compensate.</w:t>
       </w:r>
     </w:p>
     <w:p/>
@@ -2107,21 +2731,17 @@
       <w:pPr>
         <w:pStyle w:val="Heading2"/>
       </w:pPr>
-      <w:bookmarkStart w:id="13" w:name="_Toc241485012"/>
+      <w:bookmarkStart w:id="12" w:name="_Toc242725349"/>
       <w:r>
         <w:t>Firearms</w:t>
       </w:r>
-      <w:r>
-        <w:t>:</w:t>
-      </w:r>
-      <w:bookmarkEnd w:id="13"/>
+      <w:bookmarkEnd w:id="12"/>
     </w:p>
     <w:p>
       <w:r>
         <w:t>Two distinct sets of weapons focusing on Western and Eastern weapons include in the firearms pool, with one side being mainly Western and the other Eastern, with the players all spawning with a M1911 at game spawn but quickly getting options to upgrade their gun from wall guns or from the interdimensional crate (box) and able to use upgrade kits in the upgrade facility to upgrade their firearms (pack a punch)</w:t>
       </w:r>
     </w:p>
-    <w:p/>
     <w:p>
       <w:r>
         <w:t>Example firearms include:</w:t>
@@ -2172,7 +2792,6 @@
         <w:t>Launcher – M72 LAW and RPG-7</w:t>
       </w:r>
     </w:p>
-    <w:p/>
     <w:p>
       <w:r>
         <w:t xml:space="preserve">Each weapon will also get a unique name when it’s put into the upgrade machine and depending on the firearm will gain a new unique property for shooting, as </w:t>
@@ -2181,79 +2800,49 @@
         <w:t>an</w:t>
       </w:r>
       <w:r>
-        <w:t xml:space="preserve"> example when the M1911 is upgraded it becomes Duty and Honour, changing to a akimbo firearm that shoots grenades instead of the normal bullets it started with, </w:t>
-      </w:r>
-      <w:r>
+        <w:t xml:space="preserve"> example when the M1911 is upgraded it becomes Duty and Honour, changing to a akimbo firearm that shoots grenades instead of the normal bullets it started with, meanwhile the PPSH-41 will become the Stalingrad Sweeper and have its fire rate upped even further </w:t>
+      </w:r>
+      <w:r>
+        <w:t>than</w:t>
+      </w:r>
+      <w:r>
+        <w:t xml:space="preserve"> it already is while it gain’s a drum magazine with </w:t>
+      </w:r>
+      <w:r>
+        <w:t>an</w:t>
+      </w:r>
+      <w:r>
+        <w:t xml:space="preserve"> impressive amount of ammo to keep up with </w:t>
+      </w:r>
+      <w:r>
+        <w:t>its</w:t>
+      </w:r>
+      <w:r>
+        <w:t xml:space="preserve"> blistering fire rate.</w:t>
+      </w:r>
+    </w:p>
+    <w:p>
+      <w:pPr>
+        <w:pStyle w:val="Heading1"/>
+      </w:pPr>
+      <w:bookmarkStart w:id="13" w:name="_Toc242725350"/>
+      <w:r>
+        <w:rPr>
+          <w:noProof/>
+        </w:rPr>
         <w:lastRenderedPageBreak/>
-        <w:t xml:space="preserve">meanwhile the PPSH-41 will become the Stalingrad Sweeper and have its fire rate upped even further </w:t>
-      </w:r>
-      <w:r>
-        <w:t>than</w:t>
-      </w:r>
-      <w:r>
-        <w:t xml:space="preserve"> it already is while it gain’s a drum magazine with </w:t>
-      </w:r>
-      <w:r>
-        <w:t>an</w:t>
-      </w:r>
-      <w:r>
-        <w:t xml:space="preserve"> impressive amount of ammo to keep up with </w:t>
-      </w:r>
-      <w:r>
-        <w:t>its</w:t>
-      </w:r>
-      <w:r>
-        <w:t xml:space="preserve"> blistering fire rate.</w:t>
-      </w:r>
-    </w:p>
-    <w:p>
-      <w:pPr>
-        <w:pStyle w:val="Heading2"/>
-      </w:pPr>
-      <w:bookmarkStart w:id="14" w:name="_Toc241485013"/>
-      <w:r>
-        <w:t>Le</w:t>
-      </w:r>
-      <w:r>
-        <w:t>vel design – L</w:t>
-      </w:r>
-      <w:r>
-        <w:t>yall</w:t>
-      </w:r>
-      <w:r>
-        <w:t xml:space="preserve"> McClue</w:t>
-      </w:r>
-      <w:r>
-        <w:t>:</w:t>
-      </w:r>
-      <w:bookmarkEnd w:id="14"/>
-    </w:p>
-    <w:p>
-      <w:pPr>
-        <w:rPr>
-          <w:noProof/>
-        </w:rPr>
-      </w:pPr>
-      <w:r>
-        <w:rPr>
-          <w:noProof/>
-        </w:rPr>
-        <w:t xml:space="preserve"> </w:t>
-      </w:r>
-      <w:r>
-        <w:rPr>
-          <w:noProof/>
-        </w:rPr>
-        <w:t xml:space="preserve"> </w:t>
-      </w:r>
-      <w:r>
-        <w:rPr>
-          <w:noProof/>
-        </w:rPr>
         <w:drawing>
-          <wp:inline distT="0" distB="0" distL="0" distR="0" wp14:anchorId="19581FD9" wp14:editId="64CA87D2">
-            <wp:extent cx="3038475" cy="2371725"/>
-            <wp:effectExtent l="152400" t="114300" r="123825" b="161925"/>
+          <wp:anchor distT="0" distB="0" distL="114300" distR="114300" simplePos="0" relativeHeight="251667456" behindDoc="0" locked="0" layoutInCell="1" allowOverlap="1" wp14:anchorId="19581FD9" wp14:editId="4EF0292E">
+            <wp:simplePos x="0" y="0"/>
+            <wp:positionH relativeFrom="margin">
+              <wp:align>center</wp:align>
+            </wp:positionH>
+            <wp:positionV relativeFrom="paragraph">
+              <wp:posOffset>762000</wp:posOffset>
+            </wp:positionV>
+            <wp:extent cx="3381375" cy="2639060"/>
+            <wp:effectExtent l="76200" t="76200" r="85725" b="123190"/>
+            <wp:wrapTopAndBottom/>
             <wp:docPr id="102740059" name="Picture 1"/>
             <wp:cNvGraphicFramePr>
               <a:graphicFrameLocks xmlns:a="http://schemas.openxmlformats.org/drawingml/2006/main" noChangeAspect="1"/>
@@ -2262,11 +2851,11 @@
               <a:graphicData uri="http://schemas.openxmlformats.org/drawingml/2006/picture">
                 <pic:pic xmlns:pic="http://schemas.openxmlformats.org/drawingml/2006/picture">
                   <pic:nvPicPr>
-                    <pic:cNvPr id="102740059" name="Picture 102740059"/>
+                    <pic:cNvPr id="102740059" name="Picture 1"/>
                     <pic:cNvPicPr/>
                   </pic:nvPicPr>
-                  <pic:blipFill rotWithShape="1">
-                    <a:blip r:embed="rId9">
+                  <pic:blipFill>
+                    <a:blip r:embed="rId9" cstate="print">
                       <a:extLst>
                         <a:ext uri="{BEBA8EAE-BF5A-486C-A8C5-ECC9F3942E4B}">
                           <a14:imgProps xmlns:a14="http://schemas.microsoft.com/office/drawing/2010/main">
@@ -2285,7 +2874,7 @@
                         </a:ext>
                       </a:extLst>
                     </a:blip>
-                    <a:srcRect l="12658" t="14331" r="29656" b="17049"/>
+                    <a:srcRect t="1009" b="1009"/>
                     <a:stretch>
                       <a:fillRect/>
                     </a:stretch>
@@ -2293,7 +2882,7 @@
                   <pic:spPr bwMode="auto">
                     <a:xfrm>
                       <a:off x="0" y="0"/>
-                      <a:ext cx="3045112" cy="2376905"/>
+                      <a:ext cx="3381375" cy="2639060"/>
                     </a:xfrm>
                     <a:prstGeom prst="rect">
                       <a:avLst/>
@@ -2303,9 +2892,9 @@
                         <a:shade val="85000"/>
                       </a:srgbClr>
                     </a:solidFill>
-                    <a:ln w="88900" cap="sq" cmpd="sng" algn="ctr">
+                    <a:ln w="28575" cap="sq" cmpd="sng" algn="ctr">
                       <a:solidFill>
-                        <a:srgbClr val="FFFFFF"/>
+                        <a:schemeClr val="tx1"/>
                       </a:solidFill>
                       <a:prstDash val="solid"/>
                       <a:miter lim="800000"/>
@@ -2334,18 +2923,6 @@
                         </a:srgbClr>
                       </a:outerShdw>
                     </a:effectLst>
-                    <a:scene3d>
-                      <a:camera prst="orthographicFront"/>
-                      <a:lightRig rig="twoPt" dir="t">
-                        <a:rot lat="0" lon="0" rev="7200000"/>
-                      </a:lightRig>
-                    </a:scene3d>
-                    <a:sp3d>
-                      <a:bevelT w="25400" h="19050"/>
-                      <a:contourClr>
-                        <a:srgbClr val="FFFFFF"/>
-                      </a:contourClr>
-                    </a:sp3d>
                     <a:extLst>
                       <a:ext uri="{53640926-AAD7-44D8-BBD7-CCE9431645EC}">
                         <a14:shadowObscured xmlns:a14="http://schemas.microsoft.com/office/drawing/2010/main"/>
@@ -2355,8 +2932,17 @@
                 </pic:pic>
               </a:graphicData>
             </a:graphic>
-          </wp:inline>
+          </wp:anchor>
         </w:drawing>
+      </w:r>
+      <w:r>
+        <w:t>LEVEL DESIGN</w:t>
+      </w:r>
+      <w:bookmarkEnd w:id="13"/>
+    </w:p>
+    <w:p>
+      <w:r>
+        <w:t>Written by Lyall McClue</w:t>
       </w:r>
     </w:p>
     <w:p>
@@ -2514,85 +3100,120 @@
       </w:r>
     </w:p>
     <w:p/>
-    <w:p>
-      <w:r>
-        <w:t>The Lab;</w:t>
-      </w:r>
-    </w:p>
-    <w:p>
-      <w:r>
-        <w:lastRenderedPageBreak/>
-        <w:t xml:space="preserve">The Lab is the starting place for the outbreak so it will function as starting point for the game it will hold [perk &amp; description of the perk]. The appearance of the lab will appear broken and in ruin to make the player feel emersed upon loading in the level </w:t>
-      </w:r>
-    </w:p>
     <w:p/>
-    <w:p>
-      <w:r>
-        <w:t>Village;</w:t>
-      </w:r>
-    </w:p>
-    <w:p>
-      <w:r>
-        <w:t xml:space="preserve">The village is the second area that the player will have to explore to fix the power as it will hold one of two fuses as it will be required to turn back on. The village will have the perk [perk &amp; description]. The appearance of the village will appear untouched by the outbreak at first glance upon entry but as the player moves through the environment which will get increasingly more destroyed and in ruin </w:t>
-      </w:r>
-    </w:p>
     <w:p/>
-    <w:p>
-      <w:r>
-        <w:t>Facility;</w:t>
-      </w:r>
-    </w:p>
-    <w:p>
-      <w:r>
-        <w:t xml:space="preserve">The Facility is the third area of the game and is mostly untouched and deserted as most of the staff and soldiers retreated to the village to either face and fight the undead until they succumb to their demise or to retreat to safety. The facility holds the power in the level which the player has to obtain all fuses from there dedicated areas and once both fuses are obtained the player will have to go up to the second floor of the facility where the power switch can be repaired restoring power to the level. This area has the perk [perk &amp; description]. The facility will also hold [name for the weapon machine] which will upgrade the players weapon giving it increased damage and ammo size, [name for the weapon machine] can be located in the same room as power on the second floor. </w:t>
-      </w:r>
-    </w:p>
     <w:p/>
-    <w:p>
-      <w:r>
-        <w:t>Forest;</w:t>
-      </w:r>
-    </w:p>
-    <w:p>
-      <w:r>
-        <w:t>The forest is the fourth and final area of the game that is designed to be the opposite/contrast of the death and destruction that you'll see throughout the level by being full of life and creation. This area is going to have the perk [perk &amp;description]. It will also hold one of the locations of the fuses which is required for power and progression</w:t>
-      </w:r>
-    </w:p>
     <w:p>
       <w:pPr>
         <w:pStyle w:val="Heading2"/>
       </w:pPr>
-      <w:bookmarkStart w:id="15" w:name="_Toc241485017"/>
-      <w:r>
-        <w:t>HUD</w:t>
-      </w:r>
-      <w:r>
-        <w:t>:</w:t>
+      <w:bookmarkStart w:id="14" w:name="_Toc242725351"/>
+      <w:r>
+        <w:lastRenderedPageBreak/>
+        <w:t>The Lab</w:t>
+      </w:r>
+      <w:bookmarkEnd w:id="14"/>
+    </w:p>
+    <w:p>
+      <w:r>
+        <w:t xml:space="preserve">The Lab is the starting place for the outbreak so it will function as starting point for the game it will hold [perk &amp; description of the perk]. The appearance of the lab will appear broken and in ruin to make the player feel emersed upon loading in the level </w:t>
+      </w:r>
+    </w:p>
+    <w:p/>
+    <w:p>
+      <w:pPr>
+        <w:pStyle w:val="Heading2"/>
+      </w:pPr>
+      <w:bookmarkStart w:id="15" w:name="_Toc242725352"/>
+      <w:r>
+        <w:t>Village</w:t>
       </w:r>
       <w:bookmarkEnd w:id="15"/>
     </w:p>
     <w:p>
       <w:r>
-        <w:t xml:space="preserve">Like Black ops 3 zombies, shows as minimal information as possible, with the left containing the round </w:t>
-      </w:r>
-      <w:r>
-        <w:t>counter, points</w:t>
-      </w:r>
-      <w:r>
-        <w:t>, and perks and the right the guns name and the ammo count in the current mag/reserves</w:t>
-      </w:r>
+        <w:t xml:space="preserve">The village is the second area that the player will have to explore to fix the power as it will hold one of two fuses as it will be required to turn back on. The village will have the perk [perk &amp; description]. The appearance of the village will appear untouched by the outbreak at first glance upon entry but as the player moves through the environment which will get increasingly more destroyed and in ruin </w:t>
+      </w:r>
+    </w:p>
+    <w:p/>
+    <w:p>
+      <w:pPr>
+        <w:pStyle w:val="Heading2"/>
+      </w:pPr>
+      <w:bookmarkStart w:id="16" w:name="_Toc242725353"/>
+      <w:r>
+        <w:t>Facility</w:t>
+      </w:r>
+      <w:bookmarkEnd w:id="16"/>
+    </w:p>
+    <w:p>
+      <w:r>
+        <w:t xml:space="preserve">The Facility is the third area of the game and is mostly untouched and deserted as most of the staff and soldiers retreated to the village to either face and fight the undead until they succumb to their demise or to retreat to safety. The facility holds the power in the level which the player has to obtain all fuses from there dedicated areas and once both fuses are obtained the player will have to go up to the second floor of the facility where the power switch can be repaired restoring power to the level. This area has the perk [perk &amp; description]. The facility will also hold [name for the weapon machine] which will upgrade the players weapon giving it increased damage and ammo size, [name for the weapon machine] can be located in the same room as power on the second floor. </w:t>
+      </w:r>
+    </w:p>
+    <w:p/>
+    <w:p>
+      <w:pPr>
+        <w:pStyle w:val="Heading2"/>
+      </w:pPr>
+      <w:bookmarkStart w:id="17" w:name="_Toc242725354"/>
+      <w:r>
+        <w:t>Forest</w:t>
+      </w:r>
+      <w:bookmarkEnd w:id="17"/>
+    </w:p>
+    <w:p>
+      <w:r>
+        <w:t>The forest is the fourth and final area of the game that is designed to be the opposite/contrast of the death and destruction that you'll see throughout the level by being full of life and creation. This area is going to have the perk [perk &amp;description]. It will also hold one of the locations of the fuses which is required for power and progression</w:t>
+      </w:r>
+    </w:p>
+    <w:p/>
+    <w:p/>
+    <w:p/>
+    <w:p>
+      <w:pPr>
+        <w:pStyle w:val="Heading1"/>
+      </w:pPr>
+      <w:bookmarkStart w:id="18" w:name="_Toc242725355"/>
+      <w:r>
+        <w:lastRenderedPageBreak/>
+        <w:t>USER INTERFACE</w:t>
+      </w:r>
+      <w:bookmarkEnd w:id="18"/>
+    </w:p>
+    <w:p>
+      <w:r>
+        <w:t>Written by Evan Montgomery</w:t>
+      </w:r>
+    </w:p>
+    <w:p>
+      <w:pPr>
+        <w:pStyle w:val="Heading2"/>
+      </w:pPr>
+      <w:bookmarkStart w:id="19" w:name="_Toc242725356"/>
+      <w:r>
+        <w:t>Main Menu</w:t>
+      </w:r>
+      <w:bookmarkEnd w:id="19"/>
     </w:p>
     <w:p>
       <w:r>
         <w:rPr>
           <w:noProof/>
         </w:rPr>
-        <w:lastRenderedPageBreak/>
         <w:drawing>
-          <wp:inline distT="0" distB="0" distL="0" distR="0" wp14:anchorId="61413C31" wp14:editId="2CFCDEB3">
-            <wp:extent cx="5731510" cy="3223895"/>
-            <wp:effectExtent l="0" t="0" r="2540" b="0"/>
-            <wp:docPr id="1747289620" name="Picture 2" descr="COD Zombies HUD (De)Evolution (BO3 - Vanguard Screenshots) : r/CODZombies"/>
+          <wp:anchor distT="0" distB="0" distL="114300" distR="114300" simplePos="0" relativeHeight="251660288" behindDoc="0" locked="0" layoutInCell="1" allowOverlap="1" wp14:anchorId="3DF87D0C" wp14:editId="4B6B14F9">
+            <wp:simplePos x="0" y="0"/>
+            <wp:positionH relativeFrom="margin">
+              <wp:align>center</wp:align>
+            </wp:positionH>
+            <wp:positionV relativeFrom="paragraph">
+              <wp:posOffset>1100455</wp:posOffset>
+            </wp:positionV>
+            <wp:extent cx="4893310" cy="2752725"/>
+            <wp:effectExtent l="0" t="0" r="2540" b="9525"/>
+            <wp:wrapTopAndBottom/>
+            <wp:docPr id="663949802" name="Picture 1"/>
             <wp:cNvGraphicFramePr>
               <a:graphicFrameLocks xmlns:a="http://schemas.openxmlformats.org/drawingml/2006/main" noChangeAspect="1"/>
             </wp:cNvGraphicFramePr>
@@ -2600,13 +3221,96 @@
               <a:graphicData uri="http://schemas.openxmlformats.org/drawingml/2006/picture">
                 <pic:pic xmlns:pic="http://schemas.openxmlformats.org/drawingml/2006/picture">
                   <pic:nvPicPr>
-                    <pic:cNvPr id="0" name="Picture 2" descr="COD Zombies HUD (De)Evolution (BO3 - Vanguard Screenshots) : r/CODZombies"/>
+                    <pic:cNvPr id="663949802" name="Picture 663949802"/>
+                    <pic:cNvPicPr/>
+                  </pic:nvPicPr>
+                  <pic:blipFill>
+                    <a:blip r:embed="rId11" cstate="print">
+                      <a:extLst>
+                        <a:ext uri="{28A0092B-C50C-407E-A947-70E740481C1C}">
+                          <a14:useLocalDpi xmlns:a14="http://schemas.microsoft.com/office/drawing/2010/main" val="0"/>
+                        </a:ext>
+                      </a:extLst>
+                    </a:blip>
+                    <a:stretch>
+                      <a:fillRect/>
+                    </a:stretch>
+                  </pic:blipFill>
+                  <pic:spPr>
+                    <a:xfrm>
+                      <a:off x="0" y="0"/>
+                      <a:ext cx="4893310" cy="2752725"/>
+                    </a:xfrm>
+                    <a:prstGeom prst="rect">
+                      <a:avLst/>
+                    </a:prstGeom>
+                    <a:ln>
+                      <a:noFill/>
+                    </a:ln>
+                    <a:effectLst>
+                      <a:softEdge rad="112500"/>
+                    </a:effectLst>
+                  </pic:spPr>
+                </pic:pic>
+              </a:graphicData>
+            </a:graphic>
+          </wp:anchor>
+        </w:drawing>
+      </w:r>
+      <w:r>
+        <w:t>When you open up the game, the first thing you will see is the main menu. This is the central point where you can navigate through the rest of the game. The background is of the forest level set during a sunset with the logo at the top left and buttons for their respective scenes. Below, you will find a flow chart detailing the room layout for the game.</w:t>
+      </w:r>
+    </w:p>
+    <w:p>
+      <w:r>
+        <w:t>In the background, you will occasionally see zombies walk past the screen every 5-10 seconds. It won’t be a still image, there’s noticeable wind and a glare from the light.</w:t>
+      </w:r>
+    </w:p>
+    <w:p>
+      <w:pPr>
+        <w:pStyle w:val="Heading2"/>
+      </w:pPr>
+      <w:bookmarkStart w:id="20" w:name="_Toc242725357"/>
+      <w:r>
+        <w:t>M</w:t>
+      </w:r>
+      <w:r>
+        <w:t>ultiplayer Configure</w:t>
+      </w:r>
+      <w:bookmarkEnd w:id="20"/>
+    </w:p>
+    <w:p>
+      <w:r>
+        <w:rPr>
+          <w:noProof/>
+        </w:rPr>
+        <w:drawing>
+          <wp:anchor distT="0" distB="0" distL="114300" distR="114300" simplePos="0" relativeHeight="251661312" behindDoc="0" locked="0" layoutInCell="1" allowOverlap="1" wp14:anchorId="296EDE6D" wp14:editId="5494EA0D">
+            <wp:simplePos x="0" y="0"/>
+            <wp:positionH relativeFrom="margin">
+              <wp:posOffset>2638425</wp:posOffset>
+            </wp:positionH>
+            <wp:positionV relativeFrom="paragraph">
+              <wp:posOffset>367030</wp:posOffset>
+            </wp:positionV>
+            <wp:extent cx="3386455" cy="1905000"/>
+            <wp:effectExtent l="0" t="0" r="4445" b="0"/>
+            <wp:wrapSquare wrapText="bothSides"/>
+            <wp:docPr id="1568158658" name="Picture 2" descr="How to start GTA Online Dispatch Missions | GamesRadar+"/>
+            <wp:cNvGraphicFramePr>
+              <a:graphicFrameLocks xmlns:a="http://schemas.openxmlformats.org/drawingml/2006/main" noChangeAspect="1"/>
+            </wp:cNvGraphicFramePr>
+            <a:graphic xmlns:a="http://schemas.openxmlformats.org/drawingml/2006/main">
+              <a:graphicData uri="http://schemas.openxmlformats.org/drawingml/2006/picture">
+                <pic:pic xmlns:pic="http://schemas.openxmlformats.org/drawingml/2006/picture">
+                  <pic:nvPicPr>
+                    <pic:cNvPr id="0" name="Picture 1" descr="How to start GTA Online Dispatch Missions | GamesRadar+"/>
                     <pic:cNvPicPr>
                       <a:picLocks noChangeAspect="1" noChangeArrowheads="1"/>
                     </pic:cNvPicPr>
                   </pic:nvPicPr>
                   <pic:blipFill>
-                    <a:blip r:embed="rId11">
+                    <a:blip r:embed="rId12" cstate="print">
                       <a:extLst>
                         <a:ext uri="{28A0092B-C50C-407E-A947-70E740481C1C}">
                           <a14:useLocalDpi xmlns:a14="http://schemas.microsoft.com/office/drawing/2010/main" val="0"/>
@@ -2621,30 +3325,464 @@
                   <pic:spPr bwMode="auto">
                     <a:xfrm>
                       <a:off x="0" y="0"/>
-                      <a:ext cx="5731510" cy="3223895"/>
+                      <a:ext cx="3386455" cy="1905000"/>
                     </a:xfrm>
                     <a:prstGeom prst="rect">
                       <a:avLst/>
                     </a:prstGeom>
-                    <a:noFill/>
                     <a:ln>
                       <a:noFill/>
                     </a:ln>
+                    <a:effectLst>
+                      <a:softEdge rad="112500"/>
+                    </a:effectLst>
                   </pic:spPr>
                 </pic:pic>
               </a:graphicData>
             </a:graphic>
-          </wp:inline>
+            <wp14:sizeRelH relativeFrom="margin">
+              <wp14:pctWidth>0</wp14:pctWidth>
+            </wp14:sizeRelH>
+            <wp14:sizeRelV relativeFrom="margin">
+              <wp14:pctHeight>0</wp14:pctHeight>
+            </wp14:sizeRelV>
+          </wp:anchor>
         </w:drawing>
       </w:r>
+      <w:r>
+        <w:t>When you select multiplayer, you’re taken to a screen where each player can connect their controller. The game will function as local multiplayer. When a new controller is detected, it will appear on the screen and the player can click “ready” when they</w:t>
+      </w:r>
+      <w:r>
+        <w:t>’re prepared. When all players are, a timer of 5 seconds will play with a “cancel” option, and if nobody clicks it, the game will start.</w:t>
+      </w:r>
+    </w:p>
+    <w:p>
+      <w:r>
+        <w:t>This is inspired from the mission prepare screen in Grand Theft Auto 5.</w:t>
+      </w:r>
+      <w:r>
+        <w:t xml:space="preserve"> </w:t>
+      </w:r>
+    </w:p>
+    <w:p>
+      <w:pPr>
+        <w:pStyle w:val="Heading2"/>
+      </w:pPr>
+      <w:bookmarkStart w:id="21" w:name="_Toc242725358"/>
+      <w:r>
+        <w:rPr>
+          <w:noProof/>
+        </w:rPr>
+        <w:lastRenderedPageBreak/>
+        <w:drawing>
+          <wp:anchor distT="0" distB="0" distL="114300" distR="114300" simplePos="0" relativeHeight="251662336" behindDoc="0" locked="0" layoutInCell="1" allowOverlap="1" wp14:anchorId="1DFE43A0" wp14:editId="379C3C4A">
+            <wp:simplePos x="0" y="0"/>
+            <wp:positionH relativeFrom="margin">
+              <wp:posOffset>1971675</wp:posOffset>
+            </wp:positionH>
+            <wp:positionV relativeFrom="paragraph">
+              <wp:posOffset>9525</wp:posOffset>
+            </wp:positionV>
+            <wp:extent cx="4131310" cy="2324100"/>
+            <wp:effectExtent l="0" t="0" r="2540" b="0"/>
+            <wp:wrapSquare wrapText="bothSides"/>
+            <wp:docPr id="910687046" name="Picture 3"/>
+            <wp:cNvGraphicFramePr>
+              <a:graphicFrameLocks xmlns:a="http://schemas.openxmlformats.org/drawingml/2006/main" noChangeAspect="1"/>
+            </wp:cNvGraphicFramePr>
+            <a:graphic xmlns:a="http://schemas.openxmlformats.org/drawingml/2006/main">
+              <a:graphicData uri="http://schemas.openxmlformats.org/drawingml/2006/picture">
+                <pic:pic xmlns:pic="http://schemas.openxmlformats.org/drawingml/2006/picture">
+                  <pic:nvPicPr>
+                    <pic:cNvPr id="910687046" name="Picture 3"/>
+                    <pic:cNvPicPr/>
+                  </pic:nvPicPr>
+                  <pic:blipFill>
+                    <a:blip r:embed="rId13" cstate="print">
+                      <a:extLst>
+                        <a:ext uri="{28A0092B-C50C-407E-A947-70E740481C1C}">
+                          <a14:useLocalDpi xmlns:a14="http://schemas.microsoft.com/office/drawing/2010/main" val="0"/>
+                        </a:ext>
+                      </a:extLst>
+                    </a:blip>
+                    <a:stretch>
+                      <a:fillRect/>
+                    </a:stretch>
+                  </pic:blipFill>
+                  <pic:spPr>
+                    <a:xfrm>
+                      <a:off x="0" y="0"/>
+                      <a:ext cx="4131310" cy="2324100"/>
+                    </a:xfrm>
+                    <a:prstGeom prst="rect">
+                      <a:avLst/>
+                    </a:prstGeom>
+                    <a:ln>
+                      <a:noFill/>
+                    </a:ln>
+                    <a:effectLst>
+                      <a:softEdge rad="112500"/>
+                    </a:effectLst>
+                  </pic:spPr>
+                </pic:pic>
+              </a:graphicData>
+            </a:graphic>
+            <wp14:sizeRelH relativeFrom="margin">
+              <wp14:pctWidth>0</wp14:pctWidth>
+            </wp14:sizeRelH>
+            <wp14:sizeRelV relativeFrom="margin">
+              <wp14:pctHeight>0</wp14:pctHeight>
+            </wp14:sizeRelV>
+          </wp:anchor>
+        </w:drawing>
+      </w:r>
+      <w:r>
+        <w:t>Settings</w:t>
+      </w:r>
+      <w:bookmarkEnd w:id="21"/>
+    </w:p>
+    <w:p>
+      <w:r>
+        <w:t>In the settings menu, you will find options for the in-game volume such as sound effects and music, and a sensitivity adjuster. To return to the main menu, press the respective button</w:t>
+      </w:r>
+      <w:r>
+        <w:t>.</w:t>
+      </w:r>
+    </w:p>
+    <w:p>
+      <w:pPr>
+        <w:pStyle w:val="Heading2"/>
+      </w:pPr>
+      <w:bookmarkStart w:id="22" w:name="_Toc242725359"/>
+      <w:r>
+        <w:t>Credits</w:t>
+      </w:r>
+      <w:bookmarkEnd w:id="22"/>
+    </w:p>
+    <w:p>
+      <w:r>
+        <w:rPr>
+          <w:noProof/>
+        </w:rPr>
+        <w:drawing>
+          <wp:anchor distT="0" distB="0" distL="114300" distR="114300" simplePos="0" relativeHeight="251664384" behindDoc="0" locked="0" layoutInCell="1" allowOverlap="1" wp14:anchorId="7CE8DB8D" wp14:editId="4EDD8B1D">
+            <wp:simplePos x="0" y="0"/>
+            <wp:positionH relativeFrom="margin">
+              <wp:posOffset>-296545</wp:posOffset>
+            </wp:positionH>
+            <wp:positionV relativeFrom="paragraph">
+              <wp:posOffset>139065</wp:posOffset>
+            </wp:positionV>
+            <wp:extent cx="4133625" cy="2325600"/>
+            <wp:effectExtent l="0" t="0" r="635" b="0"/>
+            <wp:wrapSquare wrapText="bothSides"/>
+            <wp:docPr id="1272814986" name="Picture 3"/>
+            <wp:cNvGraphicFramePr>
+              <a:graphicFrameLocks xmlns:a="http://schemas.openxmlformats.org/drawingml/2006/main" noChangeAspect="1"/>
+            </wp:cNvGraphicFramePr>
+            <a:graphic xmlns:a="http://schemas.openxmlformats.org/drawingml/2006/main">
+              <a:graphicData uri="http://schemas.openxmlformats.org/drawingml/2006/picture">
+                <pic:pic xmlns:pic="http://schemas.openxmlformats.org/drawingml/2006/picture">
+                  <pic:nvPicPr>
+                    <pic:cNvPr id="1272814986" name="Picture 3"/>
+                    <pic:cNvPicPr/>
+                  </pic:nvPicPr>
+                  <pic:blipFill>
+                    <a:blip r:embed="rId14" cstate="print">
+                      <a:extLst>
+                        <a:ext uri="{28A0092B-C50C-407E-A947-70E740481C1C}">
+                          <a14:useLocalDpi xmlns:a14="http://schemas.microsoft.com/office/drawing/2010/main" val="0"/>
+                        </a:ext>
+                      </a:extLst>
+                    </a:blip>
+                    <a:stretch>
+                      <a:fillRect/>
+                    </a:stretch>
+                  </pic:blipFill>
+                  <pic:spPr>
+                    <a:xfrm>
+                      <a:off x="0" y="0"/>
+                      <a:ext cx="4133625" cy="2325600"/>
+                    </a:xfrm>
+                    <a:prstGeom prst="rect">
+                      <a:avLst/>
+                    </a:prstGeom>
+                    <a:ln>
+                      <a:noFill/>
+                    </a:ln>
+                    <a:effectLst>
+                      <a:softEdge rad="112500"/>
+                    </a:effectLst>
+                  </pic:spPr>
+                </pic:pic>
+              </a:graphicData>
+            </a:graphic>
+            <wp14:sizeRelH relativeFrom="margin">
+              <wp14:pctWidth>0</wp14:pctWidth>
+            </wp14:sizeRelH>
+            <wp14:sizeRelV relativeFrom="margin">
+              <wp14:pctHeight>0</wp14:pctHeight>
+            </wp14:sizeRelV>
+          </wp:anchor>
+        </w:drawing>
+      </w:r>
+      <w:r>
+        <w:t>In the credits menu, you will find the details of everyone who worked on the game. Everyone involved with Oddform Unlimited, but also the details of every 3</w:t>
+      </w:r>
+      <w:r>
+        <w:rPr>
+          <w:vertAlign w:val="superscript"/>
+        </w:rPr>
+        <w:t>rd</w:t>
+      </w:r>
+      <w:r>
+        <w:t xml:space="preserve"> party asset creator, such as for the 3D models, the music and others.</w:t>
+      </w:r>
+      <w:r>
+        <w:t xml:space="preserve"> </w:t>
+      </w:r>
+      <w:r>
+        <w:t>To return to the main menu, press the respective button</w:t>
+      </w:r>
+      <w:r>
+        <w:t>.</w:t>
+      </w:r>
+    </w:p>
+    <w:p>
+      <w:pPr>
+        <w:pStyle w:val="Heading2"/>
+      </w:pPr>
+      <w:bookmarkStart w:id="23" w:name="_Toc242725360"/>
+      <w:r>
+        <w:t>In-game HUD</w:t>
+      </w:r>
+      <w:bookmarkEnd w:id="23"/>
+    </w:p>
+    <w:p>
+      <w:r>
+        <w:t>When you’re in the game, you will see the details on screen for the player health and ammo, the points collected, what round it is, the weapon name, and any perks collected.</w:t>
+      </w:r>
+    </w:p>
+    <w:p>
+      <w:r>
+        <w:rPr>
+          <w:noProof/>
+        </w:rPr>
+        <w:drawing>
+          <wp:anchor distT="0" distB="0" distL="114300" distR="114300" simplePos="0" relativeHeight="251665408" behindDoc="0" locked="0" layoutInCell="1" allowOverlap="1" wp14:anchorId="4B64AC71" wp14:editId="092F333A">
+            <wp:simplePos x="0" y="0"/>
+            <wp:positionH relativeFrom="margin">
+              <wp:align>center</wp:align>
+            </wp:positionH>
+            <wp:positionV relativeFrom="paragraph">
+              <wp:posOffset>478155</wp:posOffset>
+            </wp:positionV>
+            <wp:extent cx="3886835" cy="2186305"/>
+            <wp:effectExtent l="0" t="0" r="0" b="4445"/>
+            <wp:wrapTopAndBottom/>
+            <wp:docPr id="348570462" name="Picture 4" descr="CDN media"/>
+            <wp:cNvGraphicFramePr>
+              <a:graphicFrameLocks xmlns:a="http://schemas.openxmlformats.org/drawingml/2006/main" noChangeAspect="1"/>
+            </wp:cNvGraphicFramePr>
+            <a:graphic xmlns:a="http://schemas.openxmlformats.org/drawingml/2006/main">
+              <a:graphicData uri="http://schemas.openxmlformats.org/drawingml/2006/picture">
+                <pic:pic xmlns:pic="http://schemas.openxmlformats.org/drawingml/2006/picture">
+                  <pic:nvPicPr>
+                    <pic:cNvPr id="0" name="Picture 3" descr="CDN media"/>
+                    <pic:cNvPicPr>
+                      <a:picLocks noChangeAspect="1" noChangeArrowheads="1"/>
+                    </pic:cNvPicPr>
+                  </pic:nvPicPr>
+                  <pic:blipFill>
+                    <a:blip r:embed="rId15" cstate="print">
+                      <a:extLst>
+                        <a:ext uri="{28A0092B-C50C-407E-A947-70E740481C1C}">
+                          <a14:useLocalDpi xmlns:a14="http://schemas.microsoft.com/office/drawing/2010/main" val="0"/>
+                        </a:ext>
+                      </a:extLst>
+                    </a:blip>
+                    <a:srcRect/>
+                    <a:stretch>
+                      <a:fillRect/>
+                    </a:stretch>
+                  </pic:blipFill>
+                  <pic:spPr bwMode="auto">
+                    <a:xfrm>
+                      <a:off x="0" y="0"/>
+                      <a:ext cx="3886835" cy="2186305"/>
+                    </a:xfrm>
+                    <a:prstGeom prst="rect">
+                      <a:avLst/>
+                    </a:prstGeom>
+                    <a:ln>
+                      <a:noFill/>
+                    </a:ln>
+                    <a:effectLst>
+                      <a:softEdge rad="112500"/>
+                    </a:effectLst>
+                  </pic:spPr>
+                </pic:pic>
+              </a:graphicData>
+            </a:graphic>
+            <wp14:sizeRelH relativeFrom="margin">
+              <wp14:pctWidth>0</wp14:pctWidth>
+            </wp14:sizeRelH>
+            <wp14:sizeRelV relativeFrom="margin">
+              <wp14:pctHeight>0</wp14:pctHeight>
+            </wp14:sizeRelV>
+          </wp:anchor>
+        </w:drawing>
+      </w:r>
+      <w:r>
+        <w:t>The HUD will remain mostly on the bottom half of the screen with details like the round count being at the top right.</w:t>
+      </w:r>
+    </w:p>
+    <w:p>
+      <w:pPr>
+        <w:pStyle w:val="Heading2"/>
+      </w:pPr>
+      <w:bookmarkStart w:id="24" w:name="_Toc242725361"/>
+      <w:r>
+        <w:lastRenderedPageBreak/>
+        <w:t>Pause Screen</w:t>
+      </w:r>
+      <w:bookmarkEnd w:id="24"/>
+    </w:p>
+    <w:p>
+      <w:r>
+        <w:t>When you enter the pause screen, if you’re on singleplayer, the gameplay will stop. If in multiplayer, the gameplay will resume in the background. You can either resume the game, return to the menu, or close the game altogether.</w:t>
+      </w:r>
+      <w:r>
+        <w:t xml:space="preserve"> All of which you click the button with the same label.</w:t>
+      </w:r>
+    </w:p>
+    <w:p>
+      <w:pPr>
+        <w:pStyle w:val="Heading2"/>
+      </w:pPr>
+      <w:bookmarkStart w:id="25" w:name="_Toc242725362"/>
+      <w:r>
+        <w:t>Game Over</w:t>
+      </w:r>
+      <w:bookmarkEnd w:id="25"/>
+    </w:p>
+    <w:p>
+      <w:r>
+        <w:t>The credits scene will differ by the way you end the game. If you’re killed by a zombie, you unlock the bad ending. If you survive all the rounds, you unlock the good ending. In multiplayer, if only some survive, you unlock the sad ending.</w:t>
+      </w:r>
+    </w:p>
+    <w:p>
+      <w:r>
+        <w:t>With each one, the title and the subtitle will change.</w:t>
+      </w:r>
+    </w:p>
+    <w:p>
+      <w:r>
+        <w:t>THE GOOD ENDING: You succesfully found the cure and escaped in time.</w:t>
+      </w:r>
+    </w:p>
+    <w:p>
+      <w:r>
+        <w:t>THE BAD ENDING: You failed to stop the virus… and it is spreading rapidly.</w:t>
+      </w:r>
+    </w:p>
+    <w:p>
+      <w:r>
+        <w:t>THE SAD ENDING: You successfully found the cure and escaped… but we can’t say the same about your fellow men…</w:t>
+      </w:r>
+    </w:p>
+    <w:p>
+      <w:r>
+        <w:t>With each ending you unlock, a star will appear in the main menu.</w:t>
+      </w:r>
+    </w:p>
+    <w:p>
+      <w:pPr>
+        <w:pStyle w:val="Heading2"/>
+      </w:pPr>
+      <w:bookmarkStart w:id="26" w:name="_Toc242725363"/>
+      <w:r>
+        <w:t>Flow Chart</w:t>
+      </w:r>
+      <w:bookmarkEnd w:id="26"/>
+    </w:p>
+    <w:p>
+      <w:r>
+        <w:t>Here, you will find a detailed flow chart explaining the layout of the gameplay.</w:t>
+      </w:r>
+    </w:p>
+    <w:p>
+      <w:r>
+        <w:drawing>
+          <wp:anchor distT="0" distB="0" distL="114300" distR="114300" simplePos="0" relativeHeight="251666432" behindDoc="0" locked="0" layoutInCell="1" allowOverlap="1" wp14:anchorId="0DF0FE4D" wp14:editId="584B5E62">
+            <wp:simplePos x="0" y="0"/>
+            <wp:positionH relativeFrom="margin">
+              <wp:align>center</wp:align>
+            </wp:positionH>
+            <wp:positionV relativeFrom="paragraph">
+              <wp:posOffset>64770</wp:posOffset>
+            </wp:positionV>
+            <wp:extent cx="4476750" cy="3451225"/>
+            <wp:effectExtent l="0" t="0" r="0" b="0"/>
+            <wp:wrapSquare wrapText="bothSides"/>
+            <wp:docPr id="701748278" name="Picture 1"/>
+            <wp:cNvGraphicFramePr>
+              <a:graphicFrameLocks xmlns:a="http://schemas.openxmlformats.org/drawingml/2006/main" noChangeAspect="1"/>
+            </wp:cNvGraphicFramePr>
+            <a:graphic xmlns:a="http://schemas.openxmlformats.org/drawingml/2006/main">
+              <a:graphicData uri="http://schemas.openxmlformats.org/drawingml/2006/picture">
+                <pic:pic xmlns:pic="http://schemas.openxmlformats.org/drawingml/2006/picture">
+                  <pic:nvPicPr>
+                    <pic:cNvPr id="701748278" name=""/>
+                    <pic:cNvPicPr/>
+                  </pic:nvPicPr>
+                  <pic:blipFill>
+                    <a:blip r:embed="rId16">
+                      <a:extLst>
+                        <a:ext uri="{28A0092B-C50C-407E-A947-70E740481C1C}">
+                          <a14:useLocalDpi xmlns:a14="http://schemas.microsoft.com/office/drawing/2010/main" val="0"/>
+                        </a:ext>
+                      </a:extLst>
+                    </a:blip>
+                    <a:stretch>
+                      <a:fillRect/>
+                    </a:stretch>
+                  </pic:blipFill>
+                  <pic:spPr>
+                    <a:xfrm>
+                      <a:off x="0" y="0"/>
+                      <a:ext cx="4476750" cy="3451225"/>
+                    </a:xfrm>
+                    <a:prstGeom prst="rect">
+                      <a:avLst/>
+                    </a:prstGeom>
+                    <a:ln>
+                      <a:noFill/>
+                    </a:ln>
+                    <a:effectLst>
+                      <a:softEdge rad="112500"/>
+                    </a:effectLst>
+                  </pic:spPr>
+                </pic:pic>
+              </a:graphicData>
+            </a:graphic>
+            <wp14:sizeRelH relativeFrom="margin">
+              <wp14:pctWidth>0</wp14:pctWidth>
+            </wp14:sizeRelH>
+            <wp14:sizeRelV relativeFrom="margin">
+              <wp14:pctHeight>0</wp14:pctHeight>
+            </wp14:sizeRelV>
+          </wp:anchor>
+        </w:drawing>
+      </w:r>
     </w:p>
     <w:sectPr>
-      <w:headerReference w:type="even" r:id="rId12"/>
-      <w:headerReference w:type="default" r:id="rId13"/>
-      <w:footerReference w:type="even" r:id="rId14"/>
-      <w:footerReference w:type="default" r:id="rId15"/>
-      <w:headerReference w:type="first" r:id="rId16"/>
-      <w:footerReference w:type="first" r:id="rId17"/>
+      <w:headerReference w:type="even" r:id="rId17"/>
+      <w:headerReference w:type="default" r:id="rId18"/>
+      <w:footerReference w:type="even" r:id="rId19"/>
+      <w:footerReference w:type="default" r:id="rId20"/>
+      <w:headerReference w:type="first" r:id="rId21"/>
+      <w:footerReference w:type="first" r:id="rId22"/>
       <w:pgSz w:w="11906" w:h="16838"/>
       <w:pgMar w:top="1440" w:right="1440" w:bottom="1440" w:left="1440" w:header="708" w:footer="708" w:gutter="0"/>
       <w:pgBorders w:offsetFrom="page">
@@ -3182,7 +4320,7 @@
     <w:link w:val="Heading1Char"/>
     <w:uiPriority w:val="9"/>
     <w:qFormat/>
-    <w:rsid w:val="00B90069"/>
+    <w:rsid w:val="001D06EE"/>
     <w:pPr>
       <w:keepNext/>
       <w:keepLines/>
@@ -3195,7 +4333,6 @@
     </w:pPr>
     <w:rPr>
       <w:rFonts w:ascii="Impact" w:eastAsiaTheme="majorEastAsia" w:hAnsi="Impact" w:cstheme="majorBidi"/>
-      <w:b/>
       <w:color w:val="B40000"/>
       <w:sz w:val="40"/>
       <w:szCs w:val="40"/>
@@ -3409,10 +4546,9 @@
     <w:basedOn w:val="DefaultParagraphFont"/>
     <w:link w:val="Heading1"/>
     <w:uiPriority w:val="9"/>
-    <w:rsid w:val="00B90069"/>
+    <w:rsid w:val="001D06EE"/>
     <w:rPr>
       <w:rFonts w:ascii="Impact" w:eastAsiaTheme="majorEastAsia" w:hAnsi="Impact" w:cstheme="majorBidi"/>
-      <w:b/>
       <w:color w:val="B40000"/>
       <w:sz w:val="40"/>
       <w:szCs w:val="40"/>

</xml_diff>

<commit_message>
Update weapon section of GDD
This commit updates the weapon section of the GDD so that it reflects the accurate weapon information
</commit_message>
<xml_diff>
--- a/Project Necrosis GDD - Oddform Unlimited.docx
+++ b/Project Necrosis GDD - Oddform Unlimited.docx
@@ -201,7 +201,7 @@
           <w:r>
             <w:fldChar w:fldCharType="separate"/>
           </w:r>
-          <w:hyperlink w:anchor="_Toc242725337" w:history="1">
+          <w:hyperlink w:anchor="_Toc242833003" w:history="1">
             <w:r>
               <w:rPr>
                 <w:rStyle w:val="Hyperlink"/>
@@ -228,7 +228,7 @@
                 <w:noProof/>
                 <w:webHidden/>
               </w:rPr>
-              <w:instrText xml:space="preserve"> PAGEREF _Toc242725337 \h </w:instrText>
+              <w:instrText xml:space="preserve"> PAGEREF _Toc242833003 \h </w:instrText>
             </w:r>
             <w:r>
               <w:rPr>
@@ -271,7 +271,7 @@
               <w:lang w:eastAsia="en-GB"/>
             </w:rPr>
           </w:pPr>
-          <w:hyperlink w:anchor="_Toc242725338" w:history="1">
+          <w:hyperlink w:anchor="_Toc242833004" w:history="1">
             <w:r>
               <w:rPr>
                 <w:rStyle w:val="Hyperlink"/>
@@ -298,7 +298,7 @@
                 <w:noProof/>
                 <w:webHidden/>
               </w:rPr>
-              <w:instrText xml:space="preserve"> PAGEREF _Toc242725338 \h </w:instrText>
+              <w:instrText xml:space="preserve"> PAGEREF _Toc242833004 \h </w:instrText>
             </w:r>
             <w:r>
               <w:rPr>
@@ -341,7 +341,7 @@
               <w:lang w:eastAsia="en-GB"/>
             </w:rPr>
           </w:pPr>
-          <w:hyperlink w:anchor="_Toc242725339" w:history="1">
+          <w:hyperlink w:anchor="_Toc242833005" w:history="1">
             <w:r>
               <w:rPr>
                 <w:rStyle w:val="Hyperlink"/>
@@ -368,7 +368,7 @@
                 <w:noProof/>
                 <w:webHidden/>
               </w:rPr>
-              <w:instrText xml:space="preserve"> PAGEREF _Toc242725339 \h </w:instrText>
+              <w:instrText xml:space="preserve"> PAGEREF _Toc242833005 \h </w:instrText>
             </w:r>
             <w:r>
               <w:rPr>
@@ -411,7 +411,7 @@
               <w:lang w:eastAsia="en-GB"/>
             </w:rPr>
           </w:pPr>
-          <w:hyperlink w:anchor="_Toc242725340" w:history="1">
+          <w:hyperlink w:anchor="_Toc242833006" w:history="1">
             <w:r>
               <w:rPr>
                 <w:rStyle w:val="Hyperlink"/>
@@ -438,7 +438,7 @@
                 <w:noProof/>
                 <w:webHidden/>
               </w:rPr>
-              <w:instrText xml:space="preserve"> PAGEREF _Toc242725340 \h </w:instrText>
+              <w:instrText xml:space="preserve"> PAGEREF _Toc242833006 \h </w:instrText>
             </w:r>
             <w:r>
               <w:rPr>
@@ -481,7 +481,7 @@
               <w:lang w:eastAsia="en-GB"/>
             </w:rPr>
           </w:pPr>
-          <w:hyperlink w:anchor="_Toc242725341" w:history="1">
+          <w:hyperlink w:anchor="_Toc242833007" w:history="1">
             <w:r>
               <w:rPr>
                 <w:rStyle w:val="Hyperlink"/>
@@ -508,7 +508,7 @@
                 <w:noProof/>
                 <w:webHidden/>
               </w:rPr>
-              <w:instrText xml:space="preserve"> PAGEREF _Toc242725341 \h </w:instrText>
+              <w:instrText xml:space="preserve"> PAGEREF _Toc242833007 \h </w:instrText>
             </w:r>
             <w:r>
               <w:rPr>
@@ -551,7 +551,7 @@
               <w:lang w:eastAsia="en-GB"/>
             </w:rPr>
           </w:pPr>
-          <w:hyperlink w:anchor="_Toc242725342" w:history="1">
+          <w:hyperlink w:anchor="_Toc242833008" w:history="1">
             <w:r>
               <w:rPr>
                 <w:rStyle w:val="Hyperlink"/>
@@ -578,7 +578,7 @@
                 <w:noProof/>
                 <w:webHidden/>
               </w:rPr>
-              <w:instrText xml:space="preserve"> PAGEREF _Toc242725342 \h </w:instrText>
+              <w:instrText xml:space="preserve"> PAGEREF _Toc242833008 \h </w:instrText>
             </w:r>
             <w:r>
               <w:rPr>
@@ -621,7 +621,7 @@
               <w:lang w:eastAsia="en-GB"/>
             </w:rPr>
           </w:pPr>
-          <w:hyperlink w:anchor="_Toc242725343" w:history="1">
+          <w:hyperlink w:anchor="_Toc242833009" w:history="1">
             <w:r>
               <w:rPr>
                 <w:rStyle w:val="Hyperlink"/>
@@ -648,7 +648,7 @@
                 <w:noProof/>
                 <w:webHidden/>
               </w:rPr>
-              <w:instrText xml:space="preserve"> PAGEREF _Toc242725343 \h </w:instrText>
+              <w:instrText xml:space="preserve"> PAGEREF _Toc242833009 \h </w:instrText>
             </w:r>
             <w:r>
               <w:rPr>
@@ -691,7 +691,7 @@
               <w:lang w:eastAsia="en-GB"/>
             </w:rPr>
           </w:pPr>
-          <w:hyperlink w:anchor="_Toc242725344" w:history="1">
+          <w:hyperlink w:anchor="_Toc242833010" w:history="1">
             <w:r>
               <w:rPr>
                 <w:rStyle w:val="Hyperlink"/>
@@ -718,7 +718,7 @@
                 <w:noProof/>
                 <w:webHidden/>
               </w:rPr>
-              <w:instrText xml:space="preserve"> PAGEREF _Toc242725344 \h </w:instrText>
+              <w:instrText xml:space="preserve"> PAGEREF _Toc242833010 \h </w:instrText>
             </w:r>
             <w:r>
               <w:rPr>
@@ -761,7 +761,7 @@
               <w:lang w:eastAsia="en-GB"/>
             </w:rPr>
           </w:pPr>
-          <w:hyperlink w:anchor="_Toc242725345" w:history="1">
+          <w:hyperlink w:anchor="_Toc242833011" w:history="1">
             <w:r>
               <w:rPr>
                 <w:rStyle w:val="Hyperlink"/>
@@ -788,7 +788,7 @@
                 <w:noProof/>
                 <w:webHidden/>
               </w:rPr>
-              <w:instrText xml:space="preserve"> PAGEREF _Toc242725345 \h </w:instrText>
+              <w:instrText xml:space="preserve"> PAGEREF _Toc242833011 \h </w:instrText>
             </w:r>
             <w:r>
               <w:rPr>
@@ -831,7 +831,7 @@
               <w:lang w:eastAsia="en-GB"/>
             </w:rPr>
           </w:pPr>
-          <w:hyperlink w:anchor="_Toc242725346" w:history="1">
+          <w:hyperlink w:anchor="_Toc242833012" w:history="1">
             <w:r>
               <w:rPr>
                 <w:rStyle w:val="Hyperlink"/>
@@ -858,7 +858,7 @@
                 <w:noProof/>
                 <w:webHidden/>
               </w:rPr>
-              <w:instrText xml:space="preserve"> PAGEREF _Toc242725346 \h </w:instrText>
+              <w:instrText xml:space="preserve"> PAGEREF _Toc242833012 \h </w:instrText>
             </w:r>
             <w:r>
               <w:rPr>
@@ -901,7 +901,7 @@
               <w:lang w:eastAsia="en-GB"/>
             </w:rPr>
           </w:pPr>
-          <w:hyperlink w:anchor="_Toc242725347" w:history="1">
+          <w:hyperlink w:anchor="_Toc242833013" w:history="1">
             <w:r>
               <w:rPr>
                 <w:rStyle w:val="Hyperlink"/>
@@ -928,7 +928,7 @@
                 <w:noProof/>
                 <w:webHidden/>
               </w:rPr>
-              <w:instrText xml:space="preserve"> PAGEREF _Toc242725347 \h </w:instrText>
+              <w:instrText xml:space="preserve"> PAGEREF _Toc242833013 \h </w:instrText>
             </w:r>
             <w:r>
               <w:rPr>
@@ -971,7 +971,7 @@
               <w:lang w:eastAsia="en-GB"/>
             </w:rPr>
           </w:pPr>
-          <w:hyperlink w:anchor="_Toc242725348" w:history="1">
+          <w:hyperlink w:anchor="_Toc242833014" w:history="1">
             <w:r>
               <w:rPr>
                 <w:rStyle w:val="Hyperlink"/>
@@ -998,7 +998,7 @@
                 <w:noProof/>
                 <w:webHidden/>
               </w:rPr>
-              <w:instrText xml:space="preserve"> PAGEREF _Toc242725348 \h </w:instrText>
+              <w:instrText xml:space="preserve"> PAGEREF _Toc242833014 \h </w:instrText>
             </w:r>
             <w:r>
               <w:rPr>
@@ -1018,7 +1018,7 @@
                 <w:noProof/>
                 <w:webHidden/>
               </w:rPr>
-              <w:t>6</w:t>
+              <w:t>7</w:t>
             </w:r>
             <w:r>
               <w:rPr>
@@ -1041,13 +1041,13 @@
               <w:lang w:eastAsia="en-GB"/>
             </w:rPr>
           </w:pPr>
-          <w:hyperlink w:anchor="_Toc242725349" w:history="1">
+          <w:hyperlink w:anchor="_Toc242833015" w:history="1">
             <w:r>
               <w:rPr>
                 <w:rStyle w:val="Hyperlink"/>
                 <w:noProof/>
               </w:rPr>
-              <w:t>Firearms</w:t>
+              <w:t>Weapons</w:t>
             </w:r>
             <w:r>
               <w:rPr>
@@ -1068,7 +1068,7 @@
                 <w:noProof/>
                 <w:webHidden/>
               </w:rPr>
-              <w:instrText xml:space="preserve"> PAGEREF _Toc242725349 \h </w:instrText>
+              <w:instrText xml:space="preserve"> PAGEREF _Toc242833015 \h </w:instrText>
             </w:r>
             <w:r>
               <w:rPr>
@@ -1111,7 +1111,7 @@
               <w:lang w:eastAsia="en-GB"/>
             </w:rPr>
           </w:pPr>
-          <w:hyperlink w:anchor="_Toc242725350" w:history="1">
+          <w:hyperlink w:anchor="_Toc242833016" w:history="1">
             <w:r>
               <w:rPr>
                 <w:rStyle w:val="Hyperlink"/>
@@ -1138,7 +1138,7 @@
                 <w:noProof/>
                 <w:webHidden/>
               </w:rPr>
-              <w:instrText xml:space="preserve"> PAGEREF _Toc242725350 \h </w:instrText>
+              <w:instrText xml:space="preserve"> PAGEREF _Toc242833016 \h </w:instrText>
             </w:r>
             <w:r>
               <w:rPr>
@@ -1181,7 +1181,7 @@
               <w:lang w:eastAsia="en-GB"/>
             </w:rPr>
           </w:pPr>
-          <w:hyperlink w:anchor="_Toc242725351" w:history="1">
+          <w:hyperlink w:anchor="_Toc242833017" w:history="1">
             <w:r>
               <w:rPr>
                 <w:rStyle w:val="Hyperlink"/>
@@ -1208,7 +1208,7 @@
                 <w:noProof/>
                 <w:webHidden/>
               </w:rPr>
-              <w:instrText xml:space="preserve"> PAGEREF _Toc242725351 \h </w:instrText>
+              <w:instrText xml:space="preserve"> PAGEREF _Toc242833017 \h </w:instrText>
             </w:r>
             <w:r>
               <w:rPr>
@@ -1251,7 +1251,7 @@
               <w:lang w:eastAsia="en-GB"/>
             </w:rPr>
           </w:pPr>
-          <w:hyperlink w:anchor="_Toc242725352" w:history="1">
+          <w:hyperlink w:anchor="_Toc242833018" w:history="1">
             <w:r>
               <w:rPr>
                 <w:rStyle w:val="Hyperlink"/>
@@ -1278,7 +1278,7 @@
                 <w:noProof/>
                 <w:webHidden/>
               </w:rPr>
-              <w:instrText xml:space="preserve"> PAGEREF _Toc242725352 \h </w:instrText>
+              <w:instrText xml:space="preserve"> PAGEREF _Toc242833018 \h </w:instrText>
             </w:r>
             <w:r>
               <w:rPr>
@@ -1321,7 +1321,7 @@
               <w:lang w:eastAsia="en-GB"/>
             </w:rPr>
           </w:pPr>
-          <w:hyperlink w:anchor="_Toc242725353" w:history="1">
+          <w:hyperlink w:anchor="_Toc242833019" w:history="1">
             <w:r>
               <w:rPr>
                 <w:rStyle w:val="Hyperlink"/>
@@ -1348,7 +1348,7 @@
                 <w:noProof/>
                 <w:webHidden/>
               </w:rPr>
-              <w:instrText xml:space="preserve"> PAGEREF _Toc242725353 \h </w:instrText>
+              <w:instrText xml:space="preserve"> PAGEREF _Toc242833019 \h </w:instrText>
             </w:r>
             <w:r>
               <w:rPr>
@@ -1368,7 +1368,7 @@
                 <w:noProof/>
                 <w:webHidden/>
               </w:rPr>
-              <w:t>9</w:t>
+              <w:t>10</w:t>
             </w:r>
             <w:r>
               <w:rPr>
@@ -1391,7 +1391,7 @@
               <w:lang w:eastAsia="en-GB"/>
             </w:rPr>
           </w:pPr>
-          <w:hyperlink w:anchor="_Toc242725354" w:history="1">
+          <w:hyperlink w:anchor="_Toc242833020" w:history="1">
             <w:r>
               <w:rPr>
                 <w:rStyle w:val="Hyperlink"/>
@@ -1418,7 +1418,7 @@
                 <w:noProof/>
                 <w:webHidden/>
               </w:rPr>
-              <w:instrText xml:space="preserve"> PAGEREF _Toc242725354 \h </w:instrText>
+              <w:instrText xml:space="preserve"> PAGEREF _Toc242833020 \h </w:instrText>
             </w:r>
             <w:r>
               <w:rPr>
@@ -1438,7 +1438,7 @@
                 <w:noProof/>
                 <w:webHidden/>
               </w:rPr>
-              <w:t>9</w:t>
+              <w:t>10</w:t>
             </w:r>
             <w:r>
               <w:rPr>
@@ -1461,7 +1461,7 @@
               <w:lang w:eastAsia="en-GB"/>
             </w:rPr>
           </w:pPr>
-          <w:hyperlink w:anchor="_Toc242725355" w:history="1">
+          <w:hyperlink w:anchor="_Toc242833021" w:history="1">
             <w:r>
               <w:rPr>
                 <w:rStyle w:val="Hyperlink"/>
@@ -1488,7 +1488,7 @@
                 <w:noProof/>
                 <w:webHidden/>
               </w:rPr>
-              <w:instrText xml:space="preserve"> PAGEREF _Toc242725355 \h </w:instrText>
+              <w:instrText xml:space="preserve"> PAGEREF _Toc242833021 \h </w:instrText>
             </w:r>
             <w:r>
               <w:rPr>
@@ -1531,7 +1531,7 @@
               <w:lang w:eastAsia="en-GB"/>
             </w:rPr>
           </w:pPr>
-          <w:hyperlink w:anchor="_Toc242725356" w:history="1">
+          <w:hyperlink w:anchor="_Toc242833022" w:history="1">
             <w:r>
               <w:rPr>
                 <w:rStyle w:val="Hyperlink"/>
@@ -1558,7 +1558,7 @@
                 <w:noProof/>
                 <w:webHidden/>
               </w:rPr>
-              <w:instrText xml:space="preserve"> PAGEREF _Toc242725356 \h </w:instrText>
+              <w:instrText xml:space="preserve"> PAGEREF _Toc242833022 \h </w:instrText>
             </w:r>
             <w:r>
               <w:rPr>
@@ -1578,7 +1578,7 @@
                 <w:noProof/>
                 <w:webHidden/>
               </w:rPr>
-              <w:t>10</w:t>
+              <w:t>11</w:t>
             </w:r>
             <w:r>
               <w:rPr>
@@ -1601,7 +1601,7 @@
               <w:lang w:eastAsia="en-GB"/>
             </w:rPr>
           </w:pPr>
-          <w:hyperlink w:anchor="_Toc242725357" w:history="1">
+          <w:hyperlink w:anchor="_Toc242833023" w:history="1">
             <w:r>
               <w:rPr>
                 <w:rStyle w:val="Hyperlink"/>
@@ -1628,7 +1628,7 @@
                 <w:noProof/>
                 <w:webHidden/>
               </w:rPr>
-              <w:instrText xml:space="preserve"> PAGEREF _Toc242725357 \h </w:instrText>
+              <w:instrText xml:space="preserve"> PAGEREF _Toc242833023 \h </w:instrText>
             </w:r>
             <w:r>
               <w:rPr>
@@ -1648,7 +1648,7 @@
                 <w:noProof/>
                 <w:webHidden/>
               </w:rPr>
-              <w:t>10</w:t>
+              <w:t>11</w:t>
             </w:r>
             <w:r>
               <w:rPr>
@@ -1671,7 +1671,7 @@
               <w:lang w:eastAsia="en-GB"/>
             </w:rPr>
           </w:pPr>
-          <w:hyperlink w:anchor="_Toc242725358" w:history="1">
+          <w:hyperlink w:anchor="_Toc242833024" w:history="1">
             <w:r>
               <w:rPr>
                 <w:rStyle w:val="Hyperlink"/>
@@ -1698,7 +1698,7 @@
                 <w:noProof/>
                 <w:webHidden/>
               </w:rPr>
-              <w:instrText xml:space="preserve"> PAGEREF _Toc242725358 \h </w:instrText>
+              <w:instrText xml:space="preserve"> PAGEREF _Toc242833024 \h </w:instrText>
             </w:r>
             <w:r>
               <w:rPr>
@@ -1718,7 +1718,7 @@
                 <w:noProof/>
                 <w:webHidden/>
               </w:rPr>
-              <w:t>11</w:t>
+              <w:t>12</w:t>
             </w:r>
             <w:r>
               <w:rPr>
@@ -1741,7 +1741,7 @@
               <w:lang w:eastAsia="en-GB"/>
             </w:rPr>
           </w:pPr>
-          <w:hyperlink w:anchor="_Toc242725359" w:history="1">
+          <w:hyperlink w:anchor="_Toc242833025" w:history="1">
             <w:r>
               <w:rPr>
                 <w:rStyle w:val="Hyperlink"/>
@@ -1768,7 +1768,7 @@
                 <w:noProof/>
                 <w:webHidden/>
               </w:rPr>
-              <w:instrText xml:space="preserve"> PAGEREF _Toc242725359 \h </w:instrText>
+              <w:instrText xml:space="preserve"> PAGEREF _Toc242833025 \h </w:instrText>
             </w:r>
             <w:r>
               <w:rPr>
@@ -1788,7 +1788,7 @@
                 <w:noProof/>
                 <w:webHidden/>
               </w:rPr>
-              <w:t>11</w:t>
+              <w:t>12</w:t>
             </w:r>
             <w:r>
               <w:rPr>
@@ -1811,7 +1811,7 @@
               <w:lang w:eastAsia="en-GB"/>
             </w:rPr>
           </w:pPr>
-          <w:hyperlink w:anchor="_Toc242725360" w:history="1">
+          <w:hyperlink w:anchor="_Toc242833026" w:history="1">
             <w:r>
               <w:rPr>
                 <w:rStyle w:val="Hyperlink"/>
@@ -1838,7 +1838,7 @@
                 <w:noProof/>
                 <w:webHidden/>
               </w:rPr>
-              <w:instrText xml:space="preserve"> PAGEREF _Toc242725360 \h </w:instrText>
+              <w:instrText xml:space="preserve"> PAGEREF _Toc242833026 \h </w:instrText>
             </w:r>
             <w:r>
               <w:rPr>
@@ -1858,7 +1858,7 @@
                 <w:noProof/>
                 <w:webHidden/>
               </w:rPr>
-              <w:t>11</w:t>
+              <w:t>12</w:t>
             </w:r>
             <w:r>
               <w:rPr>
@@ -1881,7 +1881,7 @@
               <w:lang w:eastAsia="en-GB"/>
             </w:rPr>
           </w:pPr>
-          <w:hyperlink w:anchor="_Toc242725361" w:history="1">
+          <w:hyperlink w:anchor="_Toc242833027" w:history="1">
             <w:r>
               <w:rPr>
                 <w:rStyle w:val="Hyperlink"/>
@@ -1908,7 +1908,7 @@
                 <w:noProof/>
                 <w:webHidden/>
               </w:rPr>
-              <w:instrText xml:space="preserve"> PAGEREF _Toc242725361 \h </w:instrText>
+              <w:instrText xml:space="preserve"> PAGEREF _Toc242833027 \h </w:instrText>
             </w:r>
             <w:r>
               <w:rPr>
@@ -1928,7 +1928,7 @@
                 <w:noProof/>
                 <w:webHidden/>
               </w:rPr>
-              <w:t>12</w:t>
+              <w:t>13</w:t>
             </w:r>
             <w:r>
               <w:rPr>
@@ -1951,7 +1951,7 @@
               <w:lang w:eastAsia="en-GB"/>
             </w:rPr>
           </w:pPr>
-          <w:hyperlink w:anchor="_Toc242725362" w:history="1">
+          <w:hyperlink w:anchor="_Toc242833028" w:history="1">
             <w:r>
               <w:rPr>
                 <w:rStyle w:val="Hyperlink"/>
@@ -1978,7 +1978,7 @@
                 <w:noProof/>
                 <w:webHidden/>
               </w:rPr>
-              <w:instrText xml:space="preserve"> PAGEREF _Toc242725362 \h </w:instrText>
+              <w:instrText xml:space="preserve"> PAGEREF _Toc242833028 \h </w:instrText>
             </w:r>
             <w:r>
               <w:rPr>
@@ -1998,7 +1998,7 @@
                 <w:noProof/>
                 <w:webHidden/>
               </w:rPr>
-              <w:t>12</w:t>
+              <w:t>13</w:t>
             </w:r>
             <w:r>
               <w:rPr>
@@ -2021,7 +2021,7 @@
               <w:lang w:eastAsia="en-GB"/>
             </w:rPr>
           </w:pPr>
-          <w:hyperlink w:anchor="_Toc242725363" w:history="1">
+          <w:hyperlink w:anchor="_Toc242833029" w:history="1">
             <w:r>
               <w:rPr>
                 <w:rStyle w:val="Hyperlink"/>
@@ -2048,7 +2048,7 @@
                 <w:noProof/>
                 <w:webHidden/>
               </w:rPr>
-              <w:instrText xml:space="preserve"> PAGEREF _Toc242725363 \h </w:instrText>
+              <w:instrText xml:space="preserve"> PAGEREF _Toc242833029 \h </w:instrText>
             </w:r>
             <w:r>
               <w:rPr>
@@ -2068,7 +2068,7 @@
                 <w:noProof/>
                 <w:webHidden/>
               </w:rPr>
-              <w:t>12</w:t>
+              <w:t>13</w:t>
             </w:r>
             <w:r>
               <w:rPr>
@@ -2097,7 +2097,7 @@
       <w:pPr>
         <w:pStyle w:val="Heading1"/>
       </w:pPr>
-      <w:bookmarkStart w:id="0" w:name="_Toc242725337"/>
+      <w:bookmarkStart w:id="0" w:name="_Toc242833003"/>
       <w:r>
         <w:lastRenderedPageBreak/>
         <w:t xml:space="preserve">PROJECT </w:t>
@@ -2111,7 +2111,7 @@
       <w:pPr>
         <w:pStyle w:val="Heading2"/>
       </w:pPr>
-      <w:bookmarkStart w:id="1" w:name="_Toc242725338"/>
+      <w:bookmarkStart w:id="1" w:name="_Toc242833004"/>
       <w:r>
         <w:t>Team</w:t>
       </w:r>
@@ -2200,7 +2200,7 @@
       <w:pPr>
         <w:pStyle w:val="Heading2"/>
       </w:pPr>
-      <w:bookmarkStart w:id="2" w:name="_Toc242725339"/>
+      <w:bookmarkStart w:id="2" w:name="_Toc242833005"/>
       <w:r>
         <w:t>Project</w:t>
       </w:r>
@@ -2242,7 +2242,7 @@
       <w:pPr>
         <w:pStyle w:val="Heading2"/>
       </w:pPr>
-      <w:bookmarkStart w:id="3" w:name="_Toc242725340"/>
+      <w:bookmarkStart w:id="3" w:name="_Toc242833006"/>
       <w:r>
         <w:t xml:space="preserve">Development </w:t>
       </w:r>
@@ -2262,7 +2262,7 @@
       <w:pPr>
         <w:pStyle w:val="Heading1"/>
       </w:pPr>
-      <w:bookmarkStart w:id="4" w:name="_Toc242725341"/>
+      <w:bookmarkStart w:id="4" w:name="_Toc242833007"/>
       <w:r>
         <w:lastRenderedPageBreak/>
         <w:t>GAME OVERVIEW</w:t>
@@ -2273,7 +2273,7 @@
       <w:pPr>
         <w:pStyle w:val="Heading2"/>
       </w:pPr>
-      <w:bookmarkStart w:id="5" w:name="_Toc242725342"/>
+      <w:bookmarkStart w:id="5" w:name="_Toc242833008"/>
       <w:r>
         <w:t>Narrative</w:t>
       </w:r>
@@ -2309,7 +2309,7 @@
       <w:pPr>
         <w:pStyle w:val="Heading2"/>
       </w:pPr>
-      <w:bookmarkStart w:id="6" w:name="_Toc242725343"/>
+      <w:bookmarkStart w:id="6" w:name="_Toc242833009"/>
       <w:r>
         <w:t>Objective</w:t>
       </w:r>
@@ -2387,32 +2387,14 @@
         <w:t xml:space="preserve">resulting in the mission being a failure allowing the world to turn into an apocalypse. </w:t>
       </w:r>
       <w:r>
-        <w:t xml:space="preserve">Finally, the sad ending is achieved </w:t>
-      </w:r>
-      <w:r>
-        <w:t>by calling in an evac</w:t>
-      </w:r>
-      <w:r>
-        <w:t xml:space="preserve"> with members on the strike team dead</w:t>
-      </w:r>
-      <w:r>
-        <w:t xml:space="preserve"> and escaping the facility with a cure resulting </w:t>
-      </w:r>
-      <w:r>
-        <w:t xml:space="preserve">whom is left </w:t>
-      </w:r>
-      <w:r>
-        <w:t>stopping the virus from spreading around the world</w:t>
-      </w:r>
-      <w:r>
-        <w:t xml:space="preserve"> but at what cost. </w:t>
+        <w:t xml:space="preserve">Finally, the sad ending is achieved by calling in an evac with members on the strike team dead and escaping the facility with a cure resulting whom is left stopping the virus from spreading around the world but at what cost. </w:t>
       </w:r>
     </w:p>
     <w:p>
       <w:pPr>
         <w:pStyle w:val="Heading2"/>
       </w:pPr>
-      <w:bookmarkStart w:id="7" w:name="_Toc242725344"/>
+      <w:bookmarkStart w:id="7" w:name="_Toc242833010"/>
       <w:r>
         <w:t>Playable Characters</w:t>
       </w:r>
@@ -2551,7 +2533,7 @@
       <w:pPr>
         <w:pStyle w:val="Heading1"/>
       </w:pPr>
-      <w:bookmarkStart w:id="8" w:name="_Toc242725345"/>
+      <w:bookmarkStart w:id="8" w:name="_Toc242833011"/>
       <w:r>
         <w:t xml:space="preserve">GAME </w:t>
       </w:r>
@@ -2564,7 +2546,7 @@
       <w:pPr>
         <w:pStyle w:val="Heading2"/>
       </w:pPr>
-      <w:bookmarkStart w:id="9" w:name="_Toc242725346"/>
+      <w:bookmarkStart w:id="9" w:name="_Toc242833012"/>
       <w:r>
         <w:t>Controls</w:t>
       </w:r>
@@ -2575,6 +2557,7 @@
         <w:t>In game the player will use the WASD keys to move in the appropriate direction of the key they pressed ala W for up and S for down and while moving they can hold down shift to begin to sprint, though sprinting stops the player being able to shoot unless they own the correct perk to let them do this.</w:t>
       </w:r>
     </w:p>
+    <w:p/>
     <w:p>
       <w:r>
         <w:t>The camera is moved by the mouse and matches the direction that the mouse is currently looking at ala if looking right so will the camera.</w:t>
@@ -2596,7 +2579,13 @@
     <w:p>
       <w:r>
         <w:lastRenderedPageBreak/>
-        <w:t xml:space="preserve">The player can fire their gun with the right click of the mouse, either being able to hold down for continuous fire with a full auto weapon or needing to click again for a semi auto and can reload the firearm at any point when it misses 1 bullet in </w:t>
+        <w:t xml:space="preserve">The player can fire their gun with the </w:t>
+      </w:r>
+      <w:r>
+        <w:t>left</w:t>
+      </w:r>
+      <w:r>
+        <w:t xml:space="preserve"> click of the mouse, either being able to hold down for continuous fire with a full auto weapon or needing to click again for a semi auto and can reload the firearm at any point when it misses 1 bullet in </w:t>
       </w:r>
       <w:proofErr w:type="spellStart"/>
       <w:r>
@@ -2607,10 +2596,10 @@
         <w:t xml:space="preserve"> starting mag by pressing </w:t>
       </w:r>
       <w:r>
-        <w:t>R or</w:t>
-      </w:r>
-      <w:r>
-        <w:t xml:space="preserve"> automatically reloading when the mag runs empty.</w:t>
+        <w:t>R</w:t>
+      </w:r>
+      <w:r>
+        <w:t>.</w:t>
       </w:r>
     </w:p>
     <w:p/>
@@ -2619,7 +2608,7 @@
       <w:pPr>
         <w:pStyle w:val="Heading2"/>
       </w:pPr>
-      <w:bookmarkStart w:id="10" w:name="_Toc242725347"/>
+      <w:bookmarkStart w:id="10" w:name="_Toc242833013"/>
       <w:r>
         <w:t>Perks</w:t>
       </w:r>
@@ -2782,7 +2771,7 @@
       <w:pPr>
         <w:pStyle w:val="Heading2"/>
       </w:pPr>
-      <w:bookmarkStart w:id="11" w:name="_Toc242725348"/>
+      <w:bookmarkStart w:id="11" w:name="_Toc242833014"/>
       <w:r>
         <w:lastRenderedPageBreak/>
         <w:t>Enemies</w:t>
@@ -2830,102 +2819,97 @@
       <w:pPr>
         <w:pStyle w:val="Heading2"/>
       </w:pPr>
-      <w:bookmarkStart w:id="12" w:name="_Toc242725349"/>
-      <w:r>
-        <w:t>Firearms</w:t>
+      <w:bookmarkStart w:id="12" w:name="_Toc242833015"/>
+      <w:r>
+        <w:t>Weapons</w:t>
       </w:r>
       <w:bookmarkEnd w:id="12"/>
     </w:p>
     <w:p>
       <w:r>
-        <w:t>Two distinct sets of weapons focusing on Western and Eastern weapons include in the firearms pool, with one side being mainly Western and the other Eastern, with the players all spawning with a M1911 at game spawn but quickly getting options to upgrade their gun from wall guns or from the interdimensional crate (box) and able to use upgrade kits in the upgrade facility to upgrade their firearms (pack a punch)</w:t>
-      </w:r>
-    </w:p>
-    <w:p>
-      <w:r>
-        <w:t>Example firearms include:</w:t>
-      </w:r>
-    </w:p>
-    <w:p>
-      <w:r>
-        <w:t>Pistols – M1911 and Makarov</w:t>
-      </w:r>
-    </w:p>
-    <w:p>
-      <w:r>
-        <w:t>Revolver – Python and Nagant M1895</w:t>
-      </w:r>
-    </w:p>
-    <w:p>
-      <w:r>
-        <w:t>AR – M16A1 and AKM</w:t>
-      </w:r>
-    </w:p>
-    <w:p>
-      <w:r>
-        <w:t>SMG – MP5 and PPSH-41</w:t>
-      </w:r>
-    </w:p>
-    <w:p>
-      <w:r>
-        <w:t>Shotgun – M37 and KS-23</w:t>
-      </w:r>
-    </w:p>
-    <w:p>
-      <w:r>
-        <w:t>Semi auto rifle – M14 and SKS</w:t>
-      </w:r>
-    </w:p>
-    <w:p>
-      <w:r>
-        <w:t>Sniper – M40 and Mosin-Nagant</w:t>
-      </w:r>
-    </w:p>
-    <w:p>
-      <w:r>
-        <w:t>Semi auto sniper – PSG1 and Dragunov</w:t>
-      </w:r>
-    </w:p>
-    <w:p>
-      <w:r>
-        <w:t>Launcher – M72 LAW and RPG-7</w:t>
-      </w:r>
-    </w:p>
-    <w:p>
+        <w:t>Written by Andrew Forrest</w:t>
+      </w:r>
+    </w:p>
+    <w:p>
+      <w:r>
+        <w:t xml:space="preserve">This game will feature three weapons that the player will be able to get as they progress throughout the game. The pool of weapons that the player will use are pistol, </w:t>
+      </w:r>
+      <w:r>
+        <w:t>Burst assault</w:t>
+      </w:r>
+      <w:r>
+        <w:t xml:space="preserve"> rifle and a shotgun. The Shotgun and AR will be unlocked by unlock the gun from area 2 and area 3 each respectively</w:t>
+      </w:r>
+      <w:r>
+        <w:t>.</w:t>
+      </w:r>
+    </w:p>
+    <w:p/>
+    <w:p>
+      <w:r>
+        <w:t>Pistol:</w:t>
+      </w:r>
+    </w:p>
+    <w:p>
+      <w:r>
+        <w:t xml:space="preserve">The pistol will be the first weapon, this will </w:t>
+      </w:r>
+      <w:r>
+        <w:t>the weapon that the player will first spawn with and always have unlocked in the first slot. This gun will hold 12 ammo in its clip at once and will take a second to reload, the gun will reload the full clip at once but will only take the need amount of ammo away from the held ammo instead of the full 12.</w:t>
+      </w:r>
+      <w:r>
+        <w:t xml:space="preserve"> The gun will be semi-automatic so that it will have to click for each individual shot instead of holding to fire until the magazine is empty.</w:t>
+      </w:r>
+    </w:p>
+    <w:p/>
+    <w:p>
+      <w:r>
+        <w:t>AR</w:t>
+      </w:r>
+    </w:p>
+    <w:p>
+      <w:r>
+        <w:t xml:space="preserve">The AR will be the second weapon the player will be able to unlock, it will be unlockable once the player has reached area 2 of the map. It will sit in the player </w:t>
+      </w:r>
       <w:r>
         <w:lastRenderedPageBreak/>
-        <w:t xml:space="preserve">Each weapon will also get a unique name when it’s put into the upgrade machine and depending on the firearm will gain a new unique property for shooting, as </w:t>
-      </w:r>
-      <w:r>
-        <w:t>an</w:t>
-      </w:r>
-      <w:r>
-        <w:t xml:space="preserve"> example when the M1911 is upgraded it becomes Duty and Honour, changing to a akimbo firearm that shoots grenades instead of the normal bullets it started with, meanwhile the PPSH-41 will become the Stalingrad Sweeper and have its fire rate upped even further </w:t>
-      </w:r>
-      <w:r>
-        <w:t>than</w:t>
-      </w:r>
-      <w:r>
-        <w:t xml:space="preserve"> it already is while it gain’s a drum magazine with </w:t>
-      </w:r>
-      <w:r>
-        <w:t>an</w:t>
-      </w:r>
-      <w:r>
-        <w:t xml:space="preserve"> impressive amount of ammo to keep up with </w:t>
-      </w:r>
-      <w:r>
-        <w:t>its</w:t>
-      </w:r>
-      <w:r>
-        <w:t xml:space="preserve"> blistering fire rate.</w:t>
+        <w:t>second weapon slot. The AR will have a Clip Capacity of 30 and will take just over a second to reload the gun, taking only what ammo is necessary to fill the clip. The Gun will be full auto which will allow the player to hold down the fire button so that it will fire the instant that the cooldown for firing is gone.</w:t>
+      </w:r>
+    </w:p>
+    <w:p/>
+    <w:p>
+      <w:r>
+        <w:t>Shotgun</w:t>
+      </w:r>
+    </w:p>
+    <w:p>
+      <w:r>
+        <w:t>The shotgun will be the last unlockable weapon which will show up in the third area of the map, and it will sit in the players third weapon slot. The shot gun will have a max ammo of 6 and will take a much shorter time to reload but instead of being like the other guns that will reload a full clip at a time the shotgun will only reload one shell each time the reload button is hit. It will be a semi-automatic gun meaning that the player will have to click for each shot instead of holding. The shotgun will also have the special unique attribute of shooting 5 pellets out at once each of these pellets will fire in a slight random angle compared to the normal making it harder to aim but much more lethal if the player can hit all the pellets on one enemy.</w:t>
+      </w:r>
+    </w:p>
+    <w:p/>
+    <w:p>
+      <w:r>
+        <w:t xml:space="preserve">Each of these weapon will also have the option to be upgraded at the </w:t>
+      </w:r>
+      <w:r>
+        <w:t>[name for the weapon machine</w:t>
+      </w:r>
+      <w:r>
+        <w:t xml:space="preserve">] this upgrade will increase the weapons damage by 25% of the base damage, and it will also increase the clip capacity of the by 50%. The gun will also have a visual effect that will make it obvious that the gun has been upgraded at the </w:t>
+      </w:r>
+      <w:r>
+        <w:t>[name for the weapon machine</w:t>
+      </w:r>
+      <w:r>
+        <w:t>].</w:t>
       </w:r>
     </w:p>
     <w:p>
       <w:pPr>
         <w:pStyle w:val="Heading1"/>
       </w:pPr>
-      <w:bookmarkStart w:id="13" w:name="_Toc242725350"/>
+      <w:bookmarkStart w:id="13" w:name="_Toc242833016"/>
       <w:r>
         <w:rPr>
           <w:noProof/>
@@ -3056,6 +3040,7 @@
           <w:noProof/>
           <w:color w:val="A02B93" w:themeColor="accent5"/>
         </w:rPr>
+        <w:lastRenderedPageBreak/>
         <w:t>P</w:t>
       </w:r>
       <w:r>
@@ -3195,11 +3180,7 @@
     <w:p/>
     <w:p>
       <w:r>
-        <w:t xml:space="preserve">This concept design for the level shows four playable areas that consists of The Lab, Village, Facility, and The Forest. Each area will offer a different experience via the environment some will be close and compact and other areas will be open and free </w:t>
-      </w:r>
-      <w:r>
-        <w:lastRenderedPageBreak/>
-        <w:t xml:space="preserve">for the player to use to the advantage to suit their playstyle. Each area will offer their own unique perk granting their own buff to the player upon purchase, but they only become purchasable after the power has been activated. </w:t>
+        <w:t xml:space="preserve">This concept design for the level shows four playable areas that consists of The Lab, Village, Facility, and The Forest. Each area will offer a different experience via the environment some will be close and compact and other areas will be open and free for the player to use to the advantage to suit their playstyle. Each area will offer their own unique perk granting their own buff to the player upon purchase, but they only become purchasable after the power has been activated. </w:t>
       </w:r>
     </w:p>
     <w:p/>
@@ -3208,7 +3189,7 @@
       <w:pPr>
         <w:pStyle w:val="Heading2"/>
       </w:pPr>
-      <w:bookmarkStart w:id="14" w:name="_Toc242725351"/>
+      <w:bookmarkStart w:id="14" w:name="_Toc242833017"/>
       <w:r>
         <w:t>The Lab</w:t>
       </w:r>
@@ -3236,19 +3217,7 @@
         <w:t xml:space="preserve"> (RX-01)</w:t>
       </w:r>
       <w:r>
-        <w:t xml:space="preserve"> f</w:t>
-      </w:r>
-      <w:r>
-        <w:t>or 500 points in solo, or 1500 in multiplayer,</w:t>
-      </w:r>
-      <w:r>
-        <w:t xml:space="preserve"> upon purchase</w:t>
-      </w:r>
-      <w:r>
-        <w:t xml:space="preserve"> the player is granted increased healing speeds, quicker revives for multiplayer and a self-revive in solo, which is capped at 3, as once this cap is hit the machine will become unusable to the player.</w:t>
-      </w:r>
-      <w:r>
-        <w:t xml:space="preserve"> </w:t>
+        <w:t xml:space="preserve"> for 500 points in solo, or 1500 in multiplayer, upon purchase the player is granted increased healing speeds, quicker revives for multiplayer and a self-revive in solo, which is capped at 3, as once this cap is hit the machine will become unusable to the player. </w:t>
       </w:r>
       <w:r>
         <w:t xml:space="preserve">The appearance of the lab will appear broken and in ruin to make the player feel emersed upon loading in the level </w:t>
@@ -3259,7 +3228,7 @@
       <w:pPr>
         <w:pStyle w:val="Heading2"/>
       </w:pPr>
-      <w:bookmarkStart w:id="15" w:name="_Toc242725352"/>
+      <w:bookmarkStart w:id="15" w:name="_Toc242833018"/>
       <w:r>
         <w:t>Village</w:t>
       </w:r>
@@ -3273,19 +3242,7 @@
         <w:t>Reflexium (RF-03)</w:t>
       </w:r>
       <w:r>
-        <w:t xml:space="preserve"> f</w:t>
-      </w:r>
-      <w:r>
-        <w:t xml:space="preserve">or 3000 points, </w:t>
-      </w:r>
-      <w:r>
-        <w:t xml:space="preserve">upon purchase </w:t>
-      </w:r>
-      <w:r>
-        <w:t>the player will gain the ability to reload faster, to move faster and to be able to sprint and shoot/reload with no draw backs</w:t>
-      </w:r>
-      <w:r>
-        <w:t xml:space="preserve">. </w:t>
+        <w:t xml:space="preserve"> for 3000 points, upon purchase the player will gain the ability to reload faster, to move faster and to be able to sprint and shoot/reload with no draw backs. </w:t>
       </w:r>
       <w:r>
         <w:t xml:space="preserve">The appearance of the village will appear untouched by the outbreak at first glance upon entry but as the player moves through the environment which will get increasingly more destroyed and in ruin </w:t>
@@ -3296,7 +3253,7 @@
       <w:pPr>
         <w:pStyle w:val="Heading2"/>
       </w:pPr>
-      <w:bookmarkStart w:id="16" w:name="_Toc242725353"/>
+      <w:bookmarkStart w:id="16" w:name="_Toc242833019"/>
       <w:r>
         <w:t>Facility</w:t>
       </w:r>
@@ -3310,16 +3267,7 @@
         <w:t>Fortigen (FG-02)</w:t>
       </w:r>
       <w:r>
-        <w:t xml:space="preserve"> f</w:t>
-      </w:r>
-      <w:r>
-        <w:t xml:space="preserve">or 2500 points, </w:t>
-      </w:r>
-      <w:r>
-        <w:t xml:space="preserve">upon purchase </w:t>
-      </w:r>
-      <w:r>
-        <w:t>the player is granted additional HP that enhances their durability against enemies.</w:t>
+        <w:t xml:space="preserve"> for 2500 points, upon purchase the player is granted additional HP that enhances their durability against enemies.</w:t>
       </w:r>
       <w:r>
         <w:t xml:space="preserve"> The facility will also hold [name for the weapon machine] which will upgrade the players weapon giving it increased damage and ammo size, [name for the weapon machine] can be located in the same room as power on the second floor. </w:t>
@@ -3330,9 +3278,8 @@
       <w:pPr>
         <w:pStyle w:val="Heading2"/>
       </w:pPr>
-      <w:bookmarkStart w:id="17" w:name="_Toc242725354"/>
-      <w:r>
-        <w:lastRenderedPageBreak/>
+      <w:bookmarkStart w:id="17" w:name="_Toc242833020"/>
+      <w:r>
         <w:t>Forest</w:t>
       </w:r>
       <w:bookmarkEnd w:id="17"/>
@@ -3358,16 +3305,7 @@
         <w:t xml:space="preserve"> (BX-04)</w:t>
       </w:r>
       <w:r>
-        <w:t xml:space="preserve"> f</w:t>
-      </w:r>
-      <w:r>
-        <w:t xml:space="preserve">or 2000 points, </w:t>
-      </w:r>
-      <w:r>
-        <w:t xml:space="preserve">upon purchase </w:t>
-      </w:r>
-      <w:r>
-        <w:t>the player will gain additional damage for their bullet-based firearms by around 5-10%, as well as the fire rate being slightly upped for all firearms.</w:t>
+        <w:t xml:space="preserve"> for 2000 points, upon purchase the player will gain additional damage for their bullet-based firearms by around 5-10%, as well as the fire rate being slightly upped for all firearms.</w:t>
       </w:r>
       <w:r>
         <w:t xml:space="preserve"> It</w:t>
@@ -3383,7 +3321,7 @@
       <w:pPr>
         <w:pStyle w:val="Heading1"/>
       </w:pPr>
-      <w:bookmarkStart w:id="18" w:name="_Toc242725355"/>
+      <w:bookmarkStart w:id="18" w:name="_Toc242833021"/>
       <w:r>
         <w:t>USER INTERFACE</w:t>
       </w:r>
@@ -3398,8 +3336,9 @@
       <w:pPr>
         <w:pStyle w:val="Heading2"/>
       </w:pPr>
-      <w:bookmarkStart w:id="19" w:name="_Toc242725356"/>
-      <w:r>
+      <w:bookmarkStart w:id="19" w:name="_Toc242833022"/>
+      <w:r>
+        <w:lastRenderedPageBreak/>
         <w:t>Main Menu</w:t>
       </w:r>
       <w:bookmarkEnd w:id="19"/>
@@ -3484,9 +3423,8 @@
       <w:pPr>
         <w:pStyle w:val="Heading2"/>
       </w:pPr>
-      <w:bookmarkStart w:id="20" w:name="_Toc242725357"/>
-      <w:r>
-        <w:lastRenderedPageBreak/>
+      <w:bookmarkStart w:id="20" w:name="_Toc242833023"/>
+      <w:r>
         <w:t>Multiplayer Configure</w:t>
       </w:r>
       <w:bookmarkEnd w:id="20"/>
@@ -3586,11 +3524,12 @@
       <w:pPr>
         <w:pStyle w:val="Heading2"/>
       </w:pPr>
-      <w:bookmarkStart w:id="21" w:name="_Toc242725358"/>
+      <w:bookmarkStart w:id="21" w:name="_Toc242833024"/>
       <w:r>
         <w:rPr>
           <w:noProof/>
         </w:rPr>
+        <w:lastRenderedPageBreak/>
         <w:drawing>
           <wp:anchor distT="0" distB="0" distL="114300" distR="114300" simplePos="0" relativeHeight="251662336" behindDoc="0" locked="0" layoutInCell="1" allowOverlap="1" wp14:anchorId="1DFE43A0" wp14:editId="379C3C4A">
             <wp:simplePos x="0" y="0"/>
@@ -3670,7 +3609,7 @@
       <w:pPr>
         <w:pStyle w:val="Heading2"/>
       </w:pPr>
-      <w:bookmarkStart w:id="22" w:name="_Toc242725359"/>
+      <w:bookmarkStart w:id="22" w:name="_Toc242833025"/>
       <w:r>
         <w:t>Credits</w:t>
       </w:r>
@@ -3772,9 +3711,8 @@
       <w:pPr>
         <w:pStyle w:val="Heading2"/>
       </w:pPr>
-      <w:bookmarkStart w:id="23" w:name="_Toc242725360"/>
-      <w:r>
-        <w:lastRenderedPageBreak/>
+      <w:bookmarkStart w:id="23" w:name="_Toc242833026"/>
+      <w:r>
         <w:t>In-game HUD</w:t>
       </w:r>
       <w:bookmarkEnd w:id="23"/>
@@ -3862,8 +3800,9 @@
       <w:pPr>
         <w:pStyle w:val="Heading2"/>
       </w:pPr>
-      <w:bookmarkStart w:id="24" w:name="_Toc242725361"/>
-      <w:r>
+      <w:bookmarkStart w:id="24" w:name="_Toc242833027"/>
+      <w:r>
+        <w:lastRenderedPageBreak/>
         <w:t>Pause Screen</w:t>
       </w:r>
       <w:bookmarkEnd w:id="24"/>
@@ -3880,7 +3819,7 @@
       <w:pPr>
         <w:pStyle w:val="Heading2"/>
       </w:pPr>
-      <w:bookmarkStart w:id="25" w:name="_Toc242725362"/>
+      <w:bookmarkStart w:id="25" w:name="_Toc242833028"/>
       <w:r>
         <w:t>Game Over</w:t>
       </w:r>
@@ -3926,7 +3865,7 @@
       <w:pPr>
         <w:pStyle w:val="Heading2"/>
       </w:pPr>
-      <w:bookmarkStart w:id="26" w:name="_Toc242725363"/>
+      <w:bookmarkStart w:id="26" w:name="_Toc242833029"/>
       <w:r>
         <w:t>Flow Chart</w:t>
       </w:r>
@@ -3942,7 +3881,6 @@
         <w:rPr>
           <w:noProof/>
         </w:rPr>
-        <w:lastRenderedPageBreak/>
         <w:drawing>
           <wp:anchor distT="0" distB="0" distL="114300" distR="114300" simplePos="0" relativeHeight="251666432" behindDoc="0" locked="0" layoutInCell="1" allowOverlap="1" wp14:anchorId="0DF0FE4D" wp14:editId="584B5E62">
             <wp:simplePos x="0" y="0"/>

</xml_diff>